<commit_message>
Acceso a datos. Termino Apartado 1 y apartado 3 - Hay archivos que se quedaron fuera
</commit_message>
<xml_diff>
--- a/Acceso a datos/Tema1/Actividades/Ejercicios/Ejercicios.docx
+++ b/Acceso a datos/Tema1/Actividades/Ejercicios/Ejercicios.docx
@@ -3741,6 +3741,7 @@
           <w:bCs/>
           <w:color w:val="7f7f7f" w:themeColor="text1" w:themeTint="80"/>
           <w:highlight w:val="none"/>
+          <w14:ligatures w14:val="none"/>
         </w:rPr>
       </w:r>
     </w:p>
@@ -4131,6 +4132,12 @@
           <w:szCs w:val="18"/>
         </w:rPr>
       </w:r>
+      <w:r>
+        <w:rPr>
+          <w:sz w:val="20"/>
+          <w:szCs w:val="18"/>
+        </w:rPr>
+      </w:r>
     </w:p>
     <w:p>
       <w:pPr>
@@ -4167,7 +4174,6 @@
           <w:b/>
           <w:bCs/>
           <w:color w:val="7f7f7f" w:themeColor="text1" w:themeTint="80"/>
-          <w:highlight w:val="none"/>
           <w14:ligatures w14:val="none"/>
         </w:rPr>
       </w:pPr>
@@ -4178,6 +4184,429 @@
           <w:color w:val="7f7f7f" w:themeColor="text1" w:themeTint="80"/>
         </w:rPr>
         <w:t xml:space="preserve">Comprobar el tamaño total de todos los ficheros en una carpeta y mostrarlo en MB.</w:t>
+      </w:r>
+      <w:r>
+        <w:rPr>
+          <w:b/>
+          <w:bCs/>
+          <w:color w:val="7f7f7f" w:themeColor="text1" w:themeTint="80"/>
+          <w14:ligatures w14:val="none"/>
+        </w:rPr>
+      </w:r>
+    </w:p>
+    <w:p>
+      <w:pPr>
+        <w:shd w:val="clear" w:color="191a1c" w:fill="191a1c"/>
+        <w:spacing/>
+        <w:ind w:right="0" w:firstLine="0" w:left="0"/>
+        <w:rPr>
+          <w:sz w:val="20"/>
+          <w:szCs w:val="18"/>
+        </w:rPr>
+      </w:pPr>
+      <w:r>
+        <w:rPr>
+          <w:rFonts w:ascii="Liberation Sans" w:hAnsi="Liberation Sans" w:eastAsia="Liberation Sans" w:cs="Liberation Sans"/>
+          <w:color w:val="cf8e6d"/>
+          <w:sz w:val="20"/>
+          <w:szCs w:val="18"/>
+        </w:rPr>
+        <w:t xml:space="preserve">public void </w:t>
+      </w:r>
+      <w:r>
+        <w:rPr>
+          <w:rFonts w:ascii="Liberation Sans" w:hAnsi="Liberation Sans" w:eastAsia="Liberation Sans" w:cs="Liberation Sans"/>
+          <w:color w:val="56a8f5"/>
+          <w:sz w:val="20"/>
+          <w:szCs w:val="18"/>
+        </w:rPr>
+        <w:t xml:space="preserve">ej7</w:t>
+      </w:r>
+      <w:r>
+        <w:rPr>
+          <w:rFonts w:ascii="Liberation Sans" w:hAnsi="Liberation Sans" w:eastAsia="Liberation Sans" w:cs="Liberation Sans"/>
+          <w:color w:val="bcbec4"/>
+          <w:sz w:val="20"/>
+          <w:szCs w:val="18"/>
+        </w:rPr>
+        <w:t xml:space="preserve">(String ruta){</w:t>
+        <w:br/>
+        <w:t xml:space="preserve">    System.</w:t>
+      </w:r>
+      <w:r>
+        <w:rPr>
+          <w:rFonts w:ascii="Liberation Sans" w:hAnsi="Liberation Sans" w:eastAsia="Liberation Sans" w:cs="Liberation Sans"/>
+          <w:i/>
+          <w:color w:val="c77dbb"/>
+          <w:sz w:val="20"/>
+          <w:szCs w:val="18"/>
+        </w:rPr>
+        <w:t xml:space="preserve">out</w:t>
+      </w:r>
+      <w:r>
+        <w:rPr>
+          <w:rFonts w:ascii="Liberation Sans" w:hAnsi="Liberation Sans" w:eastAsia="Liberation Sans" w:cs="Liberation Sans"/>
+          <w:color w:val="bcbec4"/>
+          <w:sz w:val="20"/>
+          <w:szCs w:val="18"/>
+        </w:rPr>
+        <w:t xml:space="preserve">.println(</w:t>
+      </w:r>
+      <w:r>
+        <w:rPr>
+          <w:rFonts w:ascii="Liberation Sans" w:hAnsi="Liberation Sans" w:eastAsia="Liberation Sans" w:cs="Liberation Sans"/>
+          <w:color w:val="6aab73"/>
+          <w:sz w:val="20"/>
+          <w:szCs w:val="18"/>
+        </w:rPr>
+        <w:t xml:space="preserve">"---- COMIENZO EJERCICIO 7 ----"</w:t>
+      </w:r>
+      <w:r>
+        <w:rPr>
+          <w:rFonts w:ascii="Liberation Sans" w:hAnsi="Liberation Sans" w:eastAsia="Liberation Sans" w:cs="Liberation Sans"/>
+          <w:color w:val="bcbec4"/>
+          <w:sz w:val="20"/>
+          <w:szCs w:val="18"/>
+        </w:rPr>
+        <w:t xml:space="preserve">);</w:t>
+        <w:br/>
+        <w:t xml:space="preserve">    Path dir1 = Paths.</w:t>
+      </w:r>
+      <w:r>
+        <w:rPr>
+          <w:rFonts w:ascii="Liberation Sans" w:hAnsi="Liberation Sans" w:eastAsia="Liberation Sans" w:cs="Liberation Sans"/>
+          <w:i/>
+          <w:color w:val="bcbec4"/>
+          <w:sz w:val="20"/>
+          <w:szCs w:val="18"/>
+        </w:rPr>
+        <w:t xml:space="preserve">get</w:t>
+      </w:r>
+      <w:r>
+        <w:rPr>
+          <w:rFonts w:ascii="Liberation Sans" w:hAnsi="Liberation Sans" w:eastAsia="Liberation Sans" w:cs="Liberation Sans"/>
+          <w:color w:val="bcbec4"/>
+          <w:sz w:val="20"/>
+          <w:szCs w:val="18"/>
+        </w:rPr>
+        <w:t xml:space="preserve">(ruta);</w:t>
+        <w:br/>
+        <w:t xml:space="preserve">    </w:t>
+      </w:r>
+      <w:r>
+        <w:rPr>
+          <w:rFonts w:ascii="Liberation Sans" w:hAnsi="Liberation Sans" w:eastAsia="Liberation Sans" w:cs="Liberation Sans"/>
+          <w:color w:val="cf8e6d"/>
+          <w:sz w:val="20"/>
+          <w:szCs w:val="18"/>
+        </w:rPr>
+        <w:t xml:space="preserve">try </w:t>
+      </w:r>
+      <w:r>
+        <w:rPr>
+          <w:rFonts w:ascii="Liberation Sans" w:hAnsi="Liberation Sans" w:eastAsia="Liberation Sans" w:cs="Liberation Sans"/>
+          <w:color w:val="bcbec4"/>
+          <w:sz w:val="20"/>
+          <w:szCs w:val="18"/>
+        </w:rPr>
+        <w:t xml:space="preserve">{</w:t>
+        <w:br/>
+        <w:t xml:space="preserve">        </w:t>
+      </w:r>
+      <w:r>
+        <w:rPr>
+          <w:rFonts w:ascii="Liberation Sans" w:hAnsi="Liberation Sans" w:eastAsia="Liberation Sans" w:cs="Liberation Sans"/>
+          <w:color w:val="cf8e6d"/>
+          <w:sz w:val="20"/>
+          <w:szCs w:val="18"/>
+        </w:rPr>
+        <w:t xml:space="preserve">for </w:t>
+      </w:r>
+      <w:r>
+        <w:rPr>
+          <w:rFonts w:ascii="Liberation Sans" w:hAnsi="Liberation Sans" w:eastAsia="Liberation Sans" w:cs="Liberation Sans"/>
+          <w:color w:val="bcbec4"/>
+          <w:sz w:val="20"/>
+          <w:szCs w:val="18"/>
+        </w:rPr>
+        <w:t xml:space="preserve">(Path archivo : Files.</w:t>
+      </w:r>
+      <w:r>
+        <w:rPr>
+          <w:rFonts w:ascii="Liberation Sans" w:hAnsi="Liberation Sans" w:eastAsia="Liberation Sans" w:cs="Liberation Sans"/>
+          <w:i/>
+          <w:color w:val="bcbec4"/>
+          <w:sz w:val="20"/>
+          <w:szCs w:val="18"/>
+        </w:rPr>
+        <w:t xml:space="preserve">list</w:t>
+      </w:r>
+      <w:r>
+        <w:rPr>
+          <w:rFonts w:ascii="Liberation Sans" w:hAnsi="Liberation Sans" w:eastAsia="Liberation Sans" w:cs="Liberation Sans"/>
+          <w:color w:val="bcbec4"/>
+          <w:sz w:val="20"/>
+          <w:szCs w:val="18"/>
+        </w:rPr>
+        <w:t xml:space="preserve">(dir1).toList()){</w:t>
+        <w:br/>
+        <w:t xml:space="preserve">            </w:t>
+      </w:r>
+      <w:r>
+        <w:rPr>
+          <w:rFonts w:ascii="Liberation Sans" w:hAnsi="Liberation Sans" w:eastAsia="Liberation Sans" w:cs="Liberation Sans"/>
+          <w:color w:val="cf8e6d"/>
+          <w:sz w:val="20"/>
+          <w:szCs w:val="18"/>
+        </w:rPr>
+        <w:t xml:space="preserve">if </w:t>
+      </w:r>
+      <w:r>
+        <w:rPr>
+          <w:rFonts w:ascii="Liberation Sans" w:hAnsi="Liberation Sans" w:eastAsia="Liberation Sans" w:cs="Liberation Sans"/>
+          <w:color w:val="bcbec4"/>
+          <w:sz w:val="20"/>
+          <w:szCs w:val="18"/>
+        </w:rPr>
+        <w:t xml:space="preserve">(!Files.</w:t>
+      </w:r>
+      <w:r>
+        <w:rPr>
+          <w:rFonts w:ascii="Liberation Sans" w:hAnsi="Liberation Sans" w:eastAsia="Liberation Sans" w:cs="Liberation Sans"/>
+          <w:i/>
+          <w:color w:val="bcbec4"/>
+          <w:sz w:val="20"/>
+          <w:szCs w:val="18"/>
+        </w:rPr>
+        <w:t xml:space="preserve">isDirectory</w:t>
+      </w:r>
+      <w:r>
+        <w:rPr>
+          <w:rFonts w:ascii="Liberation Sans" w:hAnsi="Liberation Sans" w:eastAsia="Liberation Sans" w:cs="Liberation Sans"/>
+          <w:color w:val="bcbec4"/>
+          <w:sz w:val="20"/>
+          <w:szCs w:val="18"/>
+        </w:rPr>
+        <w:t xml:space="preserve">(archivo)){</w:t>
+        <w:br/>
+        <w:t xml:space="preserve">                System.</w:t>
+      </w:r>
+      <w:r>
+        <w:rPr>
+          <w:rFonts w:ascii="Liberation Sans" w:hAnsi="Liberation Sans" w:eastAsia="Liberation Sans" w:cs="Liberation Sans"/>
+          <w:i/>
+          <w:color w:val="c77dbb"/>
+          <w:sz w:val="20"/>
+          <w:szCs w:val="18"/>
+        </w:rPr>
+        <w:t xml:space="preserve">out</w:t>
+      </w:r>
+      <w:r>
+        <w:rPr>
+          <w:rFonts w:ascii="Liberation Sans" w:hAnsi="Liberation Sans" w:eastAsia="Liberation Sans" w:cs="Liberation Sans"/>
+          <w:color w:val="bcbec4"/>
+          <w:sz w:val="20"/>
+          <w:szCs w:val="18"/>
+        </w:rPr>
+        <w:t xml:space="preserve">.println(archivo.getFileName() + </w:t>
+      </w:r>
+      <w:r>
+        <w:rPr>
+          <w:rFonts w:ascii="Liberation Sans" w:hAnsi="Liberation Sans" w:eastAsia="Liberation Sans" w:cs="Liberation Sans"/>
+          <w:color w:val="6aab73"/>
+          <w:sz w:val="20"/>
+          <w:szCs w:val="18"/>
+        </w:rPr>
+        <w:t xml:space="preserve">" · " </w:t>
+      </w:r>
+      <w:r>
+        <w:rPr>
+          <w:rFonts w:ascii="Liberation Sans" w:hAnsi="Liberation Sans" w:eastAsia="Liberation Sans" w:cs="Liberation Sans"/>
+          <w:color w:val="bcbec4"/>
+          <w:sz w:val="20"/>
+          <w:szCs w:val="18"/>
+        </w:rPr>
+        <w:t xml:space="preserve">+ Files.</w:t>
+      </w:r>
+      <w:r>
+        <w:rPr>
+          <w:rFonts w:ascii="Liberation Sans" w:hAnsi="Liberation Sans" w:eastAsia="Liberation Sans" w:cs="Liberation Sans"/>
+          <w:i/>
+          <w:color w:val="bcbec4"/>
+          <w:sz w:val="20"/>
+          <w:szCs w:val="18"/>
+        </w:rPr>
+        <w:t xml:space="preserve">size</w:t>
+      </w:r>
+      <w:r>
+        <w:rPr>
+          <w:rFonts w:ascii="Liberation Sans" w:hAnsi="Liberation Sans" w:eastAsia="Liberation Sans" w:cs="Liberation Sans"/>
+          <w:color w:val="bcbec4"/>
+          <w:sz w:val="20"/>
+          <w:szCs w:val="18"/>
+        </w:rPr>
+        <w:t xml:space="preserve">(archivo)/</w:t>
+      </w:r>
+      <w:r>
+        <w:rPr>
+          <w:rFonts w:ascii="Liberation Sans" w:hAnsi="Liberation Sans" w:eastAsia="Liberation Sans" w:cs="Liberation Sans"/>
+          <w:color w:val="2aacb8"/>
+          <w:sz w:val="20"/>
+          <w:szCs w:val="18"/>
+        </w:rPr>
+        <w:t xml:space="preserve">2048 </w:t>
+      </w:r>
+      <w:r>
+        <w:rPr>
+          <w:rFonts w:ascii="Liberation Sans" w:hAnsi="Liberation Sans" w:eastAsia="Liberation Sans" w:cs="Liberation Sans"/>
+          <w:color w:val="bcbec4"/>
+          <w:sz w:val="20"/>
+          <w:szCs w:val="18"/>
+        </w:rPr>
+        <w:t xml:space="preserve">+ </w:t>
+      </w:r>
+      <w:r>
+        <w:rPr>
+          <w:rFonts w:ascii="Liberation Sans" w:hAnsi="Liberation Sans" w:eastAsia="Liberation Sans" w:cs="Liberation Sans"/>
+          <w:color w:val="6aab73"/>
+          <w:sz w:val="20"/>
+          <w:szCs w:val="18"/>
+        </w:rPr>
+        <w:t xml:space="preserve">"MB"</w:t>
+      </w:r>
+      <w:r>
+        <w:rPr>
+          <w:rFonts w:ascii="Liberation Sans" w:hAnsi="Liberation Sans" w:eastAsia="Liberation Sans" w:cs="Liberation Sans"/>
+          <w:color w:val="bcbec4"/>
+          <w:sz w:val="20"/>
+          <w:szCs w:val="18"/>
+        </w:rPr>
+        <w:t xml:space="preserve">);</w:t>
+        <w:br/>
+        <w:t xml:space="preserve">            }</w:t>
+        <w:br/>
+        <w:t xml:space="preserve">        }</w:t>
+        <w:br/>
+        <w:t xml:space="preserve">    } </w:t>
+      </w:r>
+      <w:r>
+        <w:rPr>
+          <w:rFonts w:ascii="Liberation Sans" w:hAnsi="Liberation Sans" w:eastAsia="Liberation Sans" w:cs="Liberation Sans"/>
+          <w:color w:val="cf8e6d"/>
+          <w:sz w:val="20"/>
+          <w:szCs w:val="18"/>
+        </w:rPr>
+        <w:t xml:space="preserve">catch </w:t>
+      </w:r>
+      <w:r>
+        <w:rPr>
+          <w:rFonts w:ascii="Liberation Sans" w:hAnsi="Liberation Sans" w:eastAsia="Liberation Sans" w:cs="Liberation Sans"/>
+          <w:color w:val="bcbec4"/>
+          <w:sz w:val="20"/>
+          <w:szCs w:val="18"/>
+        </w:rPr>
+        <w:t xml:space="preserve">(IOException e) {</w:t>
+        <w:br/>
+        <w:t xml:space="preserve">        </w:t>
+      </w:r>
+      <w:r>
+        <w:rPr>
+          <w:rFonts w:ascii="Liberation Sans" w:hAnsi="Liberation Sans" w:eastAsia="Liberation Sans" w:cs="Liberation Sans"/>
+          <w:color w:val="cf8e6d"/>
+          <w:sz w:val="20"/>
+          <w:szCs w:val="18"/>
+        </w:rPr>
+        <w:t xml:space="preserve">throw new </w:t>
+      </w:r>
+      <w:r>
+        <w:rPr>
+          <w:rFonts w:ascii="Liberation Sans" w:hAnsi="Liberation Sans" w:eastAsia="Liberation Sans" w:cs="Liberation Sans"/>
+          <w:color w:val="bcbec4"/>
+          <w:sz w:val="20"/>
+          <w:szCs w:val="18"/>
+        </w:rPr>
+        <w:t xml:space="preserve">RuntimeException(e);</w:t>
+        <w:br/>
+        <w:t xml:space="preserve">    }</w:t>
+        <w:br/>
+        <w:t xml:space="preserve">    System.</w:t>
+      </w:r>
+      <w:r>
+        <w:rPr>
+          <w:rFonts w:ascii="Liberation Sans" w:hAnsi="Liberation Sans" w:eastAsia="Liberation Sans" w:cs="Liberation Sans"/>
+          <w:i/>
+          <w:color w:val="c77dbb"/>
+          <w:sz w:val="20"/>
+          <w:szCs w:val="18"/>
+        </w:rPr>
+        <w:t xml:space="preserve">out</w:t>
+      </w:r>
+      <w:r>
+        <w:rPr>
+          <w:rFonts w:ascii="Liberation Sans" w:hAnsi="Liberation Sans" w:eastAsia="Liberation Sans" w:cs="Liberation Sans"/>
+          <w:color w:val="bcbec4"/>
+          <w:sz w:val="20"/>
+          <w:szCs w:val="18"/>
+        </w:rPr>
+        <w:t xml:space="preserve">.println(</w:t>
+      </w:r>
+      <w:r>
+        <w:rPr>
+          <w:rFonts w:ascii="Liberation Sans" w:hAnsi="Liberation Sans" w:eastAsia="Liberation Sans" w:cs="Liberation Sans"/>
+          <w:color w:val="6aab73"/>
+          <w:sz w:val="20"/>
+          <w:szCs w:val="18"/>
+        </w:rPr>
+        <w:t xml:space="preserve">"----- FIN DE EJERCICIO 7 -----</w:t>
+      </w:r>
+      <w:r>
+        <w:rPr>
+          <w:rFonts w:ascii="Liberation Sans" w:hAnsi="Liberation Sans" w:eastAsia="Liberation Sans" w:cs="Liberation Sans"/>
+          <w:color w:val="cf8e6d"/>
+          <w:sz w:val="20"/>
+          <w:szCs w:val="18"/>
+        </w:rPr>
+        <w:t xml:space="preserve">\n</w:t>
+      </w:r>
+      <w:r>
+        <w:rPr>
+          <w:rFonts w:ascii="Liberation Sans" w:hAnsi="Liberation Sans" w:eastAsia="Liberation Sans" w:cs="Liberation Sans"/>
+          <w:color w:val="6aab73"/>
+          <w:sz w:val="20"/>
+          <w:szCs w:val="18"/>
+        </w:rPr>
+        <w:t xml:space="preserve">"</w:t>
+      </w:r>
+      <w:r>
+        <w:rPr>
+          <w:rFonts w:ascii="Liberation Sans" w:hAnsi="Liberation Sans" w:eastAsia="Liberation Sans" w:cs="Liberation Sans"/>
+          <w:color w:val="bcbec4"/>
+          <w:sz w:val="20"/>
+          <w:szCs w:val="18"/>
+        </w:rPr>
+        <w:t xml:space="preserve">);</w:t>
+        <w:br/>
+        <w:t xml:space="preserve">}</w:t>
+      </w:r>
+      <w:r>
+        <w:rPr>
+          <w:sz w:val="18"/>
+          <w:szCs w:val="18"/>
+        </w:rPr>
+      </w:r>
+    </w:p>
+    <w:p>
+      <w:pPr>
+        <w:spacing/>
+        <w:ind/>
+        <w:rPr/>
+      </w:pPr>
+      <w:r>
+        <w:rPr>
+          <w:b/>
+          <w:bCs/>
+          <w:color w:val="7f7f7f" w:themeColor="text1" w:themeTint="80"/>
+        </w:rPr>
       </w:r>
       <w:r>
         <w:rPr>
@@ -4188,7 +4617,12 @@
           <w14:ligatures w14:val="none"/>
         </w:rPr>
       </w:r>
-      <w:r>
+      <w:r/>
+    </w:p>
+    <w:p>
+      <w:pPr>
+        <w:spacing/>
+        <w:ind/>
         <w:rPr>
           <w:b/>
           <w:bCs/>
@@ -4196,14 +4630,29 @@
           <w:highlight w:val="none"/>
           <w14:ligatures w14:val="none"/>
         </w:rPr>
-      </w:r>
-    </w:p>
-    <w:p>
-      <w:pPr>
-        <w:spacing/>
-        <w:ind/>
-        <w:rPr/>
-      </w:pPr>
+      </w:pPr>
+      <w:r>
+        <w:rPr>
+          <w:b/>
+          <w:bCs/>
+          <w:color w:val="7f7f7f" w:themeColor="text1" w:themeTint="80"/>
+        </w:rPr>
+      </w:r>
+      <w:r>
+        <w:rPr>
+          <w:b w:val="0"/>
+          <w:bCs w:val="0"/>
+          <w:highlight w:val="none"/>
+          <w14:ligatures w14:val="none"/>
+        </w:rPr>
+      </w:r>
+      <w:r>
+        <w:rPr>
+          <w:highlight w:val="none"/>
+          <w14:ligatures w14:val="none"/>
+        </w:rPr>
+        <w:br w:type="page" w:clear="all"/>
+      </w:r>
       <w:r>
         <w:rPr>
           <w:b/>
@@ -4213,45 +4662,669 @@
           <w14:ligatures w14:val="none"/>
         </w:rPr>
       </w:r>
-      <w:r>
-        <w:rPr>
-          <w:b/>
-          <w:bCs/>
-          <w:color w:val="7f7f7f" w:themeColor="text1" w:themeTint="80"/>
-          <w:highlight w:val="none"/>
-          <w14:ligatures w14:val="none"/>
-        </w:rPr>
-      </w:r>
       <w:r/>
     </w:p>
     <w:p>
       <w:pPr>
-        <w:shd w:val="nil" w:color="auto"/>
-        <w:spacing/>
-        <w:ind/>
-        <w:rPr>
+        <w:pStyle w:val="851"/>
+        <w:spacing/>
+        <w:ind/>
+        <w:rPr>
+          <w:highlight w:val="none"/>
           <w14:ligatures w14:val="none"/>
         </w:rPr>
       </w:pPr>
+      <w:r/>
+      <w:bookmarkStart w:id="2" w:name="_Toc2"/>
+      <w:r>
+        <w:t xml:space="preserve">Ventajas e inconvenientes de las distintas formas de </w:t>
+      </w:r>
+      <w:r>
+        <w:t xml:space="preserve">acceso</w:t>
+      </w:r>
+      <w:bookmarkEnd w:id="2"/>
       <w:r>
         <w:rPr>
           <w:highlight w:val="none"/>
-        </w:rPr>
-        <w:br w:type="page" w:clear="all"/>
-      </w:r>
-      <w:r>
-        <w:rPr>
           <w14:ligatures w14:val="none"/>
         </w:rPr>
       </w:r>
       <w:r>
         <w:rPr>
+          <w:highlight w:val="none"/>
           <w14:ligatures w14:val="none"/>
         </w:rPr>
       </w:r>
     </w:p>
     <w:p>
       <w:pPr>
+        <w:pStyle w:val="855"/>
+        <w:spacing/>
+        <w:ind/>
+        <w:rPr>
+          <w14:ligatures w14:val="none"/>
+        </w:rPr>
+      </w:pPr>
+      <w:r>
+        <w:t xml:space="preserve">Leer un fichero grande línea por línea (acceso secuencial) y contar cuántas líneas </w:t>
+      </w:r>
+      <w:r>
+        <w:t xml:space="preserve">contienen una palabra clave.</w:t>
+      </w:r>
+      <w:r>
+        <w:rPr>
+          <w14:ligatures w14:val="none"/>
+        </w:rPr>
+      </w:r>
+      <w:r>
+        <w:rPr>
+          <w14:ligatures w14:val="none"/>
+        </w:rPr>
+      </w:r>
+    </w:p>
+    <w:p>
+      <w:pPr>
+        <w:shd w:val="clear" w:color="191a1c" w:fill="191a1c"/>
+        <w:spacing/>
+        <w:ind w:right="0" w:firstLine="0" w:left="0"/>
+        <w:rPr>
+          <w:sz w:val="20"/>
+          <w:szCs w:val="18"/>
+        </w:rPr>
+      </w:pPr>
+      <w:r>
+        <w:rPr>
+          <w:rFonts w:ascii="Liberation Sans" w:hAnsi="Liberation Sans" w:eastAsia="Liberation Sans" w:cs="Liberation Sans"/>
+          <w:color w:val="cf8e6d"/>
+          <w:sz w:val="20"/>
+          <w:szCs w:val="18"/>
+        </w:rPr>
+        <w:t xml:space="preserve">public void </w:t>
+      </w:r>
+      <w:r>
+        <w:rPr>
+          <w:rFonts w:ascii="Liberation Sans" w:hAnsi="Liberation Sans" w:eastAsia="Liberation Sans" w:cs="Liberation Sans"/>
+          <w:color w:val="56a8f5"/>
+          <w:sz w:val="20"/>
+          <w:szCs w:val="18"/>
+        </w:rPr>
+        <w:t xml:space="preserve">ej1</w:t>
+      </w:r>
+      <w:r>
+        <w:rPr>
+          <w:rFonts w:ascii="Liberation Sans" w:hAnsi="Liberation Sans" w:eastAsia="Liberation Sans" w:cs="Liberation Sans"/>
+          <w:color w:val="bcbec4"/>
+          <w:sz w:val="20"/>
+          <w:szCs w:val="18"/>
+        </w:rPr>
+        <w:t xml:space="preserve">(String ruta, String clave){</w:t>
+        <w:br/>
+        <w:t xml:space="preserve">    System.</w:t>
+      </w:r>
+      <w:r>
+        <w:rPr>
+          <w:rFonts w:ascii="Liberation Sans" w:hAnsi="Liberation Sans" w:eastAsia="Liberation Sans" w:cs="Liberation Sans"/>
+          <w:i/>
+          <w:color w:val="c77dbb"/>
+          <w:sz w:val="20"/>
+          <w:szCs w:val="18"/>
+        </w:rPr>
+        <w:t xml:space="preserve">out</w:t>
+      </w:r>
+      <w:r>
+        <w:rPr>
+          <w:rFonts w:ascii="Liberation Sans" w:hAnsi="Liberation Sans" w:eastAsia="Liberation Sans" w:cs="Liberation Sans"/>
+          <w:color w:val="bcbec4"/>
+          <w:sz w:val="20"/>
+          <w:szCs w:val="18"/>
+        </w:rPr>
+        <w:t xml:space="preserve">.println(</w:t>
+      </w:r>
+      <w:r>
+        <w:rPr>
+          <w:rFonts w:ascii="Liberation Sans" w:hAnsi="Liberation Sans" w:eastAsia="Liberation Sans" w:cs="Liberation Sans"/>
+          <w:color w:val="6aab73"/>
+          <w:sz w:val="20"/>
+          <w:szCs w:val="18"/>
+        </w:rPr>
+        <w:t xml:space="preserve">"---- COMIENZO EJERCICIO 1 ----"</w:t>
+      </w:r>
+      <w:r>
+        <w:rPr>
+          <w:rFonts w:ascii="Liberation Sans" w:hAnsi="Liberation Sans" w:eastAsia="Liberation Sans" w:cs="Liberation Sans"/>
+          <w:color w:val="bcbec4"/>
+          <w:sz w:val="20"/>
+          <w:szCs w:val="18"/>
+        </w:rPr>
+        <w:t xml:space="preserve">);</w:t>
+        <w:br/>
+        <w:t xml:space="preserve">    Path dir = Paths.</w:t>
+      </w:r>
+      <w:r>
+        <w:rPr>
+          <w:rFonts w:ascii="Liberation Sans" w:hAnsi="Liberation Sans" w:eastAsia="Liberation Sans" w:cs="Liberation Sans"/>
+          <w:i/>
+          <w:color w:val="bcbec4"/>
+          <w:sz w:val="20"/>
+          <w:szCs w:val="18"/>
+        </w:rPr>
+        <w:t xml:space="preserve">get</w:t>
+      </w:r>
+      <w:r>
+        <w:rPr>
+          <w:rFonts w:ascii="Liberation Sans" w:hAnsi="Liberation Sans" w:eastAsia="Liberation Sans" w:cs="Liberation Sans"/>
+          <w:color w:val="bcbec4"/>
+          <w:sz w:val="20"/>
+          <w:szCs w:val="18"/>
+        </w:rPr>
+        <w:t xml:space="preserve">(ruta);</w:t>
+        <w:br/>
+        <w:t xml:space="preserve">    </w:t>
+      </w:r>
+      <w:r>
+        <w:rPr>
+          <w:rFonts w:ascii="Liberation Sans" w:hAnsi="Liberation Sans" w:eastAsia="Liberation Sans" w:cs="Liberation Sans"/>
+          <w:color w:val="cf8e6d"/>
+          <w:sz w:val="20"/>
+          <w:szCs w:val="18"/>
+        </w:rPr>
+        <w:t xml:space="preserve">int </w:t>
+      </w:r>
+      <w:r>
+        <w:rPr>
+          <w:rFonts w:ascii="Liberation Sans" w:hAnsi="Liberation Sans" w:eastAsia="Liberation Sans" w:cs="Liberation Sans"/>
+          <w:color w:val="bcbec4"/>
+          <w:sz w:val="20"/>
+          <w:szCs w:val="18"/>
+        </w:rPr>
+        <w:t xml:space="preserve">cont = </w:t>
+      </w:r>
+      <w:r>
+        <w:rPr>
+          <w:rFonts w:ascii="Liberation Sans" w:hAnsi="Liberation Sans" w:eastAsia="Liberation Sans" w:cs="Liberation Sans"/>
+          <w:color w:val="2aacb8"/>
+          <w:sz w:val="20"/>
+          <w:szCs w:val="18"/>
+        </w:rPr>
+        <w:t xml:space="preserve">0</w:t>
+      </w:r>
+      <w:r>
+        <w:rPr>
+          <w:rFonts w:ascii="Liberation Sans" w:hAnsi="Liberation Sans" w:eastAsia="Liberation Sans" w:cs="Liberation Sans"/>
+          <w:color w:val="bcbec4"/>
+          <w:sz w:val="20"/>
+          <w:szCs w:val="18"/>
+        </w:rPr>
+        <w:t xml:space="preserve">;</w:t>
+        <w:br/>
+        <w:t xml:space="preserve">    </w:t>
+      </w:r>
+      <w:r>
+        <w:rPr>
+          <w:rFonts w:ascii="Liberation Sans" w:hAnsi="Liberation Sans" w:eastAsia="Liberation Sans" w:cs="Liberation Sans"/>
+          <w:color w:val="cf8e6d"/>
+          <w:sz w:val="20"/>
+          <w:szCs w:val="18"/>
+        </w:rPr>
+        <w:t xml:space="preserve">try</w:t>
+      </w:r>
+      <w:r>
+        <w:rPr>
+          <w:rFonts w:ascii="Liberation Sans" w:hAnsi="Liberation Sans" w:eastAsia="Liberation Sans" w:cs="Liberation Sans"/>
+          <w:color w:val="bcbec4"/>
+          <w:sz w:val="20"/>
+          <w:szCs w:val="18"/>
+        </w:rPr>
+        <w:t xml:space="preserve">(BufferedReader br = Files.</w:t>
+      </w:r>
+      <w:r>
+        <w:rPr>
+          <w:rFonts w:ascii="Liberation Sans" w:hAnsi="Liberation Sans" w:eastAsia="Liberation Sans" w:cs="Liberation Sans"/>
+          <w:i/>
+          <w:color w:val="bcbec4"/>
+          <w:sz w:val="20"/>
+          <w:szCs w:val="18"/>
+        </w:rPr>
+        <w:t xml:space="preserve">newBufferedReader</w:t>
+      </w:r>
+      <w:r>
+        <w:rPr>
+          <w:rFonts w:ascii="Liberation Sans" w:hAnsi="Liberation Sans" w:eastAsia="Liberation Sans" w:cs="Liberation Sans"/>
+          <w:color w:val="bcbec4"/>
+          <w:sz w:val="20"/>
+          <w:szCs w:val="18"/>
+        </w:rPr>
+        <w:t xml:space="preserve">(dir)) {</w:t>
+        <w:br/>
+        <w:t xml:space="preserve">        String linea;</w:t>
+        <w:br/>
+        <w:t xml:space="preserve">        </w:t>
+      </w:r>
+      <w:r>
+        <w:rPr>
+          <w:rFonts w:ascii="Liberation Sans" w:hAnsi="Liberation Sans" w:eastAsia="Liberation Sans" w:cs="Liberation Sans"/>
+          <w:color w:val="cf8e6d"/>
+          <w:sz w:val="20"/>
+          <w:szCs w:val="18"/>
+        </w:rPr>
+        <w:t xml:space="preserve">while </w:t>
+      </w:r>
+      <w:r>
+        <w:rPr>
+          <w:rFonts w:ascii="Liberation Sans" w:hAnsi="Liberation Sans" w:eastAsia="Liberation Sans" w:cs="Liberation Sans"/>
+          <w:color w:val="bcbec4"/>
+          <w:sz w:val="20"/>
+          <w:szCs w:val="18"/>
+        </w:rPr>
+        <w:t xml:space="preserve">((linea = br.readLine()) != </w:t>
+      </w:r>
+      <w:r>
+        <w:rPr>
+          <w:rFonts w:ascii="Liberation Sans" w:hAnsi="Liberation Sans" w:eastAsia="Liberation Sans" w:cs="Liberation Sans"/>
+          <w:color w:val="cf8e6d"/>
+          <w:sz w:val="20"/>
+          <w:szCs w:val="18"/>
+        </w:rPr>
+        <w:t xml:space="preserve">null</w:t>
+      </w:r>
+      <w:r>
+        <w:rPr>
+          <w:rFonts w:ascii="Liberation Sans" w:hAnsi="Liberation Sans" w:eastAsia="Liberation Sans" w:cs="Liberation Sans"/>
+          <w:color w:val="bcbec4"/>
+          <w:sz w:val="20"/>
+          <w:szCs w:val="18"/>
+        </w:rPr>
+        <w:t xml:space="preserve">){</w:t>
+        <w:br/>
+        <w:t xml:space="preserve">            </w:t>
+      </w:r>
+      <w:r>
+        <w:rPr>
+          <w:rFonts w:ascii="Liberation Sans" w:hAnsi="Liberation Sans" w:eastAsia="Liberation Sans" w:cs="Liberation Sans"/>
+          <w:color w:val="cf8e6d"/>
+          <w:sz w:val="20"/>
+          <w:szCs w:val="18"/>
+        </w:rPr>
+        <w:t xml:space="preserve">if </w:t>
+      </w:r>
+      <w:r>
+        <w:rPr>
+          <w:rFonts w:ascii="Liberation Sans" w:hAnsi="Liberation Sans" w:eastAsia="Liberation Sans" w:cs="Liberation Sans"/>
+          <w:color w:val="bcbec4"/>
+          <w:sz w:val="20"/>
+          <w:szCs w:val="18"/>
+        </w:rPr>
+        <w:t xml:space="preserve">(linea.contains(clave)) cont++;</w:t>
+        <w:br/>
+        <w:t xml:space="preserve">        }</w:t>
+        <w:br/>
+        <w:t xml:space="preserve">    } </w:t>
+      </w:r>
+      <w:r>
+        <w:rPr>
+          <w:rFonts w:ascii="Liberation Sans" w:hAnsi="Liberation Sans" w:eastAsia="Liberation Sans" w:cs="Liberation Sans"/>
+          <w:color w:val="cf8e6d"/>
+          <w:sz w:val="20"/>
+          <w:szCs w:val="18"/>
+        </w:rPr>
+        <w:t xml:space="preserve">catch </w:t>
+      </w:r>
+      <w:r>
+        <w:rPr>
+          <w:rFonts w:ascii="Liberation Sans" w:hAnsi="Liberation Sans" w:eastAsia="Liberation Sans" w:cs="Liberation Sans"/>
+          <w:color w:val="bcbec4"/>
+          <w:sz w:val="20"/>
+          <w:szCs w:val="18"/>
+        </w:rPr>
+        <w:t xml:space="preserve">(IOException e) {</w:t>
+        <w:br/>
+        <w:t xml:space="preserve">        </w:t>
+      </w:r>
+      <w:r>
+        <w:rPr>
+          <w:rFonts w:ascii="Liberation Sans" w:hAnsi="Liberation Sans" w:eastAsia="Liberation Sans" w:cs="Liberation Sans"/>
+          <w:color w:val="cf8e6d"/>
+          <w:sz w:val="20"/>
+          <w:szCs w:val="18"/>
+        </w:rPr>
+        <w:t xml:space="preserve">throw new </w:t>
+      </w:r>
+      <w:r>
+        <w:rPr>
+          <w:rFonts w:ascii="Liberation Sans" w:hAnsi="Liberation Sans" w:eastAsia="Liberation Sans" w:cs="Liberation Sans"/>
+          <w:color w:val="bcbec4"/>
+          <w:sz w:val="20"/>
+          <w:szCs w:val="18"/>
+        </w:rPr>
+        <w:t xml:space="preserve">RuntimeException(e);</w:t>
+        <w:br/>
+        <w:t xml:space="preserve">    }</w:t>
+        <w:br/>
+        <w:t xml:space="preserve">    System.</w:t>
+      </w:r>
+      <w:r>
+        <w:rPr>
+          <w:rFonts w:ascii="Liberation Sans" w:hAnsi="Liberation Sans" w:eastAsia="Liberation Sans" w:cs="Liberation Sans"/>
+          <w:i/>
+          <w:color w:val="c77dbb"/>
+          <w:sz w:val="20"/>
+          <w:szCs w:val="18"/>
+        </w:rPr>
+        <w:t xml:space="preserve">out</w:t>
+      </w:r>
+      <w:r>
+        <w:rPr>
+          <w:rFonts w:ascii="Liberation Sans" w:hAnsi="Liberation Sans" w:eastAsia="Liberation Sans" w:cs="Liberation Sans"/>
+          <w:color w:val="bcbec4"/>
+          <w:sz w:val="20"/>
+          <w:szCs w:val="18"/>
+        </w:rPr>
+        <w:t xml:space="preserve">.println(</w:t>
+      </w:r>
+      <w:r>
+        <w:rPr>
+          <w:rFonts w:ascii="Liberation Sans" w:hAnsi="Liberation Sans" w:eastAsia="Liberation Sans" w:cs="Liberation Sans"/>
+          <w:color w:val="6aab73"/>
+          <w:sz w:val="20"/>
+          <w:szCs w:val="18"/>
+        </w:rPr>
+        <w:t xml:space="preserve">"Palabra clave " </w:t>
+      </w:r>
+      <w:r>
+        <w:rPr>
+          <w:rFonts w:ascii="Liberation Sans" w:hAnsi="Liberation Sans" w:eastAsia="Liberation Sans" w:cs="Liberation Sans"/>
+          <w:color w:val="bcbec4"/>
+          <w:sz w:val="20"/>
+          <w:szCs w:val="18"/>
+        </w:rPr>
+        <w:t xml:space="preserve">+ clave + </w:t>
+      </w:r>
+      <w:r>
+        <w:rPr>
+          <w:rFonts w:ascii="Liberation Sans" w:hAnsi="Liberation Sans" w:eastAsia="Liberation Sans" w:cs="Liberation Sans"/>
+          <w:color w:val="6aab73"/>
+          <w:sz w:val="20"/>
+          <w:szCs w:val="18"/>
+        </w:rPr>
+        <w:t xml:space="preserve">" encontrada en " </w:t>
+      </w:r>
+      <w:r>
+        <w:rPr>
+          <w:rFonts w:ascii="Liberation Sans" w:hAnsi="Liberation Sans" w:eastAsia="Liberation Sans" w:cs="Liberation Sans"/>
+          <w:color w:val="bcbec4"/>
+          <w:sz w:val="20"/>
+          <w:szCs w:val="18"/>
+        </w:rPr>
+        <w:t xml:space="preserve">+ cont + </w:t>
+      </w:r>
+      <w:r>
+        <w:rPr>
+          <w:rFonts w:ascii="Liberation Sans" w:hAnsi="Liberation Sans" w:eastAsia="Liberation Sans" w:cs="Liberation Sans"/>
+          <w:color w:val="6aab73"/>
+          <w:sz w:val="20"/>
+          <w:szCs w:val="18"/>
+        </w:rPr>
+        <w:t xml:space="preserve">" líneas."</w:t>
+      </w:r>
+      <w:r>
+        <w:rPr>
+          <w:rFonts w:ascii="Liberation Sans" w:hAnsi="Liberation Sans" w:eastAsia="Liberation Sans" w:cs="Liberation Sans"/>
+          <w:color w:val="bcbec4"/>
+          <w:sz w:val="20"/>
+          <w:szCs w:val="18"/>
+        </w:rPr>
+        <w:t xml:space="preserve">);</w:t>
+        <w:br/>
+        <w:t xml:space="preserve">    System.</w:t>
+      </w:r>
+      <w:r>
+        <w:rPr>
+          <w:rFonts w:ascii="Liberation Sans" w:hAnsi="Liberation Sans" w:eastAsia="Liberation Sans" w:cs="Liberation Sans"/>
+          <w:i/>
+          <w:color w:val="c77dbb"/>
+          <w:sz w:val="20"/>
+          <w:szCs w:val="18"/>
+        </w:rPr>
+        <w:t xml:space="preserve">out</w:t>
+      </w:r>
+      <w:r>
+        <w:rPr>
+          <w:rFonts w:ascii="Liberation Sans" w:hAnsi="Liberation Sans" w:eastAsia="Liberation Sans" w:cs="Liberation Sans"/>
+          <w:color w:val="bcbec4"/>
+          <w:sz w:val="20"/>
+          <w:szCs w:val="18"/>
+        </w:rPr>
+        <w:t xml:space="preserve">.println(</w:t>
+      </w:r>
+      <w:r>
+        <w:rPr>
+          <w:rFonts w:ascii="Liberation Sans" w:hAnsi="Liberation Sans" w:eastAsia="Liberation Sans" w:cs="Liberation Sans"/>
+          <w:color w:val="6aab73"/>
+          <w:sz w:val="20"/>
+          <w:szCs w:val="18"/>
+        </w:rPr>
+        <w:t xml:space="preserve">"----- FIN DE EJERCICIO 1 -----</w:t>
+      </w:r>
+      <w:r>
+        <w:rPr>
+          <w:rFonts w:ascii="Liberation Sans" w:hAnsi="Liberation Sans" w:eastAsia="Liberation Sans" w:cs="Liberation Sans"/>
+          <w:color w:val="cf8e6d"/>
+          <w:sz w:val="20"/>
+          <w:szCs w:val="18"/>
+        </w:rPr>
+        <w:t xml:space="preserve">\n</w:t>
+      </w:r>
+      <w:r>
+        <w:rPr>
+          <w:rFonts w:ascii="Liberation Sans" w:hAnsi="Liberation Sans" w:eastAsia="Liberation Sans" w:cs="Liberation Sans"/>
+          <w:color w:val="6aab73"/>
+          <w:sz w:val="20"/>
+          <w:szCs w:val="18"/>
+        </w:rPr>
+        <w:t xml:space="preserve">"</w:t>
+      </w:r>
+      <w:r>
+        <w:rPr>
+          <w:rFonts w:ascii="Liberation Sans" w:hAnsi="Liberation Sans" w:eastAsia="Liberation Sans" w:cs="Liberation Sans"/>
+          <w:color w:val="bcbec4"/>
+          <w:sz w:val="20"/>
+          <w:szCs w:val="18"/>
+        </w:rPr>
+        <w:t xml:space="preserve">);</w:t>
+        <w:br/>
+        <w:t xml:space="preserve">}</w:t>
+      </w:r>
+      <w:r>
+        <w:rPr>
+          <w:sz w:val="18"/>
+          <w:szCs w:val="18"/>
+        </w:rPr>
+      </w:r>
+    </w:p>
+    <w:p>
+      <w:pPr>
+        <w:spacing/>
+        <w:ind/>
+        <w:rPr>
+          <w:sz w:val="22"/>
+          <w:szCs w:val="22"/>
+        </w:rPr>
+      </w:pPr>
+      <w:r>
+        <w:rPr>
+          <w14:ligatures w14:val="none"/>
+        </w:rPr>
+      </w:r>
+      <w:r>
+        <w:rPr>
+          <w:sz w:val="22"/>
+          <w:szCs w:val="22"/>
+          <w14:ligatures w14:val="none"/>
+        </w:rPr>
+      </w:r>
+      <w:r>
+        <w:rPr>
+          <w:sz w:val="22"/>
+          <w:szCs w:val="22"/>
+        </w:rPr>
+      </w:r>
+    </w:p>
+    <w:p>
+      <w:pPr>
+        <w:pStyle w:val="855"/>
+        <w:spacing/>
+        <w:ind/>
+        <w:rPr>
+          <w14:ligatures w14:val="none"/>
+        </w:rPr>
+      </w:pPr>
+      <w:r>
+        <w:t xml:space="preserve">Crear una clase Registro de tamaño fijo y guardarla en un fichero binario usando </w:t>
+      </w:r>
+      <w:r>
+        <w:t xml:space="preserve">acceso aleatorio.</w:t>
+      </w:r>
+      <w:r>
+        <w:rPr>
+          <w14:ligatures w14:val="none"/>
+        </w:rPr>
+      </w:r>
+      <w:r>
+        <w:rPr>
+          <w14:ligatures w14:val="none"/>
+        </w:rPr>
+      </w:r>
+    </w:p>
+    <w:p>
+      <w:pPr>
+        <w:spacing/>
+        <w:ind/>
+        <w:rPr/>
+      </w:pPr>
+      <w:r>
+        <w:rPr>
+          <w14:ligatures w14:val="none"/>
+        </w:rPr>
+      </w:r>
+      <w:r>
+        <w:rPr>
+          <w14:ligatures w14:val="none"/>
+        </w:rPr>
+      </w:r>
+      <w:r/>
+    </w:p>
+    <w:p>
+      <w:pPr>
+        <w:pStyle w:val="855"/>
+        <w:spacing/>
+        <w:ind/>
+        <w:rPr>
+          <w14:ligatures w14:val="none"/>
+        </w:rPr>
+      </w:pPr>
+      <w:r>
+        <w:t xml:space="preserve">Modificar un registro en una posición concreta de un fichero sin reescribir el fichero </w:t>
+      </w:r>
+      <w:r>
+        <w:t xml:space="preserve">completo.</w:t>
+      </w:r>
+      <w:r>
+        <w:rPr>
+          <w14:ligatures w14:val="none"/>
+        </w:rPr>
+      </w:r>
+      <w:r>
+        <w:rPr>
+          <w14:ligatures w14:val="none"/>
+        </w:rPr>
+      </w:r>
+    </w:p>
+    <w:p>
+      <w:pPr>
+        <w:pStyle w:val="855"/>
+        <w:spacing/>
+        <w:ind/>
+        <w:rPr>
+          <w14:ligatures w14:val="none"/>
+        </w:rPr>
+      </w:pPr>
+      <w:r>
+        <w:t xml:space="preserve">Comparar el tiempo de lectura secuencial vs aleatoria en un fichero con 10.000 </w:t>
+      </w:r>
+      <w:r>
+        <w:t xml:space="preserve">registros de tamaño fijo.</w:t>
+      </w:r>
+      <w:r>
+        <w:rPr>
+          <w14:ligatures w14:val="none"/>
+        </w:rPr>
+      </w:r>
+      <w:r>
+        <w:rPr>
+          <w14:ligatures w14:val="none"/>
+        </w:rPr>
+      </w:r>
+    </w:p>
+    <w:p>
+      <w:pPr>
+        <w:pStyle w:val="855"/>
+        <w:spacing/>
+        <w:ind/>
+        <w:rPr>
+          <w14:ligatures w14:val="none"/>
+        </w:rPr>
+      </w:pPr>
+      <w:r>
+        <w:t xml:space="preserve">Crear un programa que permita insertar, modificar y eliminar registros en un fichero </w:t>
+      </w:r>
+      <w:r>
+        <w:t xml:space="preserve">binario con acceso aleatorio.</w:t>
+      </w:r>
+      <w:r>
+        <w:rPr>
+          <w14:ligatures w14:val="none"/>
+        </w:rPr>
+      </w:r>
+      <w:r>
+        <w:rPr>
+          <w14:ligatures w14:val="none"/>
+        </w:rPr>
+      </w:r>
+    </w:p>
+    <w:p>
+      <w:pPr>
+        <w:pStyle w:val="855"/>
+        <w:spacing/>
+        <w:ind/>
+        <w:rPr>
+          <w14:ligatures w14:val="none"/>
+        </w:rPr>
+      </w:pPr>
+      <w:r>
+        <w:t xml:space="preserve">Escribir un índice con las posiciones de los registros en un fichero para acceder a ellos </w:t>
+      </w:r>
+      <w:r>
+        <w:t xml:space="preserve">más rápidamente.</w:t>
+      </w:r>
+      <w:r>
+        <w:rPr>
+          <w:highlight w:val="none"/>
+        </w:rPr>
+        <w:br w:type="page" w:clear="all"/>
+      </w:r>
+      <w:r>
+        <w:rPr>
+          <w14:ligatures w14:val="none"/>
+        </w:rPr>
+      </w:r>
+      <w:r>
+        <w:rPr>
+          <w14:ligatures w14:val="none"/>
+        </w:rPr>
+      </w:r>
+    </w:p>
+    <w:p>
+      <w:pPr>
         <w:pStyle w:val="851"/>
         <w:spacing/>
         <w:ind/>
@@ -4261,14 +5334,11 @@
         </w:rPr>
       </w:pPr>
       <w:r/>
-      <w:bookmarkStart w:id="2" w:name="_Toc2"/>
-      <w:r>
-        <w:t xml:space="preserve">Ventajas e inconvenientes de las distintas formas de </w:t>
-      </w:r>
-      <w:r>
-        <w:t xml:space="preserve">acceso</w:t>
-      </w:r>
-      <w:bookmarkEnd w:id="2"/>
+      <w:bookmarkStart w:id="3" w:name="_Toc3"/>
+      <w:r>
+        <w:t xml:space="preserve">Recuperar información almacenada en ficheros</w:t>
+      </w:r>
+      <w:bookmarkEnd w:id="3"/>
       <w:r>
         <w:rPr>
           <w:highlight w:val="none"/>
@@ -4292,10 +5362,10 @@
         </w:rPr>
       </w:pPr>
       <w:r>
-        <w:t xml:space="preserve">Leer un fichero grande línea por línea (acceso secuencial) y contar cuántas líneas </w:t>
-      </w:r>
-      <w:r>
-        <w:t xml:space="preserve">contienen una palabra clave.</w:t>
+        <w:t xml:space="preserve">Leer un fichero de texto con datos de usuarios (nombre, edad, correo) y mostrarlos por </w:t>
+      </w:r>
+      <w:r>
+        <w:t xml:space="preserve">consola.</w:t>
       </w:r>
       <w:r>
         <w:rPr>
@@ -4310,55 +5380,437 @@
     </w:p>
     <w:p>
       <w:pPr>
-        <w:pStyle w:val="855"/>
-        <w:spacing/>
-        <w:ind/>
-        <w:rPr>
-          <w14:ligatures w14:val="none"/>
-        </w:rPr>
-      </w:pPr>
-      <w:r>
-        <w:t xml:space="preserve">Crear una clase Registro de tamaño fijo y guardarla en un fichero binario usando </w:t>
-      </w:r>
-      <w:r>
-        <w:t xml:space="preserve">acceso aleatorio.</w:t>
-      </w:r>
-      <w:r>
-        <w:rPr>
-          <w14:ligatures w14:val="none"/>
-        </w:rPr>
-      </w:r>
-      <w:r>
-        <w:rPr>
-          <w14:ligatures w14:val="none"/>
+        <w:shd w:val="clear" w:color="191a1c" w:fill="191a1c"/>
+        <w:spacing/>
+        <w:ind w:right="0" w:firstLine="0" w:left="0"/>
+        <w:rPr>
+          <w:sz w:val="20"/>
+          <w:szCs w:val="18"/>
+        </w:rPr>
+      </w:pPr>
+      <w:r>
+        <w:rPr>
+          <w:rFonts w:ascii="Liberation Sans" w:hAnsi="Liberation Sans" w:eastAsia="Liberation Sans" w:cs="Liberation Sans"/>
+          <w:color w:val="cf8e6d"/>
+          <w:sz w:val="20"/>
+          <w:szCs w:val="18"/>
+        </w:rPr>
+        <w:t xml:space="preserve">public void </w:t>
+      </w:r>
+      <w:r>
+        <w:rPr>
+          <w:rFonts w:ascii="Liberation Sans" w:hAnsi="Liberation Sans" w:eastAsia="Liberation Sans" w:cs="Liberation Sans"/>
+          <w:color w:val="56a8f5"/>
+          <w:sz w:val="20"/>
+          <w:szCs w:val="18"/>
+        </w:rPr>
+        <w:t xml:space="preserve">ej1</w:t>
+      </w:r>
+      <w:r>
+        <w:rPr>
+          <w:rFonts w:ascii="Liberation Sans" w:hAnsi="Liberation Sans" w:eastAsia="Liberation Sans" w:cs="Liberation Sans"/>
+          <w:color w:val="bcbec4"/>
+          <w:sz w:val="20"/>
+          <w:szCs w:val="18"/>
+        </w:rPr>
+        <w:t xml:space="preserve">(String ruta){</w:t>
+        <w:br/>
+        <w:t xml:space="preserve">    System.</w:t>
+      </w:r>
+      <w:r>
+        <w:rPr>
+          <w:rFonts w:ascii="Liberation Sans" w:hAnsi="Liberation Sans" w:eastAsia="Liberation Sans" w:cs="Liberation Sans"/>
+          <w:i/>
+          <w:color w:val="c77dbb"/>
+          <w:sz w:val="20"/>
+          <w:szCs w:val="18"/>
+        </w:rPr>
+        <w:t xml:space="preserve">out</w:t>
+      </w:r>
+      <w:r>
+        <w:rPr>
+          <w:rFonts w:ascii="Liberation Sans" w:hAnsi="Liberation Sans" w:eastAsia="Liberation Sans" w:cs="Liberation Sans"/>
+          <w:color w:val="bcbec4"/>
+          <w:sz w:val="20"/>
+          <w:szCs w:val="18"/>
+        </w:rPr>
+        <w:t xml:space="preserve">.println(</w:t>
+      </w:r>
+      <w:r>
+        <w:rPr>
+          <w:rFonts w:ascii="Liberation Sans" w:hAnsi="Liberation Sans" w:eastAsia="Liberation Sans" w:cs="Liberation Sans"/>
+          <w:color w:val="6aab73"/>
+          <w:sz w:val="20"/>
+          <w:szCs w:val="18"/>
+        </w:rPr>
+        <w:t xml:space="preserve">"---- COMIENZO EJERCICIO 1 ----"</w:t>
+      </w:r>
+      <w:r>
+        <w:rPr>
+          <w:rFonts w:ascii="Liberation Sans" w:hAnsi="Liberation Sans" w:eastAsia="Liberation Sans" w:cs="Liberation Sans"/>
+          <w:color w:val="bcbec4"/>
+          <w:sz w:val="20"/>
+          <w:szCs w:val="18"/>
+        </w:rPr>
+        <w:t xml:space="preserve">);</w:t>
+        <w:br/>
+        <w:t xml:space="preserve">    Path dir = Paths.</w:t>
+      </w:r>
+      <w:r>
+        <w:rPr>
+          <w:rFonts w:ascii="Liberation Sans" w:hAnsi="Liberation Sans" w:eastAsia="Liberation Sans" w:cs="Liberation Sans"/>
+          <w:i/>
+          <w:color w:val="bcbec4"/>
+          <w:sz w:val="20"/>
+          <w:szCs w:val="18"/>
+        </w:rPr>
+        <w:t xml:space="preserve">get</w:t>
+      </w:r>
+      <w:r>
+        <w:rPr>
+          <w:rFonts w:ascii="Liberation Sans" w:hAnsi="Liberation Sans" w:eastAsia="Liberation Sans" w:cs="Liberation Sans"/>
+          <w:color w:val="bcbec4"/>
+          <w:sz w:val="20"/>
+          <w:szCs w:val="18"/>
+        </w:rPr>
+        <w:t xml:space="preserve">(ruta);</w:t>
+        <w:br/>
+        <w:t xml:space="preserve">    </w:t>
+      </w:r>
+      <w:r>
+        <w:rPr>
+          <w:rFonts w:ascii="Liberation Sans" w:hAnsi="Liberation Sans" w:eastAsia="Liberation Sans" w:cs="Liberation Sans"/>
+          <w:color w:val="cf8e6d"/>
+          <w:sz w:val="20"/>
+          <w:szCs w:val="18"/>
+        </w:rPr>
+        <w:t xml:space="preserve">try </w:t>
+      </w:r>
+      <w:r>
+        <w:rPr>
+          <w:rFonts w:ascii="Liberation Sans" w:hAnsi="Liberation Sans" w:eastAsia="Liberation Sans" w:cs="Liberation Sans"/>
+          <w:color w:val="bcbec4"/>
+          <w:sz w:val="20"/>
+          <w:szCs w:val="18"/>
+        </w:rPr>
+        <w:t xml:space="preserve">(BufferedReader br = Files.</w:t>
+      </w:r>
+      <w:r>
+        <w:rPr>
+          <w:rFonts w:ascii="Liberation Sans" w:hAnsi="Liberation Sans" w:eastAsia="Liberation Sans" w:cs="Liberation Sans"/>
+          <w:i/>
+          <w:color w:val="bcbec4"/>
+          <w:sz w:val="20"/>
+          <w:szCs w:val="18"/>
+        </w:rPr>
+        <w:t xml:space="preserve">newBufferedReader</w:t>
+      </w:r>
+      <w:r>
+        <w:rPr>
+          <w:rFonts w:ascii="Liberation Sans" w:hAnsi="Liberation Sans" w:eastAsia="Liberation Sans" w:cs="Liberation Sans"/>
+          <w:color w:val="bcbec4"/>
+          <w:sz w:val="20"/>
+          <w:szCs w:val="18"/>
+        </w:rPr>
+        <w:t xml:space="preserve">(dir)) {</w:t>
+        <w:br/>
+        <w:t xml:space="preserve">        </w:t>
+      </w:r>
+      <w:r>
+        <w:rPr>
+          <w:rFonts w:ascii="Liberation Sans" w:hAnsi="Liberation Sans" w:eastAsia="Liberation Sans" w:cs="Liberation Sans"/>
+          <w:color w:val="cf8e6d"/>
+          <w:sz w:val="20"/>
+          <w:szCs w:val="18"/>
+        </w:rPr>
+        <w:t xml:space="preserve">for </w:t>
+      </w:r>
+      <w:r>
+        <w:rPr>
+          <w:rFonts w:ascii="Liberation Sans" w:hAnsi="Liberation Sans" w:eastAsia="Liberation Sans" w:cs="Liberation Sans"/>
+          <w:color w:val="bcbec4"/>
+          <w:sz w:val="20"/>
+          <w:szCs w:val="18"/>
+        </w:rPr>
+        <w:t xml:space="preserve">(String linea : br.readAllLines()){</w:t>
+        <w:br/>
+        <w:t xml:space="preserve">                String[] registro = linea.split(</w:t>
+      </w:r>
+      <w:r>
+        <w:rPr>
+          <w:rFonts w:ascii="Liberation Sans" w:hAnsi="Liberation Sans" w:eastAsia="Liberation Sans" w:cs="Liberation Sans"/>
+          <w:color w:val="6aab73"/>
+          <w:sz w:val="20"/>
+          <w:szCs w:val="18"/>
+        </w:rPr>
+        <w:t xml:space="preserve">"</w:t>
+      </w:r>
+      <w:r>
+        <w:rPr>
+          <w:rFonts w:ascii="Liberation Sans" w:hAnsi="Liberation Sans" w:eastAsia="Liberation Sans" w:cs="Liberation Sans"/>
+          <w:color w:val="6aab73"/>
+          <w:sz w:val="20"/>
+          <w:szCs w:val="18"/>
+          <w:highlight w:val="none"/>
+        </w:rPr>
+        <w:t xml:space="preserve">,</w:t>
+      </w:r>
+      <w:r>
+        <w:rPr>
+          <w:rFonts w:ascii="Liberation Sans" w:hAnsi="Liberation Sans" w:eastAsia="Liberation Sans" w:cs="Liberation Sans"/>
+          <w:color w:val="6aab73"/>
+          <w:sz w:val="20"/>
+          <w:szCs w:val="18"/>
+        </w:rPr>
+        <w:t xml:space="preserve">"</w:t>
+      </w:r>
+      <w:r>
+        <w:rPr>
+          <w:rFonts w:ascii="Liberation Sans" w:hAnsi="Liberation Sans" w:eastAsia="Liberation Sans" w:cs="Liberation Sans"/>
+          <w:color w:val="bcbec4"/>
+          <w:sz w:val="20"/>
+          <w:szCs w:val="18"/>
+        </w:rPr>
+        <w:t xml:space="preserve">);</w:t>
+        <w:br/>
+        <w:t xml:space="preserve">                System.</w:t>
+      </w:r>
+      <w:r>
+        <w:rPr>
+          <w:rFonts w:ascii="Liberation Sans" w:hAnsi="Liberation Sans" w:eastAsia="Liberation Sans" w:cs="Liberation Sans"/>
+          <w:i/>
+          <w:color w:val="c77dbb"/>
+          <w:sz w:val="20"/>
+          <w:szCs w:val="18"/>
+        </w:rPr>
+        <w:t xml:space="preserve">out</w:t>
+      </w:r>
+      <w:r>
+        <w:rPr>
+          <w:rFonts w:ascii="Liberation Sans" w:hAnsi="Liberation Sans" w:eastAsia="Liberation Sans" w:cs="Liberation Sans"/>
+          <w:color w:val="bcbec4"/>
+          <w:sz w:val="20"/>
+          <w:szCs w:val="18"/>
+        </w:rPr>
+        <w:t xml:space="preserve">.println(registro[</w:t>
+      </w:r>
+      <w:r>
+        <w:rPr>
+          <w:rFonts w:ascii="Liberation Sans" w:hAnsi="Liberation Sans" w:eastAsia="Liberation Sans" w:cs="Liberation Sans"/>
+          <w:color w:val="2aacb8"/>
+          <w:sz w:val="20"/>
+          <w:szCs w:val="18"/>
+        </w:rPr>
+        <w:t xml:space="preserve">0</w:t>
+      </w:r>
+      <w:r>
+        <w:rPr>
+          <w:rFonts w:ascii="Liberation Sans" w:hAnsi="Liberation Sans" w:eastAsia="Liberation Sans" w:cs="Liberation Sans"/>
+          <w:color w:val="bcbec4"/>
+          <w:sz w:val="20"/>
+          <w:szCs w:val="18"/>
+        </w:rPr>
+        <w:t xml:space="preserve">]+</w:t>
+      </w:r>
+      <w:r>
+        <w:rPr>
+          <w:rFonts w:ascii="Liberation Sans" w:hAnsi="Liberation Sans" w:eastAsia="Liberation Sans" w:cs="Liberation Sans"/>
+          <w:color w:val="6aab73"/>
+          <w:sz w:val="20"/>
+          <w:szCs w:val="18"/>
+        </w:rPr>
+        <w:t xml:space="preserve">" "</w:t>
+      </w:r>
+      <w:r>
+        <w:rPr>
+          <w:rFonts w:ascii="Liberation Sans" w:hAnsi="Liberation Sans" w:eastAsia="Liberation Sans" w:cs="Liberation Sans"/>
+          <w:color w:val="bcbec4"/>
+          <w:sz w:val="20"/>
+          <w:szCs w:val="18"/>
+        </w:rPr>
+        <w:t xml:space="preserve">+registro[</w:t>
+      </w:r>
+      <w:r>
+        <w:rPr>
+          <w:rFonts w:ascii="Liberation Sans" w:hAnsi="Liberation Sans" w:eastAsia="Liberation Sans" w:cs="Liberation Sans"/>
+          <w:color w:val="2aacb8"/>
+          <w:sz w:val="20"/>
+          <w:szCs w:val="18"/>
+        </w:rPr>
+        <w:t xml:space="preserve">1</w:t>
+      </w:r>
+      <w:r>
+        <w:rPr>
+          <w:rFonts w:ascii="Liberation Sans" w:hAnsi="Liberation Sans" w:eastAsia="Liberation Sans" w:cs="Liberation Sans"/>
+          <w:color w:val="bcbec4"/>
+          <w:sz w:val="20"/>
+          <w:szCs w:val="18"/>
+        </w:rPr>
+        <w:t xml:space="preserve">]+</w:t>
+      </w:r>
+      <w:r>
+        <w:rPr>
+          <w:rFonts w:ascii="Liberation Sans" w:hAnsi="Liberation Sans" w:eastAsia="Liberation Sans" w:cs="Liberation Sans"/>
+          <w:color w:val="6aab73"/>
+          <w:sz w:val="20"/>
+          <w:szCs w:val="18"/>
+        </w:rPr>
+        <w:t xml:space="preserve">" "</w:t>
+      </w:r>
+      <w:r>
+        <w:rPr>
+          <w:rFonts w:ascii="Liberation Sans" w:hAnsi="Liberation Sans" w:eastAsia="Liberation Sans" w:cs="Liberation Sans"/>
+          <w:color w:val="bcbec4"/>
+          <w:sz w:val="20"/>
+          <w:szCs w:val="18"/>
+        </w:rPr>
+        <w:t xml:space="preserve">+registro[</w:t>
+      </w:r>
+      <w:r>
+        <w:rPr>
+          <w:rFonts w:ascii="Liberation Sans" w:hAnsi="Liberation Sans" w:eastAsia="Liberation Sans" w:cs="Liberation Sans"/>
+          <w:color w:val="2aacb8"/>
+          <w:sz w:val="20"/>
+          <w:szCs w:val="18"/>
+        </w:rPr>
+        <w:t xml:space="preserve">2</w:t>
+      </w:r>
+      <w:r>
+        <w:rPr>
+          <w:rFonts w:ascii="Liberation Sans" w:hAnsi="Liberation Sans" w:eastAsia="Liberation Sans" w:cs="Liberation Sans"/>
+          <w:color w:val="bcbec4"/>
+          <w:sz w:val="20"/>
+          <w:szCs w:val="18"/>
+        </w:rPr>
+        <w:t xml:space="preserve">]);</w:t>
+        <w:br/>
+        <w:t xml:space="preserve">        }</w:t>
+        <w:br/>
+        <w:t xml:space="preserve">    } </w:t>
+      </w:r>
+      <w:r>
+        <w:rPr>
+          <w:rFonts w:ascii="Liberation Sans" w:hAnsi="Liberation Sans" w:eastAsia="Liberation Sans" w:cs="Liberation Sans"/>
+          <w:color w:val="cf8e6d"/>
+          <w:sz w:val="20"/>
+          <w:szCs w:val="18"/>
+        </w:rPr>
+        <w:t xml:space="preserve">catch </w:t>
+      </w:r>
+      <w:r>
+        <w:rPr>
+          <w:rFonts w:ascii="Liberation Sans" w:hAnsi="Liberation Sans" w:eastAsia="Liberation Sans" w:cs="Liberation Sans"/>
+          <w:color w:val="bcbec4"/>
+          <w:sz w:val="20"/>
+          <w:szCs w:val="18"/>
+        </w:rPr>
+        <w:t xml:space="preserve">(IOException e) {</w:t>
+        <w:br/>
+        <w:t xml:space="preserve">        </w:t>
+      </w:r>
+      <w:r>
+        <w:rPr>
+          <w:rFonts w:ascii="Liberation Sans" w:hAnsi="Liberation Sans" w:eastAsia="Liberation Sans" w:cs="Liberation Sans"/>
+          <w:color w:val="cf8e6d"/>
+          <w:sz w:val="20"/>
+          <w:szCs w:val="18"/>
+        </w:rPr>
+        <w:t xml:space="preserve">throw new </w:t>
+      </w:r>
+      <w:r>
+        <w:rPr>
+          <w:rFonts w:ascii="Liberation Sans" w:hAnsi="Liberation Sans" w:eastAsia="Liberation Sans" w:cs="Liberation Sans"/>
+          <w:color w:val="bcbec4"/>
+          <w:sz w:val="20"/>
+          <w:szCs w:val="18"/>
+        </w:rPr>
+        <w:t xml:space="preserve">RuntimeException(e);</w:t>
+        <w:br/>
+        <w:t xml:space="preserve">    }</w:t>
+        <w:br/>
+        <w:t xml:space="preserve">    System.</w:t>
+      </w:r>
+      <w:r>
+        <w:rPr>
+          <w:rFonts w:ascii="Liberation Sans" w:hAnsi="Liberation Sans" w:eastAsia="Liberation Sans" w:cs="Liberation Sans"/>
+          <w:i/>
+          <w:color w:val="c77dbb"/>
+          <w:sz w:val="20"/>
+          <w:szCs w:val="18"/>
+        </w:rPr>
+        <w:t xml:space="preserve">out</w:t>
+      </w:r>
+      <w:r>
+        <w:rPr>
+          <w:rFonts w:ascii="Liberation Sans" w:hAnsi="Liberation Sans" w:eastAsia="Liberation Sans" w:cs="Liberation Sans"/>
+          <w:color w:val="bcbec4"/>
+          <w:sz w:val="20"/>
+          <w:szCs w:val="18"/>
+        </w:rPr>
+        <w:t xml:space="preserve">.println(</w:t>
+      </w:r>
+      <w:r>
+        <w:rPr>
+          <w:rFonts w:ascii="Liberation Sans" w:hAnsi="Liberation Sans" w:eastAsia="Liberation Sans" w:cs="Liberation Sans"/>
+          <w:color w:val="6aab73"/>
+          <w:sz w:val="20"/>
+          <w:szCs w:val="18"/>
+        </w:rPr>
+        <w:t xml:space="preserve">"----- FIN DE EJERCICIO 1 -----</w:t>
+      </w:r>
+      <w:r>
+        <w:rPr>
+          <w:rFonts w:ascii="Liberation Sans" w:hAnsi="Liberation Sans" w:eastAsia="Liberation Sans" w:cs="Liberation Sans"/>
+          <w:color w:val="cf8e6d"/>
+          <w:sz w:val="20"/>
+          <w:szCs w:val="18"/>
+        </w:rPr>
+        <w:t xml:space="preserve">\n</w:t>
+      </w:r>
+      <w:r>
+        <w:rPr>
+          <w:rFonts w:ascii="Liberation Sans" w:hAnsi="Liberation Sans" w:eastAsia="Liberation Sans" w:cs="Liberation Sans"/>
+          <w:color w:val="6aab73"/>
+          <w:sz w:val="20"/>
+          <w:szCs w:val="18"/>
+        </w:rPr>
+        <w:t xml:space="preserve">"</w:t>
+      </w:r>
+      <w:r>
+        <w:rPr>
+          <w:rFonts w:ascii="Liberation Sans" w:hAnsi="Liberation Sans" w:eastAsia="Liberation Sans" w:cs="Liberation Sans"/>
+          <w:color w:val="bcbec4"/>
+          <w:sz w:val="20"/>
+          <w:szCs w:val="18"/>
+        </w:rPr>
+        <w:t xml:space="preserve">);</w:t>
+        <w:br/>
+        <w:t xml:space="preserve">}</w:t>
+      </w:r>
+      <w:r>
+        <w:rPr>
+          <w:sz w:val="18"/>
+          <w:szCs w:val="18"/>
         </w:rPr>
       </w:r>
     </w:p>
     <w:p>
       <w:pPr>
-        <w:pStyle w:val="855"/>
-        <w:spacing/>
-        <w:ind/>
+        <w:spacing/>
+        <w:ind/>
+        <w:rPr/>
+      </w:pPr>
+      <w:r>
         <w:rPr>
           <w14:ligatures w14:val="none"/>
         </w:rPr>
-      </w:pPr>
-      <w:r>
-        <w:t xml:space="preserve">Modificar un registro en una posición concreta de un fichero sin reescribir el fichero </w:t>
-      </w:r>
-      <w:r>
-        <w:t xml:space="preserve">completo.</w:t>
       </w:r>
       <w:r>
         <w:rPr>
           <w14:ligatures w14:val="none"/>
         </w:rPr>
       </w:r>
-      <w:r>
-        <w:rPr>
-          <w14:ligatures w14:val="none"/>
-        </w:rPr>
-      </w:r>
+      <w:r/>
     </w:p>
     <w:p>
       <w:pPr>
@@ -4370,10 +5822,7 @@
         </w:rPr>
       </w:pPr>
       <w:r>
-        <w:t xml:space="preserve">Comparar el tiempo de lectura secuencial vs aleatoria en un fichero con 10.000 </w:t>
-      </w:r>
-      <w:r>
-        <w:t xml:space="preserve">registros de tamaño fijo.</w:t>
+        <w:t xml:space="preserve">Leer un fichero CSV y cargar los datos en una lista de objetos.</w:t>
       </w:r>
       <w:r>
         <w:rPr>
@@ -4388,65 +5837,469 @@
     </w:p>
     <w:p>
       <w:pPr>
-        <w:pStyle w:val="855"/>
-        <w:spacing/>
-        <w:ind/>
-        <w:rPr>
-          <w14:ligatures w14:val="none"/>
-        </w:rPr>
-      </w:pPr>
-      <w:r>
-        <w:t xml:space="preserve">Crear un programa que permita insertar, modificar y eliminar registros en un fichero </w:t>
-      </w:r>
-      <w:r>
-        <w:t xml:space="preserve">binario con acceso aleatorio.</w:t>
-      </w:r>
-      <w:r>
-        <w:rPr>
-          <w14:ligatures w14:val="none"/>
-        </w:rPr>
-      </w:r>
-      <w:r>
-        <w:rPr>
-          <w14:ligatures w14:val="none"/>
+        <w:shd w:val="clear" w:color="191a1c" w:fill="191a1c"/>
+        <w:spacing/>
+        <w:ind w:right="0" w:firstLine="0" w:left="0"/>
+        <w:rPr>
+          <w:sz w:val="20"/>
+          <w:szCs w:val="18"/>
+        </w:rPr>
+      </w:pPr>
+      <w:r>
+        <w:rPr>
+          <w:rFonts w:ascii="Liberation Sans" w:hAnsi="Liberation Sans" w:eastAsia="Liberation Sans" w:cs="Liberation Sans"/>
+          <w:color w:val="cf8e6d"/>
+          <w:sz w:val="20"/>
+          <w:szCs w:val="18"/>
+        </w:rPr>
+        <w:t xml:space="preserve">public void </w:t>
+      </w:r>
+      <w:r>
+        <w:rPr>
+          <w:rFonts w:ascii="Liberation Sans" w:hAnsi="Liberation Sans" w:eastAsia="Liberation Sans" w:cs="Liberation Sans"/>
+          <w:color w:val="56a8f5"/>
+          <w:sz w:val="20"/>
+          <w:szCs w:val="18"/>
+        </w:rPr>
+        <w:t xml:space="preserve">ej2</w:t>
+      </w:r>
+      <w:r>
+        <w:rPr>
+          <w:rFonts w:ascii="Liberation Sans" w:hAnsi="Liberation Sans" w:eastAsia="Liberation Sans" w:cs="Liberation Sans"/>
+          <w:color w:val="bcbec4"/>
+          <w:sz w:val="20"/>
+          <w:szCs w:val="18"/>
+        </w:rPr>
+        <w:t xml:space="preserve">(String ruta){</w:t>
+        <w:br/>
+        <w:t xml:space="preserve">    System.</w:t>
+      </w:r>
+      <w:r>
+        <w:rPr>
+          <w:rFonts w:ascii="Liberation Sans" w:hAnsi="Liberation Sans" w:eastAsia="Liberation Sans" w:cs="Liberation Sans"/>
+          <w:i/>
+          <w:color w:val="c77dbb"/>
+          <w:sz w:val="20"/>
+          <w:szCs w:val="18"/>
+        </w:rPr>
+        <w:t xml:space="preserve">out</w:t>
+      </w:r>
+      <w:r>
+        <w:rPr>
+          <w:rFonts w:ascii="Liberation Sans" w:hAnsi="Liberation Sans" w:eastAsia="Liberation Sans" w:cs="Liberation Sans"/>
+          <w:color w:val="bcbec4"/>
+          <w:sz w:val="20"/>
+          <w:szCs w:val="18"/>
+        </w:rPr>
+        <w:t xml:space="preserve">.println(</w:t>
+      </w:r>
+      <w:r>
+        <w:rPr>
+          <w:rFonts w:ascii="Liberation Sans" w:hAnsi="Liberation Sans" w:eastAsia="Liberation Sans" w:cs="Liberation Sans"/>
+          <w:color w:val="6aab73"/>
+          <w:sz w:val="20"/>
+          <w:szCs w:val="18"/>
+        </w:rPr>
+        <w:t xml:space="preserve">"---- COMIENZO EJERCICIO 2 ----"</w:t>
+      </w:r>
+      <w:r>
+        <w:rPr>
+          <w:rFonts w:ascii="Liberation Sans" w:hAnsi="Liberation Sans" w:eastAsia="Liberation Sans" w:cs="Liberation Sans"/>
+          <w:color w:val="bcbec4"/>
+          <w:sz w:val="20"/>
+          <w:szCs w:val="18"/>
+        </w:rPr>
+        <w:t xml:space="preserve">);</w:t>
+        <w:br/>
+        <w:t xml:space="preserve">    ArrayList&lt;Persona&gt; personas = </w:t>
+      </w:r>
+      <w:r>
+        <w:rPr>
+          <w:rFonts w:ascii="Liberation Sans" w:hAnsi="Liberation Sans" w:eastAsia="Liberation Sans" w:cs="Liberation Sans"/>
+          <w:color w:val="cf8e6d"/>
+          <w:sz w:val="20"/>
+          <w:szCs w:val="18"/>
+        </w:rPr>
+        <w:t xml:space="preserve">new </w:t>
+      </w:r>
+      <w:r>
+        <w:rPr>
+          <w:rFonts w:ascii="Liberation Sans" w:hAnsi="Liberation Sans" w:eastAsia="Liberation Sans" w:cs="Liberation Sans"/>
+          <w:color w:val="bcbec4"/>
+          <w:sz w:val="20"/>
+          <w:szCs w:val="18"/>
+        </w:rPr>
+        <w:t xml:space="preserve">ArrayList&lt;&gt;();</w:t>
+        <w:br/>
+        <w:t xml:space="preserve">    Path dir = Paths.</w:t>
+      </w:r>
+      <w:r>
+        <w:rPr>
+          <w:rFonts w:ascii="Liberation Sans" w:hAnsi="Liberation Sans" w:eastAsia="Liberation Sans" w:cs="Liberation Sans"/>
+          <w:i/>
+          <w:color w:val="bcbec4"/>
+          <w:sz w:val="20"/>
+          <w:szCs w:val="18"/>
+        </w:rPr>
+        <w:t xml:space="preserve">get</w:t>
+      </w:r>
+      <w:r>
+        <w:rPr>
+          <w:rFonts w:ascii="Liberation Sans" w:hAnsi="Liberation Sans" w:eastAsia="Liberation Sans" w:cs="Liberation Sans"/>
+          <w:color w:val="bcbec4"/>
+          <w:sz w:val="20"/>
+          <w:szCs w:val="18"/>
+        </w:rPr>
+        <w:t xml:space="preserve">(ruta);</w:t>
+        <w:br/>
+        <w:t xml:space="preserve">    </w:t>
+      </w:r>
+      <w:r>
+        <w:rPr>
+          <w:rFonts w:ascii="Liberation Sans" w:hAnsi="Liberation Sans" w:eastAsia="Liberation Sans" w:cs="Liberation Sans"/>
+          <w:color w:val="cf8e6d"/>
+          <w:sz w:val="20"/>
+          <w:szCs w:val="18"/>
+        </w:rPr>
+        <w:t xml:space="preserve">try </w:t>
+      </w:r>
+      <w:r>
+        <w:rPr>
+          <w:rFonts w:ascii="Liberation Sans" w:hAnsi="Liberation Sans" w:eastAsia="Liberation Sans" w:cs="Liberation Sans"/>
+          <w:color w:val="bcbec4"/>
+          <w:sz w:val="20"/>
+          <w:szCs w:val="18"/>
+        </w:rPr>
+        <w:t xml:space="preserve">(BufferedReader br = Files.</w:t>
+      </w:r>
+      <w:r>
+        <w:rPr>
+          <w:rFonts w:ascii="Liberation Sans" w:hAnsi="Liberation Sans" w:eastAsia="Liberation Sans" w:cs="Liberation Sans"/>
+          <w:i/>
+          <w:color w:val="bcbec4"/>
+          <w:sz w:val="20"/>
+          <w:szCs w:val="18"/>
+        </w:rPr>
+        <w:t xml:space="preserve">newBufferedReader</w:t>
+      </w:r>
+      <w:r>
+        <w:rPr>
+          <w:rFonts w:ascii="Liberation Sans" w:hAnsi="Liberation Sans" w:eastAsia="Liberation Sans" w:cs="Liberation Sans"/>
+          <w:color w:val="bcbec4"/>
+          <w:sz w:val="20"/>
+          <w:szCs w:val="18"/>
+        </w:rPr>
+        <w:t xml:space="preserve">(dir)) {</w:t>
+        <w:br/>
+        <w:t xml:space="preserve">        </w:t>
+      </w:r>
+      <w:r>
+        <w:rPr>
+          <w:rFonts w:ascii="Liberation Sans" w:hAnsi="Liberation Sans" w:eastAsia="Liberation Sans" w:cs="Liberation Sans"/>
+          <w:color w:val="cf8e6d"/>
+          <w:sz w:val="20"/>
+          <w:szCs w:val="18"/>
+        </w:rPr>
+        <w:t xml:space="preserve">for </w:t>
+      </w:r>
+      <w:r>
+        <w:rPr>
+          <w:rFonts w:ascii="Liberation Sans" w:hAnsi="Liberation Sans" w:eastAsia="Liberation Sans" w:cs="Liberation Sans"/>
+          <w:color w:val="bcbec4"/>
+          <w:sz w:val="20"/>
+          <w:szCs w:val="18"/>
+        </w:rPr>
+        <w:t xml:space="preserve">(String linea : br.readAllLines()){</w:t>
+        <w:br/>
+        <w:t xml:space="preserve">            String[] registro = linea.split(</w:t>
+      </w:r>
+      <w:r>
+        <w:rPr>
+          <w:rFonts w:ascii="Liberation Sans" w:hAnsi="Liberation Sans" w:eastAsia="Liberation Sans" w:cs="Liberation Sans"/>
+          <w:color w:val="6aab73"/>
+          <w:sz w:val="20"/>
+          <w:szCs w:val="18"/>
+        </w:rPr>
+        <w:t xml:space="preserve">"</w:t>
+      </w:r>
+      <w:r>
+        <w:rPr>
+          <w:rFonts w:ascii="Liberation Sans" w:hAnsi="Liberation Sans" w:eastAsia="Liberation Sans" w:cs="Liberation Sans"/>
+          <w:color w:val="6aab73"/>
+          <w:sz w:val="20"/>
+          <w:szCs w:val="18"/>
+          <w:highlight w:val="none"/>
+        </w:rPr>
+        <w:t xml:space="preserve">,</w:t>
+      </w:r>
+      <w:r>
+        <w:rPr>
+          <w:rFonts w:ascii="Liberation Sans" w:hAnsi="Liberation Sans" w:eastAsia="Liberation Sans" w:cs="Liberation Sans"/>
+          <w:color w:val="6aab73"/>
+          <w:sz w:val="20"/>
+          <w:szCs w:val="18"/>
+        </w:rPr>
+        <w:t xml:space="preserve">"</w:t>
+      </w:r>
+      <w:r>
+        <w:rPr>
+          <w:rFonts w:ascii="Liberation Sans" w:hAnsi="Liberation Sans" w:eastAsia="Liberation Sans" w:cs="Liberation Sans"/>
+          <w:color w:val="bcbec4"/>
+          <w:sz w:val="20"/>
+          <w:szCs w:val="18"/>
+        </w:rPr>
+        <w:t xml:space="preserve">);</w:t>
+        <w:br/>
+        <w:t xml:space="preserve">            personas.add(</w:t>
+      </w:r>
+      <w:r>
+        <w:rPr>
+          <w:rFonts w:ascii="Liberation Sans" w:hAnsi="Liberation Sans" w:eastAsia="Liberation Sans" w:cs="Liberation Sans"/>
+          <w:color w:val="cf8e6d"/>
+          <w:sz w:val="20"/>
+          <w:szCs w:val="18"/>
+        </w:rPr>
+        <w:t xml:space="preserve">new </w:t>
+      </w:r>
+      <w:r>
+        <w:rPr>
+          <w:rFonts w:ascii="Liberation Sans" w:hAnsi="Liberation Sans" w:eastAsia="Liberation Sans" w:cs="Liberation Sans"/>
+          <w:color w:val="bcbec4"/>
+          <w:sz w:val="20"/>
+          <w:szCs w:val="18"/>
+        </w:rPr>
+        <w:t xml:space="preserve">Persona(registro[</w:t>
+      </w:r>
+      <w:r>
+        <w:rPr>
+          <w:rFonts w:ascii="Liberation Sans" w:hAnsi="Liberation Sans" w:eastAsia="Liberation Sans" w:cs="Liberation Sans"/>
+          <w:color w:val="2aacb8"/>
+          <w:sz w:val="20"/>
+          <w:szCs w:val="18"/>
+        </w:rPr>
+        <w:t xml:space="preserve">0</w:t>
+      </w:r>
+      <w:r>
+        <w:rPr>
+          <w:rFonts w:ascii="Liberation Sans" w:hAnsi="Liberation Sans" w:eastAsia="Liberation Sans" w:cs="Liberation Sans"/>
+          <w:color w:val="bcbec4"/>
+          <w:sz w:val="20"/>
+          <w:szCs w:val="18"/>
+        </w:rPr>
+        <w:t xml:space="preserve">],Integer.</w:t>
+      </w:r>
+      <w:r>
+        <w:rPr>
+          <w:rFonts w:ascii="Liberation Sans" w:hAnsi="Liberation Sans" w:eastAsia="Liberation Sans" w:cs="Liberation Sans"/>
+          <w:i/>
+          <w:color w:val="bcbec4"/>
+          <w:sz w:val="20"/>
+          <w:szCs w:val="18"/>
+        </w:rPr>
+        <w:t xml:space="preserve">parseInt</w:t>
+      </w:r>
+      <w:r>
+        <w:rPr>
+          <w:rFonts w:ascii="Liberation Sans" w:hAnsi="Liberation Sans" w:eastAsia="Liberation Sans" w:cs="Liberation Sans"/>
+          <w:color w:val="bcbec4"/>
+          <w:sz w:val="20"/>
+          <w:szCs w:val="18"/>
+        </w:rPr>
+        <w:t xml:space="preserve">(registro[</w:t>
+      </w:r>
+      <w:r>
+        <w:rPr>
+          <w:rFonts w:ascii="Liberation Sans" w:hAnsi="Liberation Sans" w:eastAsia="Liberation Sans" w:cs="Liberation Sans"/>
+          <w:color w:val="2aacb8"/>
+          <w:sz w:val="20"/>
+          <w:szCs w:val="18"/>
+        </w:rPr>
+        <w:t xml:space="preserve">1</w:t>
+      </w:r>
+      <w:r>
+        <w:rPr>
+          <w:rFonts w:ascii="Liberation Sans" w:hAnsi="Liberation Sans" w:eastAsia="Liberation Sans" w:cs="Liberation Sans"/>
+          <w:color w:val="bcbec4"/>
+          <w:sz w:val="20"/>
+          <w:szCs w:val="18"/>
+        </w:rPr>
+        <w:t xml:space="preserve">]),registro[</w:t>
+      </w:r>
+      <w:r>
+        <w:rPr>
+          <w:rFonts w:ascii="Liberation Sans" w:hAnsi="Liberation Sans" w:eastAsia="Liberation Sans" w:cs="Liberation Sans"/>
+          <w:color w:val="2aacb8"/>
+          <w:sz w:val="20"/>
+          <w:szCs w:val="18"/>
+        </w:rPr>
+        <w:t xml:space="preserve">2</w:t>
+      </w:r>
+      <w:r>
+        <w:rPr>
+          <w:rFonts w:ascii="Liberation Sans" w:hAnsi="Liberation Sans" w:eastAsia="Liberation Sans" w:cs="Liberation Sans"/>
+          <w:color w:val="bcbec4"/>
+          <w:sz w:val="20"/>
+          <w:szCs w:val="18"/>
+        </w:rPr>
+        <w:t xml:space="preserve">]));</w:t>
+        <w:br/>
+        <w:t xml:space="preserve">        }</w:t>
+        <w:br/>
+        <w:t xml:space="preserve">    } </w:t>
+      </w:r>
+      <w:r>
+        <w:rPr>
+          <w:rFonts w:ascii="Liberation Sans" w:hAnsi="Liberation Sans" w:eastAsia="Liberation Sans" w:cs="Liberation Sans"/>
+          <w:color w:val="cf8e6d"/>
+          <w:sz w:val="20"/>
+          <w:szCs w:val="18"/>
+        </w:rPr>
+        <w:t xml:space="preserve">catch </w:t>
+      </w:r>
+      <w:r>
+        <w:rPr>
+          <w:rFonts w:ascii="Liberation Sans" w:hAnsi="Liberation Sans" w:eastAsia="Liberation Sans" w:cs="Liberation Sans"/>
+          <w:color w:val="bcbec4"/>
+          <w:sz w:val="20"/>
+          <w:szCs w:val="18"/>
+        </w:rPr>
+        <w:t xml:space="preserve">(IOException e) {</w:t>
+        <w:br/>
+        <w:t xml:space="preserve">        </w:t>
+      </w:r>
+      <w:r>
+        <w:rPr>
+          <w:rFonts w:ascii="Liberation Sans" w:hAnsi="Liberation Sans" w:eastAsia="Liberation Sans" w:cs="Liberation Sans"/>
+          <w:color w:val="cf8e6d"/>
+          <w:sz w:val="20"/>
+          <w:szCs w:val="18"/>
+        </w:rPr>
+        <w:t xml:space="preserve">throw new </w:t>
+      </w:r>
+      <w:r>
+        <w:rPr>
+          <w:rFonts w:ascii="Liberation Sans" w:hAnsi="Liberation Sans" w:eastAsia="Liberation Sans" w:cs="Liberation Sans"/>
+          <w:color w:val="bcbec4"/>
+          <w:sz w:val="20"/>
+          <w:szCs w:val="18"/>
+        </w:rPr>
+        <w:t xml:space="preserve">RuntimeException(e);</w:t>
+        <w:br/>
+        <w:t xml:space="preserve">    }</w:t>
+        <w:br/>
+        <w:t xml:space="preserve">    System.</w:t>
+      </w:r>
+      <w:r>
+        <w:rPr>
+          <w:rFonts w:ascii="Liberation Sans" w:hAnsi="Liberation Sans" w:eastAsia="Liberation Sans" w:cs="Liberation Sans"/>
+          <w:i/>
+          <w:color w:val="c77dbb"/>
+          <w:sz w:val="20"/>
+          <w:szCs w:val="18"/>
+        </w:rPr>
+        <w:t xml:space="preserve">out</w:t>
+      </w:r>
+      <w:r>
+        <w:rPr>
+          <w:rFonts w:ascii="Liberation Sans" w:hAnsi="Liberation Sans" w:eastAsia="Liberation Sans" w:cs="Liberation Sans"/>
+          <w:color w:val="bcbec4"/>
+          <w:sz w:val="20"/>
+          <w:szCs w:val="18"/>
+        </w:rPr>
+        <w:t xml:space="preserve">.println(</w:t>
+      </w:r>
+      <w:r>
+        <w:rPr>
+          <w:rFonts w:ascii="Liberation Sans" w:hAnsi="Liberation Sans" w:eastAsia="Liberation Sans" w:cs="Liberation Sans"/>
+          <w:color w:val="6aab73"/>
+          <w:sz w:val="20"/>
+          <w:szCs w:val="18"/>
+        </w:rPr>
+        <w:t xml:space="preserve">"----- FIN DE EJERCICIO 2 -----</w:t>
+      </w:r>
+      <w:r>
+        <w:rPr>
+          <w:rFonts w:ascii="Liberation Sans" w:hAnsi="Liberation Sans" w:eastAsia="Liberation Sans" w:cs="Liberation Sans"/>
+          <w:color w:val="cf8e6d"/>
+          <w:sz w:val="20"/>
+          <w:szCs w:val="18"/>
+        </w:rPr>
+        <w:t xml:space="preserve">\n</w:t>
+      </w:r>
+      <w:r>
+        <w:rPr>
+          <w:rFonts w:ascii="Liberation Sans" w:hAnsi="Liberation Sans" w:eastAsia="Liberation Sans" w:cs="Liberation Sans"/>
+          <w:color w:val="6aab73"/>
+          <w:sz w:val="20"/>
+          <w:szCs w:val="18"/>
+        </w:rPr>
+        <w:t xml:space="preserve">"</w:t>
+      </w:r>
+      <w:r>
+        <w:rPr>
+          <w:rFonts w:ascii="Liberation Sans" w:hAnsi="Liberation Sans" w:eastAsia="Liberation Sans" w:cs="Liberation Sans"/>
+          <w:color w:val="bcbec4"/>
+          <w:sz w:val="20"/>
+          <w:szCs w:val="18"/>
+        </w:rPr>
+        <w:t xml:space="preserve">);</w:t>
+        <w:br/>
+        <w:t xml:space="preserve">}</w:t>
+      </w:r>
+      <w:r>
+        <w:rPr>
+          <w:sz w:val="18"/>
+          <w:szCs w:val="18"/>
         </w:rPr>
       </w:r>
     </w:p>
     <w:p>
       <w:pPr>
-        <w:pStyle w:val="855"/>
-        <w:spacing/>
-        <w:ind/>
+        <w:spacing/>
+        <w:ind/>
+        <w:rPr/>
+      </w:pPr>
+      <w:r>
         <w:rPr>
           <w14:ligatures w14:val="none"/>
         </w:rPr>
-      </w:pPr>
-      <w:r>
-        <w:t xml:space="preserve">Escribir un índice con las posiciones de los registros en un fichero para acceder a ellos </w:t>
-      </w:r>
-      <w:r>
-        <w:t xml:space="preserve">más rápidamente.</w:t>
-      </w:r>
-      <w:r>
-        <w:rPr>
-          <w:highlight w:val="none"/>
-        </w:rPr>
-        <w:br w:type="page" w:clear="all"/>
       </w:r>
       <w:r>
         <w:rPr>
           <w14:ligatures w14:val="none"/>
         </w:rPr>
       </w:r>
-      <w:r>
-        <w:rPr>
-          <w14:ligatures w14:val="none"/>
-        </w:rPr>
-      </w:r>
+      <w:r/>
     </w:p>
     <w:p>
       <w:pPr>
-        <w:pStyle w:val="851"/>
+        <w:shd w:val="nil" w:color="ffffff"/>
+        <w:spacing/>
+        <w:ind/>
+        <w:rPr>
+          <w14:ligatures w14:val="none"/>
+        </w:rPr>
+      </w:pPr>
+      <w:r>
+        <w:rPr>
+          <w:highlight w:val="none"/>
+        </w:rPr>
+        <w:br w:type="page" w:clear="all"/>
+      </w:r>
+      <w:r>
+        <w:rPr>
+          <w:highlight w:val="none"/>
+        </w:rPr>
+      </w:r>
+      <w:r>
+        <w:rPr>
+          <w:highlight w:val="none"/>
+        </w:rPr>
+      </w:r>
+    </w:p>
+    <w:p>
+      <w:pPr>
+        <w:pStyle w:val="855"/>
         <w:spacing/>
         <w:ind/>
         <w:rPr>
@@ -4454,48 +6307,891 @@
           <w14:ligatures w14:val="none"/>
         </w:rPr>
       </w:pPr>
+      <w:r>
+        <w:t xml:space="preserve">Leer datos binarios y convertirlos a un formato legible en consola.</w:t>
+      </w:r>
+      <w:r>
+        <w:rPr>
+          <w14:ligatures w14:val="none"/>
+        </w:rPr>
+      </w:r>
+      <w:r>
+        <w:rPr>
+          <w14:ligatures w14:val="none"/>
+        </w:rPr>
+      </w:r>
+    </w:p>
+    <w:p>
+      <w:pPr>
+        <w:shd w:val="clear" w:color="191a1c" w:fill="191a1c"/>
+        <w:spacing/>
+        <w:ind w:right="0" w:firstLine="0" w:left="0"/>
+        <w:rPr>
+          <w:sz w:val="20"/>
+          <w:szCs w:val="18"/>
+        </w:rPr>
+      </w:pPr>
+      <w:r>
+        <w:rPr>
+          <w:rFonts w:ascii="Liberation Sans" w:hAnsi="Liberation Sans" w:eastAsia="Liberation Sans" w:cs="Liberation Sans"/>
+          <w:color w:val="cf8e6d"/>
+          <w:sz w:val="20"/>
+          <w:szCs w:val="18"/>
+        </w:rPr>
+        <w:t xml:space="preserve">public static void </w:t>
+      </w:r>
+      <w:r>
+        <w:rPr>
+          <w:rFonts w:ascii="Liberation Sans" w:hAnsi="Liberation Sans" w:eastAsia="Liberation Sans" w:cs="Liberation Sans"/>
+          <w:color w:val="56a8f5"/>
+          <w:sz w:val="20"/>
+          <w:szCs w:val="18"/>
+        </w:rPr>
+        <w:t xml:space="preserve">ej3</w:t>
+      </w:r>
+      <w:r>
+        <w:rPr>
+          <w:rFonts w:ascii="Liberation Sans" w:hAnsi="Liberation Sans" w:eastAsia="Liberation Sans" w:cs="Liberation Sans"/>
+          <w:color w:val="bcbec4"/>
+          <w:sz w:val="20"/>
+          <w:szCs w:val="18"/>
+        </w:rPr>
+        <w:t xml:space="preserve">(String ruta){</w:t>
+        <w:br/>
+        <w:t xml:space="preserve">    System.</w:t>
+      </w:r>
+      <w:r>
+        <w:rPr>
+          <w:rFonts w:ascii="Liberation Sans" w:hAnsi="Liberation Sans" w:eastAsia="Liberation Sans" w:cs="Liberation Sans"/>
+          <w:i/>
+          <w:color w:val="c77dbb"/>
+          <w:sz w:val="20"/>
+          <w:szCs w:val="18"/>
+        </w:rPr>
+        <w:t xml:space="preserve">out</w:t>
+      </w:r>
+      <w:r>
+        <w:rPr>
+          <w:rFonts w:ascii="Liberation Sans" w:hAnsi="Liberation Sans" w:eastAsia="Liberation Sans" w:cs="Liberation Sans"/>
+          <w:color w:val="bcbec4"/>
+          <w:sz w:val="20"/>
+          <w:szCs w:val="18"/>
+        </w:rPr>
+        <w:t xml:space="preserve">.println(</w:t>
+      </w:r>
+      <w:r>
+        <w:rPr>
+          <w:rFonts w:ascii="Liberation Sans" w:hAnsi="Liberation Sans" w:eastAsia="Liberation Sans" w:cs="Liberation Sans"/>
+          <w:color w:val="6aab73"/>
+          <w:sz w:val="20"/>
+          <w:szCs w:val="18"/>
+        </w:rPr>
+        <w:t xml:space="preserve">"---- COMIENZO EJERCICIO 3 ----"</w:t>
+      </w:r>
+      <w:r>
+        <w:rPr>
+          <w:rFonts w:ascii="Liberation Sans" w:hAnsi="Liberation Sans" w:eastAsia="Liberation Sans" w:cs="Liberation Sans"/>
+          <w:color w:val="bcbec4"/>
+          <w:sz w:val="20"/>
+          <w:szCs w:val="18"/>
+        </w:rPr>
+        <w:t xml:space="preserve">);</w:t>
+        <w:br/>
+        <w:t xml:space="preserve">    Path dir = Paths.</w:t>
+      </w:r>
+      <w:r>
+        <w:rPr>
+          <w:rFonts w:ascii="Liberation Sans" w:hAnsi="Liberation Sans" w:eastAsia="Liberation Sans" w:cs="Liberation Sans"/>
+          <w:i/>
+          <w:color w:val="bcbec4"/>
+          <w:sz w:val="20"/>
+          <w:szCs w:val="18"/>
+        </w:rPr>
+        <w:t xml:space="preserve">get</w:t>
+      </w:r>
+      <w:r>
+        <w:rPr>
+          <w:rFonts w:ascii="Liberation Sans" w:hAnsi="Liberation Sans" w:eastAsia="Liberation Sans" w:cs="Liberation Sans"/>
+          <w:color w:val="bcbec4"/>
+          <w:sz w:val="20"/>
+          <w:szCs w:val="18"/>
+        </w:rPr>
+        <w:t xml:space="preserve">(ruta);</w:t>
+        <w:br/>
+        <w:t xml:space="preserve">    </w:t>
+      </w:r>
+      <w:r>
+        <w:rPr>
+          <w:rFonts w:ascii="Liberation Sans" w:hAnsi="Liberation Sans" w:eastAsia="Liberation Sans" w:cs="Liberation Sans"/>
+          <w:color w:val="cf8e6d"/>
+          <w:sz w:val="20"/>
+          <w:szCs w:val="18"/>
+        </w:rPr>
+        <w:t xml:space="preserve">try</w:t>
+      </w:r>
+      <w:r>
+        <w:rPr>
+          <w:rFonts w:ascii="Liberation Sans" w:hAnsi="Liberation Sans" w:eastAsia="Liberation Sans" w:cs="Liberation Sans"/>
+          <w:color w:val="bcbec4"/>
+          <w:sz w:val="20"/>
+          <w:szCs w:val="18"/>
+        </w:rPr>
+        <w:t xml:space="preserve">(ObjectInputStream ois = </w:t>
+      </w:r>
+      <w:r>
+        <w:rPr>
+          <w:rFonts w:ascii="Liberation Sans" w:hAnsi="Liberation Sans" w:eastAsia="Liberation Sans" w:cs="Liberation Sans"/>
+          <w:color w:val="cf8e6d"/>
+          <w:sz w:val="20"/>
+          <w:szCs w:val="18"/>
+        </w:rPr>
+        <w:t xml:space="preserve">new </w:t>
+      </w:r>
+      <w:r>
+        <w:rPr>
+          <w:rFonts w:ascii="Liberation Sans" w:hAnsi="Liberation Sans" w:eastAsia="Liberation Sans" w:cs="Liberation Sans"/>
+          <w:color w:val="bcbec4"/>
+          <w:sz w:val="20"/>
+          <w:szCs w:val="18"/>
+        </w:rPr>
+        <w:t xml:space="preserve">ObjectInputStream(</w:t>
+      </w:r>
+      <w:r>
+        <w:rPr>
+          <w:rFonts w:ascii="Liberation Sans" w:hAnsi="Liberation Sans" w:eastAsia="Liberation Sans" w:cs="Liberation Sans"/>
+          <w:color w:val="cf8e6d"/>
+          <w:sz w:val="20"/>
+          <w:szCs w:val="18"/>
+        </w:rPr>
+        <w:t xml:space="preserve">new </w:t>
+      </w:r>
+      <w:r>
+        <w:rPr>
+          <w:rFonts w:ascii="Liberation Sans" w:hAnsi="Liberation Sans" w:eastAsia="Liberation Sans" w:cs="Liberation Sans"/>
+          <w:color w:val="bcbec4"/>
+          <w:sz w:val="20"/>
+          <w:szCs w:val="18"/>
+        </w:rPr>
+        <w:t xml:space="preserve">FileInputStream(dir.toFile()));) {</w:t>
+        <w:br/>
+        <w:t xml:space="preserve">        </w:t>
+      </w:r>
+      <w:r>
+        <w:rPr>
+          <w:rFonts w:ascii="Liberation Sans" w:hAnsi="Liberation Sans" w:eastAsia="Liberation Sans" w:cs="Liberation Sans"/>
+          <w:color w:val="cf8e6d"/>
+          <w:sz w:val="20"/>
+          <w:szCs w:val="18"/>
+        </w:rPr>
+        <w:t xml:space="preserve">while </w:t>
+      </w:r>
+      <w:r>
+        <w:rPr>
+          <w:rFonts w:ascii="Liberation Sans" w:hAnsi="Liberation Sans" w:eastAsia="Liberation Sans" w:cs="Liberation Sans"/>
+          <w:color w:val="bcbec4"/>
+          <w:sz w:val="20"/>
+          <w:szCs w:val="18"/>
+        </w:rPr>
+        <w:t xml:space="preserve">(</w:t>
+      </w:r>
+      <w:r>
+        <w:rPr>
+          <w:rFonts w:ascii="Liberation Sans" w:hAnsi="Liberation Sans" w:eastAsia="Liberation Sans" w:cs="Liberation Sans"/>
+          <w:color w:val="cf8e6d"/>
+          <w:sz w:val="20"/>
+          <w:szCs w:val="18"/>
+        </w:rPr>
+        <w:t xml:space="preserve">true</w:t>
+      </w:r>
+      <w:r>
+        <w:rPr>
+          <w:rFonts w:ascii="Liberation Sans" w:hAnsi="Liberation Sans" w:eastAsia="Liberation Sans" w:cs="Liberation Sans"/>
+          <w:color w:val="bcbec4"/>
+          <w:sz w:val="20"/>
+          <w:szCs w:val="18"/>
+        </w:rPr>
+        <w:t xml:space="preserve">) {</w:t>
+        <w:br/>
+        <w:t xml:space="preserve">            Persona p = (Persona) ois.readObject();</w:t>
+        <w:br/>
+        <w:t xml:space="preserve">            System.</w:t>
+      </w:r>
+      <w:r>
+        <w:rPr>
+          <w:rFonts w:ascii="Liberation Sans" w:hAnsi="Liberation Sans" w:eastAsia="Liberation Sans" w:cs="Liberation Sans"/>
+          <w:i/>
+          <w:color w:val="c77dbb"/>
+          <w:sz w:val="20"/>
+          <w:szCs w:val="18"/>
+        </w:rPr>
+        <w:t xml:space="preserve">out</w:t>
+      </w:r>
+      <w:r>
+        <w:rPr>
+          <w:rFonts w:ascii="Liberation Sans" w:hAnsi="Liberation Sans" w:eastAsia="Liberation Sans" w:cs="Liberation Sans"/>
+          <w:color w:val="bcbec4"/>
+          <w:sz w:val="20"/>
+          <w:szCs w:val="18"/>
+        </w:rPr>
+        <w:t xml:space="preserve">.println(p);</w:t>
+        <w:br/>
+        <w:t xml:space="preserve">        }</w:t>
+        <w:br/>
+        <w:t xml:space="preserve">    } </w:t>
+      </w:r>
+      <w:r>
+        <w:rPr>
+          <w:rFonts w:ascii="Liberation Sans" w:hAnsi="Liberation Sans" w:eastAsia="Liberation Sans" w:cs="Liberation Sans"/>
+          <w:color w:val="cf8e6d"/>
+          <w:sz w:val="20"/>
+          <w:szCs w:val="18"/>
+        </w:rPr>
+        <w:t xml:space="preserve">catch </w:t>
+      </w:r>
+      <w:r>
+        <w:rPr>
+          <w:rFonts w:ascii="Liberation Sans" w:hAnsi="Liberation Sans" w:eastAsia="Liberation Sans" w:cs="Liberation Sans"/>
+          <w:color w:val="bcbec4"/>
+          <w:sz w:val="20"/>
+          <w:szCs w:val="18"/>
+        </w:rPr>
+        <w:t xml:space="preserve">(EOFException e) {</w:t>
+        <w:br/>
+        <w:t xml:space="preserve">    } </w:t>
+      </w:r>
+      <w:r>
+        <w:rPr>
+          <w:rFonts w:ascii="Liberation Sans" w:hAnsi="Liberation Sans" w:eastAsia="Liberation Sans" w:cs="Liberation Sans"/>
+          <w:color w:val="cf8e6d"/>
+          <w:sz w:val="20"/>
+          <w:szCs w:val="18"/>
+        </w:rPr>
+        <w:t xml:space="preserve">catch </w:t>
+      </w:r>
+      <w:r>
+        <w:rPr>
+          <w:rFonts w:ascii="Liberation Sans" w:hAnsi="Liberation Sans" w:eastAsia="Liberation Sans" w:cs="Liberation Sans"/>
+          <w:color w:val="bcbec4"/>
+          <w:sz w:val="20"/>
+          <w:szCs w:val="18"/>
+        </w:rPr>
+        <w:t xml:space="preserve">(IOException e) {</w:t>
+        <w:br/>
+        <w:t xml:space="preserve">        </w:t>
+      </w:r>
+      <w:r>
+        <w:rPr>
+          <w:rFonts w:ascii="Liberation Sans" w:hAnsi="Liberation Sans" w:eastAsia="Liberation Sans" w:cs="Liberation Sans"/>
+          <w:color w:val="cf8e6d"/>
+          <w:sz w:val="20"/>
+          <w:szCs w:val="18"/>
+        </w:rPr>
+        <w:t xml:space="preserve">throw new </w:t>
+      </w:r>
+      <w:r>
+        <w:rPr>
+          <w:rFonts w:ascii="Liberation Sans" w:hAnsi="Liberation Sans" w:eastAsia="Liberation Sans" w:cs="Liberation Sans"/>
+          <w:color w:val="bcbec4"/>
+          <w:sz w:val="20"/>
+          <w:szCs w:val="18"/>
+        </w:rPr>
+        <w:t xml:space="preserve">RuntimeException(e);</w:t>
+        <w:br/>
+        <w:t xml:space="preserve">    } </w:t>
+      </w:r>
+      <w:r>
+        <w:rPr>
+          <w:rFonts w:ascii="Liberation Sans" w:hAnsi="Liberation Sans" w:eastAsia="Liberation Sans" w:cs="Liberation Sans"/>
+          <w:color w:val="cf8e6d"/>
+          <w:sz w:val="20"/>
+          <w:szCs w:val="18"/>
+        </w:rPr>
+        <w:t xml:space="preserve">catch </w:t>
+      </w:r>
+      <w:r>
+        <w:rPr>
+          <w:rFonts w:ascii="Liberation Sans" w:hAnsi="Liberation Sans" w:eastAsia="Liberation Sans" w:cs="Liberation Sans"/>
+          <w:color w:val="bcbec4"/>
+          <w:sz w:val="20"/>
+          <w:szCs w:val="18"/>
+        </w:rPr>
+        <w:t xml:space="preserve">(ClassNotFoundException e) {</w:t>
+        <w:br/>
+        <w:t xml:space="preserve">        </w:t>
+      </w:r>
+      <w:r>
+        <w:rPr>
+          <w:rFonts w:ascii="Liberation Sans" w:hAnsi="Liberation Sans" w:eastAsia="Liberation Sans" w:cs="Liberation Sans"/>
+          <w:color w:val="cf8e6d"/>
+          <w:sz w:val="20"/>
+          <w:szCs w:val="18"/>
+        </w:rPr>
+        <w:t xml:space="preserve">throw new </w:t>
+      </w:r>
+      <w:r>
+        <w:rPr>
+          <w:rFonts w:ascii="Liberation Sans" w:hAnsi="Liberation Sans" w:eastAsia="Liberation Sans" w:cs="Liberation Sans"/>
+          <w:color w:val="bcbec4"/>
+          <w:sz w:val="20"/>
+          <w:szCs w:val="18"/>
+        </w:rPr>
+        <w:t xml:space="preserve">RuntimeException(e);</w:t>
+        <w:br/>
+        <w:t xml:space="preserve">    }</w:t>
+        <w:br/>
+        <w:t xml:space="preserve">    System.</w:t>
+      </w:r>
+      <w:r>
+        <w:rPr>
+          <w:rFonts w:ascii="Liberation Sans" w:hAnsi="Liberation Sans" w:eastAsia="Liberation Sans" w:cs="Liberation Sans"/>
+          <w:i/>
+          <w:color w:val="c77dbb"/>
+          <w:sz w:val="20"/>
+          <w:szCs w:val="18"/>
+        </w:rPr>
+        <w:t xml:space="preserve">out</w:t>
+      </w:r>
+      <w:r>
+        <w:rPr>
+          <w:rFonts w:ascii="Liberation Sans" w:hAnsi="Liberation Sans" w:eastAsia="Liberation Sans" w:cs="Liberation Sans"/>
+          <w:color w:val="bcbec4"/>
+          <w:sz w:val="20"/>
+          <w:szCs w:val="18"/>
+        </w:rPr>
+        <w:t xml:space="preserve">.println(</w:t>
+      </w:r>
+      <w:r>
+        <w:rPr>
+          <w:rFonts w:ascii="Liberation Sans" w:hAnsi="Liberation Sans" w:eastAsia="Liberation Sans" w:cs="Liberation Sans"/>
+          <w:color w:val="6aab73"/>
+          <w:sz w:val="20"/>
+          <w:szCs w:val="18"/>
+        </w:rPr>
+        <w:t xml:space="preserve">"----- FIN DE EJERCICIO 3 -----</w:t>
+      </w:r>
+      <w:r>
+        <w:rPr>
+          <w:rFonts w:ascii="Liberation Sans" w:hAnsi="Liberation Sans" w:eastAsia="Liberation Sans" w:cs="Liberation Sans"/>
+          <w:color w:val="cf8e6d"/>
+          <w:sz w:val="20"/>
+          <w:szCs w:val="18"/>
+        </w:rPr>
+        <w:t xml:space="preserve">\n</w:t>
+      </w:r>
+      <w:r>
+        <w:rPr>
+          <w:rFonts w:ascii="Liberation Sans" w:hAnsi="Liberation Sans" w:eastAsia="Liberation Sans" w:cs="Liberation Sans"/>
+          <w:color w:val="6aab73"/>
+          <w:sz w:val="20"/>
+          <w:szCs w:val="18"/>
+        </w:rPr>
+        <w:t xml:space="preserve">"</w:t>
+      </w:r>
+      <w:r>
+        <w:rPr>
+          <w:rFonts w:ascii="Liberation Sans" w:hAnsi="Liberation Sans" w:eastAsia="Liberation Sans" w:cs="Liberation Sans"/>
+          <w:color w:val="bcbec4"/>
+          <w:sz w:val="20"/>
+          <w:szCs w:val="18"/>
+        </w:rPr>
+        <w:t xml:space="preserve">);</w:t>
+        <w:br/>
+        <w:t xml:space="preserve">}</w:t>
+      </w:r>
+      <w:r>
+        <w:rPr>
+          <w:sz w:val="18"/>
+          <w:szCs w:val="18"/>
+        </w:rPr>
+      </w:r>
+    </w:p>
+    <w:p>
+      <w:pPr>
+        <w:spacing/>
+        <w:ind/>
+        <w:rPr/>
+      </w:pPr>
+      <w:r>
+        <w:rPr>
+          <w14:ligatures w14:val="none"/>
+        </w:rPr>
+      </w:r>
+      <w:r>
+        <w:rPr>
+          <w14:ligatures w14:val="none"/>
+        </w:rPr>
+      </w:r>
       <w:r/>
-      <w:bookmarkStart w:id="3" w:name="_Toc3"/>
-      <w:r>
-        <w:t xml:space="preserve">Recuperar información almacenada en ficheros</w:t>
-      </w:r>
-      <w:bookmarkEnd w:id="3"/>
-      <w:r>
+    </w:p>
+    <w:p>
+      <w:pPr>
+        <w:pStyle w:val="855"/>
+        <w:spacing/>
+        <w:ind/>
         <w:rPr>
           <w:highlight w:val="none"/>
           <w14:ligatures w14:val="none"/>
         </w:rPr>
+      </w:pPr>
+      <w:r>
+        <w:t xml:space="preserve">Leer un fichero de objetos serializados y mostrarlos ordenados por uno de sus </w:t>
+      </w:r>
+      <w:r>
+        <w:t xml:space="preserve">atributos.</w:t>
       </w:r>
       <w:r>
         <w:rPr>
           <w:highlight w:val="none"/>
+        </w:rPr>
+      </w:r>
+      <w:r>
+        <w:rPr>
           <w14:ligatures w14:val="none"/>
         </w:rPr>
       </w:r>
     </w:p>
     <w:p>
       <w:pPr>
-        <w:pStyle w:val="855"/>
-        <w:spacing/>
-        <w:ind/>
-        <w:rPr>
-          <w14:ligatures w14:val="none"/>
-        </w:rPr>
-      </w:pPr>
-      <w:r>
-        <w:t xml:space="preserve">Leer un fichero de texto con datos de usuarios (nombre, edad, correo) y mostrarlos por </w:t>
-      </w:r>
-      <w:r>
-        <w:t xml:space="preserve">consola.</w:t>
-      </w:r>
-      <w:r>
-        <w:rPr>
-          <w14:ligatures w14:val="none"/>
-        </w:rPr>
-      </w:r>
-      <w:r>
-        <w:rPr>
-          <w14:ligatures w14:val="none"/>
+        <w:shd w:val="clear" w:color="191a1c" w:fill="191a1c"/>
+        <w:spacing/>
+        <w:ind w:right="0" w:firstLine="0" w:left="0"/>
+        <w:rPr>
+          <w:sz w:val="20"/>
+          <w:szCs w:val="18"/>
+        </w:rPr>
+      </w:pPr>
+      <w:r>
+        <w:rPr>
+          <w:rFonts w:ascii="Liberation Sans" w:hAnsi="Liberation Sans" w:eastAsia="Liberation Sans" w:cs="Liberation Sans"/>
+          <w:color w:val="cf8e6d"/>
+          <w:sz w:val="20"/>
+          <w:szCs w:val="18"/>
+        </w:rPr>
+        <w:t xml:space="preserve">public static void </w:t>
+      </w:r>
+      <w:r>
+        <w:rPr>
+          <w:rFonts w:ascii="Liberation Sans" w:hAnsi="Liberation Sans" w:eastAsia="Liberation Sans" w:cs="Liberation Sans"/>
+          <w:color w:val="56a8f5"/>
+          <w:sz w:val="20"/>
+          <w:szCs w:val="18"/>
+        </w:rPr>
+        <w:t xml:space="preserve">ej4</w:t>
+      </w:r>
+      <w:r>
+        <w:rPr>
+          <w:rFonts w:ascii="Liberation Sans" w:hAnsi="Liberation Sans" w:eastAsia="Liberation Sans" w:cs="Liberation Sans"/>
+          <w:color w:val="bcbec4"/>
+          <w:sz w:val="20"/>
+          <w:szCs w:val="18"/>
+        </w:rPr>
+        <w:t xml:space="preserve">(String ruta){</w:t>
+        <w:br/>
+        <w:t xml:space="preserve">    System.</w:t>
+      </w:r>
+      <w:r>
+        <w:rPr>
+          <w:rFonts w:ascii="Liberation Sans" w:hAnsi="Liberation Sans" w:eastAsia="Liberation Sans" w:cs="Liberation Sans"/>
+          <w:i/>
+          <w:color w:val="c77dbb"/>
+          <w:sz w:val="20"/>
+          <w:szCs w:val="18"/>
+        </w:rPr>
+        <w:t xml:space="preserve">out</w:t>
+      </w:r>
+      <w:r>
+        <w:rPr>
+          <w:rFonts w:ascii="Liberation Sans" w:hAnsi="Liberation Sans" w:eastAsia="Liberation Sans" w:cs="Liberation Sans"/>
+          <w:color w:val="bcbec4"/>
+          <w:sz w:val="20"/>
+          <w:szCs w:val="18"/>
+        </w:rPr>
+        <w:t xml:space="preserve">.println(</w:t>
+      </w:r>
+      <w:r>
+        <w:rPr>
+          <w:rFonts w:ascii="Liberation Sans" w:hAnsi="Liberation Sans" w:eastAsia="Liberation Sans" w:cs="Liberation Sans"/>
+          <w:color w:val="6aab73"/>
+          <w:sz w:val="20"/>
+          <w:szCs w:val="18"/>
+        </w:rPr>
+        <w:t xml:space="preserve">"---- COMIENZO EJERCICIO 4 ----"</w:t>
+      </w:r>
+      <w:r>
+        <w:rPr>
+          <w:rFonts w:ascii="Liberation Sans" w:hAnsi="Liberation Sans" w:eastAsia="Liberation Sans" w:cs="Liberation Sans"/>
+          <w:color w:val="bcbec4"/>
+          <w:sz w:val="20"/>
+          <w:szCs w:val="18"/>
+        </w:rPr>
+        <w:t xml:space="preserve">);</w:t>
+        <w:br/>
+        <w:t xml:space="preserve">    Path dir = Paths.</w:t>
+      </w:r>
+      <w:r>
+        <w:rPr>
+          <w:rFonts w:ascii="Liberation Sans" w:hAnsi="Liberation Sans" w:eastAsia="Liberation Sans" w:cs="Liberation Sans"/>
+          <w:i/>
+          <w:color w:val="bcbec4"/>
+          <w:sz w:val="20"/>
+          <w:szCs w:val="18"/>
+        </w:rPr>
+        <w:t xml:space="preserve">get</w:t>
+      </w:r>
+      <w:r>
+        <w:rPr>
+          <w:rFonts w:ascii="Liberation Sans" w:hAnsi="Liberation Sans" w:eastAsia="Liberation Sans" w:cs="Liberation Sans"/>
+          <w:color w:val="bcbec4"/>
+          <w:sz w:val="20"/>
+          <w:szCs w:val="18"/>
+        </w:rPr>
+        <w:t xml:space="preserve">(ruta);</w:t>
+        <w:br/>
+        <w:t xml:space="preserve">    ArrayList&lt;Persona&gt; personas = </w:t>
+      </w:r>
+      <w:r>
+        <w:rPr>
+          <w:rFonts w:ascii="Liberation Sans" w:hAnsi="Liberation Sans" w:eastAsia="Liberation Sans" w:cs="Liberation Sans"/>
+          <w:color w:val="cf8e6d"/>
+          <w:sz w:val="20"/>
+          <w:szCs w:val="18"/>
+        </w:rPr>
+        <w:t xml:space="preserve">new </w:t>
+      </w:r>
+      <w:r>
+        <w:rPr>
+          <w:rFonts w:ascii="Liberation Sans" w:hAnsi="Liberation Sans" w:eastAsia="Liberation Sans" w:cs="Liberation Sans"/>
+          <w:color w:val="bcbec4"/>
+          <w:sz w:val="20"/>
+          <w:szCs w:val="18"/>
+        </w:rPr>
+        <w:t xml:space="preserve">ArrayList&lt;&gt;();</w:t>
+        <w:br/>
+        <w:t xml:space="preserve">    </w:t>
+      </w:r>
+      <w:r>
+        <w:rPr>
+          <w:rFonts w:ascii="Liberation Sans" w:hAnsi="Liberation Sans" w:eastAsia="Liberation Sans" w:cs="Liberation Sans"/>
+          <w:color w:val="cf8e6d"/>
+          <w:sz w:val="20"/>
+          <w:szCs w:val="18"/>
+        </w:rPr>
+        <w:t xml:space="preserve">try</w:t>
+      </w:r>
+      <w:r>
+        <w:rPr>
+          <w:rFonts w:ascii="Liberation Sans" w:hAnsi="Liberation Sans" w:eastAsia="Liberation Sans" w:cs="Liberation Sans"/>
+          <w:color w:val="bcbec4"/>
+          <w:sz w:val="20"/>
+          <w:szCs w:val="18"/>
+        </w:rPr>
+        <w:t xml:space="preserve">(ObjectInputStream ois = </w:t>
+      </w:r>
+      <w:r>
+        <w:rPr>
+          <w:rFonts w:ascii="Liberation Sans" w:hAnsi="Liberation Sans" w:eastAsia="Liberation Sans" w:cs="Liberation Sans"/>
+          <w:color w:val="cf8e6d"/>
+          <w:sz w:val="20"/>
+          <w:szCs w:val="18"/>
+        </w:rPr>
+        <w:t xml:space="preserve">new </w:t>
+      </w:r>
+      <w:r>
+        <w:rPr>
+          <w:rFonts w:ascii="Liberation Sans" w:hAnsi="Liberation Sans" w:eastAsia="Liberation Sans" w:cs="Liberation Sans"/>
+          <w:color w:val="bcbec4"/>
+          <w:sz w:val="20"/>
+          <w:szCs w:val="18"/>
+        </w:rPr>
+        <w:t xml:space="preserve">ObjectInputStream(</w:t>
+      </w:r>
+      <w:r>
+        <w:rPr>
+          <w:rFonts w:ascii="Liberation Sans" w:hAnsi="Liberation Sans" w:eastAsia="Liberation Sans" w:cs="Liberation Sans"/>
+          <w:color w:val="cf8e6d"/>
+          <w:sz w:val="20"/>
+          <w:szCs w:val="18"/>
+        </w:rPr>
+        <w:t xml:space="preserve">new </w:t>
+      </w:r>
+      <w:r>
+        <w:rPr>
+          <w:rFonts w:ascii="Liberation Sans" w:hAnsi="Liberation Sans" w:eastAsia="Liberation Sans" w:cs="Liberation Sans"/>
+          <w:color w:val="bcbec4"/>
+          <w:sz w:val="20"/>
+          <w:szCs w:val="18"/>
+        </w:rPr>
+        <w:t xml:space="preserve">FileInputStream(dir.toFile()));) {</w:t>
+        <w:br/>
+        <w:t xml:space="preserve">        </w:t>
+      </w:r>
+      <w:r>
+        <w:rPr>
+          <w:rFonts w:ascii="Liberation Sans" w:hAnsi="Liberation Sans" w:eastAsia="Liberation Sans" w:cs="Liberation Sans"/>
+          <w:color w:val="cf8e6d"/>
+          <w:sz w:val="20"/>
+          <w:szCs w:val="18"/>
+        </w:rPr>
+        <w:t xml:space="preserve">while </w:t>
+      </w:r>
+      <w:r>
+        <w:rPr>
+          <w:rFonts w:ascii="Liberation Sans" w:hAnsi="Liberation Sans" w:eastAsia="Liberation Sans" w:cs="Liberation Sans"/>
+          <w:color w:val="bcbec4"/>
+          <w:sz w:val="20"/>
+          <w:szCs w:val="18"/>
+        </w:rPr>
+        <w:t xml:space="preserve">(</w:t>
+      </w:r>
+      <w:r>
+        <w:rPr>
+          <w:rFonts w:ascii="Liberation Sans" w:hAnsi="Liberation Sans" w:eastAsia="Liberation Sans" w:cs="Liberation Sans"/>
+          <w:color w:val="cf8e6d"/>
+          <w:sz w:val="20"/>
+          <w:szCs w:val="18"/>
+        </w:rPr>
+        <w:t xml:space="preserve">true</w:t>
+      </w:r>
+      <w:r>
+        <w:rPr>
+          <w:rFonts w:ascii="Liberation Sans" w:hAnsi="Liberation Sans" w:eastAsia="Liberation Sans" w:cs="Liberation Sans"/>
+          <w:color w:val="bcbec4"/>
+          <w:sz w:val="20"/>
+          <w:szCs w:val="18"/>
+        </w:rPr>
+        <w:t xml:space="preserve">) {</w:t>
+        <w:br/>
+        <w:t xml:space="preserve">            Persona p = (Persona) ois.readObject();</w:t>
+        <w:br/>
+        <w:t xml:space="preserve">            personas.add(p);</w:t>
+        <w:br/>
+        <w:t xml:space="preserve">        }</w:t>
+        <w:br/>
+        <w:t xml:space="preserve">    } </w:t>
+      </w:r>
+      <w:r>
+        <w:rPr>
+          <w:rFonts w:ascii="Liberation Sans" w:hAnsi="Liberation Sans" w:eastAsia="Liberation Sans" w:cs="Liberation Sans"/>
+          <w:color w:val="cf8e6d"/>
+          <w:sz w:val="20"/>
+          <w:szCs w:val="18"/>
+        </w:rPr>
+        <w:t xml:space="preserve">catch </w:t>
+      </w:r>
+      <w:r>
+        <w:rPr>
+          <w:rFonts w:ascii="Liberation Sans" w:hAnsi="Liberation Sans" w:eastAsia="Liberation Sans" w:cs="Liberation Sans"/>
+          <w:color w:val="bcbec4"/>
+          <w:sz w:val="20"/>
+          <w:szCs w:val="18"/>
+        </w:rPr>
+        <w:t xml:space="preserve">(EOFException e) {</w:t>
+        <w:br/>
+        <w:t xml:space="preserve">    } </w:t>
+      </w:r>
+      <w:r>
+        <w:rPr>
+          <w:rFonts w:ascii="Liberation Sans" w:hAnsi="Liberation Sans" w:eastAsia="Liberation Sans" w:cs="Liberation Sans"/>
+          <w:color w:val="cf8e6d"/>
+          <w:sz w:val="20"/>
+          <w:szCs w:val="18"/>
+        </w:rPr>
+        <w:t xml:space="preserve">catch </w:t>
+      </w:r>
+      <w:r>
+        <w:rPr>
+          <w:rFonts w:ascii="Liberation Sans" w:hAnsi="Liberation Sans" w:eastAsia="Liberation Sans" w:cs="Liberation Sans"/>
+          <w:color w:val="bcbec4"/>
+          <w:sz w:val="20"/>
+          <w:szCs w:val="18"/>
+        </w:rPr>
+        <w:t xml:space="preserve">(IOException e) {</w:t>
+        <w:br/>
+        <w:t xml:space="preserve">        </w:t>
+      </w:r>
+      <w:r>
+        <w:rPr>
+          <w:rFonts w:ascii="Liberation Sans" w:hAnsi="Liberation Sans" w:eastAsia="Liberation Sans" w:cs="Liberation Sans"/>
+          <w:color w:val="cf8e6d"/>
+          <w:sz w:val="20"/>
+          <w:szCs w:val="18"/>
+        </w:rPr>
+        <w:t xml:space="preserve">throw new </w:t>
+      </w:r>
+      <w:r>
+        <w:rPr>
+          <w:rFonts w:ascii="Liberation Sans" w:hAnsi="Liberation Sans" w:eastAsia="Liberation Sans" w:cs="Liberation Sans"/>
+          <w:color w:val="bcbec4"/>
+          <w:sz w:val="20"/>
+          <w:szCs w:val="18"/>
+        </w:rPr>
+        <w:t xml:space="preserve">RuntimeException(e);</w:t>
+        <w:br/>
+        <w:t xml:space="preserve">    } </w:t>
+      </w:r>
+      <w:r>
+        <w:rPr>
+          <w:rFonts w:ascii="Liberation Sans" w:hAnsi="Liberation Sans" w:eastAsia="Liberation Sans" w:cs="Liberation Sans"/>
+          <w:color w:val="cf8e6d"/>
+          <w:sz w:val="20"/>
+          <w:szCs w:val="18"/>
+        </w:rPr>
+        <w:t xml:space="preserve">catch </w:t>
+      </w:r>
+      <w:r>
+        <w:rPr>
+          <w:rFonts w:ascii="Liberation Sans" w:hAnsi="Liberation Sans" w:eastAsia="Liberation Sans" w:cs="Liberation Sans"/>
+          <w:color w:val="bcbec4"/>
+          <w:sz w:val="20"/>
+          <w:szCs w:val="18"/>
+        </w:rPr>
+        <w:t xml:space="preserve">(ClassNotFoundException e) {</w:t>
+        <w:br/>
+        <w:t xml:space="preserve">        </w:t>
+      </w:r>
+      <w:r>
+        <w:rPr>
+          <w:rFonts w:ascii="Liberation Sans" w:hAnsi="Liberation Sans" w:eastAsia="Liberation Sans" w:cs="Liberation Sans"/>
+          <w:color w:val="cf8e6d"/>
+          <w:sz w:val="20"/>
+          <w:szCs w:val="18"/>
+        </w:rPr>
+        <w:t xml:space="preserve">throw new </w:t>
+      </w:r>
+      <w:r>
+        <w:rPr>
+          <w:rFonts w:ascii="Liberation Sans" w:hAnsi="Liberation Sans" w:eastAsia="Liberation Sans" w:cs="Liberation Sans"/>
+          <w:color w:val="bcbec4"/>
+          <w:sz w:val="20"/>
+          <w:szCs w:val="18"/>
+        </w:rPr>
+        <w:t xml:space="preserve">RuntimeException(e);</w:t>
+        <w:br/>
+        <w:t xml:space="preserve">    }</w:t>
+        <w:br/>
+        <w:t xml:space="preserve">    personas.sort(Comparator.</w:t>
+      </w:r>
+      <w:r>
+        <w:rPr>
+          <w:rFonts w:ascii="Liberation Sans" w:hAnsi="Liberation Sans" w:eastAsia="Liberation Sans" w:cs="Liberation Sans"/>
+          <w:i/>
+          <w:color w:val="bcbec4"/>
+          <w:sz w:val="20"/>
+          <w:szCs w:val="18"/>
+        </w:rPr>
+        <w:t xml:space="preserve">comparing</w:t>
+      </w:r>
+      <w:r>
+        <w:rPr>
+          <w:rFonts w:ascii="Liberation Sans" w:hAnsi="Liberation Sans" w:eastAsia="Liberation Sans" w:cs="Liberation Sans"/>
+          <w:color w:val="bcbec4"/>
+          <w:sz w:val="20"/>
+          <w:szCs w:val="18"/>
+        </w:rPr>
+        <w:t xml:space="preserve">(Persona::getEdad));</w:t>
+        <w:br/>
+        <w:t xml:space="preserve">    </w:t>
+      </w:r>
+      <w:r>
+        <w:rPr>
+          <w:rFonts w:ascii="Liberation Sans" w:hAnsi="Liberation Sans" w:eastAsia="Liberation Sans" w:cs="Liberation Sans"/>
+          <w:color w:val="cf8e6d"/>
+          <w:sz w:val="20"/>
+          <w:szCs w:val="18"/>
+        </w:rPr>
+        <w:t xml:space="preserve">for </w:t>
+      </w:r>
+      <w:r>
+        <w:rPr>
+          <w:rFonts w:ascii="Liberation Sans" w:hAnsi="Liberation Sans" w:eastAsia="Liberation Sans" w:cs="Liberation Sans"/>
+          <w:color w:val="bcbec4"/>
+          <w:sz w:val="20"/>
+          <w:szCs w:val="18"/>
+        </w:rPr>
+        <w:t xml:space="preserve">(Persona p : personas) System.</w:t>
+      </w:r>
+      <w:r>
+        <w:rPr>
+          <w:rFonts w:ascii="Liberation Sans" w:hAnsi="Liberation Sans" w:eastAsia="Liberation Sans" w:cs="Liberation Sans"/>
+          <w:i/>
+          <w:color w:val="c77dbb"/>
+          <w:sz w:val="20"/>
+          <w:szCs w:val="18"/>
+        </w:rPr>
+        <w:t xml:space="preserve">out</w:t>
+      </w:r>
+      <w:r>
+        <w:rPr>
+          <w:rFonts w:ascii="Liberation Sans" w:hAnsi="Liberation Sans" w:eastAsia="Liberation Sans" w:cs="Liberation Sans"/>
+          <w:color w:val="bcbec4"/>
+          <w:sz w:val="20"/>
+          <w:szCs w:val="18"/>
+        </w:rPr>
+        <w:t xml:space="preserve">.println(p);</w:t>
+        <w:br/>
+        <w:t xml:space="preserve">    System.</w:t>
+      </w:r>
+      <w:r>
+        <w:rPr>
+          <w:rFonts w:ascii="Liberation Sans" w:hAnsi="Liberation Sans" w:eastAsia="Liberation Sans" w:cs="Liberation Sans"/>
+          <w:i/>
+          <w:color w:val="c77dbb"/>
+          <w:sz w:val="20"/>
+          <w:szCs w:val="18"/>
+        </w:rPr>
+        <w:t xml:space="preserve">out</w:t>
+      </w:r>
+      <w:r>
+        <w:rPr>
+          <w:rFonts w:ascii="Liberation Sans" w:hAnsi="Liberation Sans" w:eastAsia="Liberation Sans" w:cs="Liberation Sans"/>
+          <w:color w:val="bcbec4"/>
+          <w:sz w:val="20"/>
+          <w:szCs w:val="18"/>
+        </w:rPr>
+        <w:t xml:space="preserve">.println(</w:t>
+      </w:r>
+      <w:r>
+        <w:rPr>
+          <w:rFonts w:ascii="Liberation Sans" w:hAnsi="Liberation Sans" w:eastAsia="Liberation Sans" w:cs="Liberation Sans"/>
+          <w:color w:val="6aab73"/>
+          <w:sz w:val="20"/>
+          <w:szCs w:val="18"/>
+        </w:rPr>
+        <w:t xml:space="preserve">"----- FIN DE EJERCICIO 4 -----</w:t>
+      </w:r>
+      <w:r>
+        <w:rPr>
+          <w:rFonts w:ascii="Liberation Sans" w:hAnsi="Liberation Sans" w:eastAsia="Liberation Sans" w:cs="Liberation Sans"/>
+          <w:color w:val="cf8e6d"/>
+          <w:sz w:val="20"/>
+          <w:szCs w:val="18"/>
+        </w:rPr>
+        <w:t xml:space="preserve">\n</w:t>
+      </w:r>
+      <w:r>
+        <w:rPr>
+          <w:rFonts w:ascii="Liberation Sans" w:hAnsi="Liberation Sans" w:eastAsia="Liberation Sans" w:cs="Liberation Sans"/>
+          <w:color w:val="6aab73"/>
+          <w:sz w:val="20"/>
+          <w:szCs w:val="18"/>
+        </w:rPr>
+        <w:t xml:space="preserve">"</w:t>
+      </w:r>
+      <w:r>
+        <w:rPr>
+          <w:rFonts w:ascii="Liberation Sans" w:hAnsi="Liberation Sans" w:eastAsia="Liberation Sans" w:cs="Liberation Sans"/>
+          <w:color w:val="bcbec4"/>
+          <w:sz w:val="20"/>
+          <w:szCs w:val="18"/>
+        </w:rPr>
+        <w:t xml:space="preserve">);</w:t>
+        <w:br/>
+        <w:t xml:space="preserve">}</w:t>
+      </w:r>
+      <w:r>
+        <w:rPr>
+          <w:sz w:val="18"/>
+          <w:szCs w:val="18"/>
         </w:rPr>
       </w:r>
     </w:p>
@@ -4509,73 +7205,17 @@
         </w:rPr>
       </w:pPr>
       <w:r>
-        <w:t xml:space="preserve">Leer un fichero CSV y cargar los datos en una lista de objetos.</w:t>
+        <w:rPr>
+          <w:highlight w:val="none"/>
+        </w:rPr>
+        <w:br w:type="page" w:clear="all"/>
       </w:r>
       <w:r>
         <w:rPr>
           <w14:ligatures w14:val="none"/>
         </w:rPr>
       </w:r>
-      <w:r>
-        <w:rPr>
-          <w14:ligatures w14:val="none"/>
-        </w:rPr>
-      </w:r>
-    </w:p>
-    <w:p>
-      <w:pPr>
-        <w:pStyle w:val="855"/>
-        <w:spacing/>
-        <w:ind/>
-        <w:rPr>
-          <w14:ligatures w14:val="none"/>
-        </w:rPr>
-      </w:pPr>
-      <w:r>
-        <w:t xml:space="preserve">Leer datos binarios y convertirlos a un formato legible en consola.</w:t>
-      </w:r>
-      <w:r>
-        <w:rPr>
-          <w14:ligatures w14:val="none"/>
-        </w:rPr>
-      </w:r>
-      <w:r>
-        <w:rPr>
-          <w14:ligatures w14:val="none"/>
-        </w:rPr>
-      </w:r>
-    </w:p>
-    <w:p>
-      <w:pPr>
-        <w:pStyle w:val="855"/>
-        <w:spacing/>
-        <w:ind/>
-        <w:rPr>
-          <w14:ligatures w14:val="none"/>
-        </w:rPr>
-      </w:pPr>
-      <w:r>
-        <w:t xml:space="preserve">Leer un fichero de objetos serializados y mostrarlos ordenados por uno de sus </w:t>
-      </w:r>
-      <w:r>
-        <w:t xml:space="preserve">atributos.</w:t>
-      </w:r>
-      <w:r>
-        <w:rPr>
-          <w:highlight w:val="none"/>
-        </w:rPr>
-        <w:br w:type="page" w:clear="all"/>
-      </w:r>
-      <w:r>
-        <w:rPr>
-          <w14:ligatures w14:val="none"/>
-        </w:rPr>
-      </w:r>
-      <w:r>
-        <w:rPr>
-          <w14:ligatures w14:val="none"/>
-        </w:rPr>
-      </w:r>
+      <w:r/>
     </w:p>
     <w:p>
       <w:pPr>

</xml_diff>

<commit_message>
programacion multimedia Practica 2
</commit_message>
<xml_diff>
--- a/Acceso a datos/Tema1/Actividades/Ejercicios/Ejercicios.docx
+++ b/Acceso a datos/Tema1/Actividades/Ejercicios/Ejercicios.docx
@@ -21,6 +21,7 @@
           <w:sz w:val="72"/>
           <w:szCs w:val="72"/>
         </w:rPr>
+        <w:t xml:space="preserve"> </w:t>
       </w:r>
       <w:r>
         <w:rPr>
@@ -3733,6 +3734,7 @@
           <w:bCs/>
           <w:color w:val="7f7f7f" w:themeColor="text1" w:themeTint="80"/>
           <w:highlight w:val="none"/>
+          <w14:ligatures w14:val="none"/>
         </w:rPr>
       </w:r>
       <w:r>
@@ -4128,7 +4130,7 @@
       </w:r>
       <w:r>
         <w:rPr>
-          <w:sz w:val="18"/>
+          <w:sz w:val="20"/>
           <w:szCs w:val="18"/>
         </w:rPr>
       </w:r>
@@ -4184,6 +4186,14 @@
           <w:color w:val="7f7f7f" w:themeColor="text1" w:themeTint="80"/>
         </w:rPr>
         <w:t xml:space="preserve">Comprobar el tamaño total de todos los ficheros en una carpeta y mostrarlo en MB.</w:t>
+      </w:r>
+      <w:r>
+        <w:rPr>
+          <w:b/>
+          <w:bCs/>
+          <w:color w:val="7f7f7f" w:themeColor="text1" w:themeTint="80"/>
+          <w14:ligatures w14:val="none"/>
+        </w:rPr>
       </w:r>
       <w:r>
         <w:rPr>
@@ -4594,6 +4604,12 @@
           <w:szCs w:val="18"/>
         </w:rPr>
       </w:r>
+      <w:r>
+        <w:rPr>
+          <w:sz w:val="20"/>
+          <w:szCs w:val="18"/>
+        </w:rPr>
+      </w:r>
     </w:p>
     <w:p>
       <w:pPr>
@@ -4640,14 +4656,6 @@
       </w:r>
       <w:r>
         <w:rPr>
-          <w:b w:val="0"/>
-          <w:bCs w:val="0"/>
-          <w:highlight w:val="none"/>
-          <w14:ligatures w14:val="none"/>
-        </w:rPr>
-      </w:r>
-      <w:r>
-        <w:rPr>
           <w:highlight w:val="none"/>
           <w14:ligatures w14:val="none"/>
         </w:rPr>
@@ -4662,7 +4670,15 @@
           <w14:ligatures w14:val="none"/>
         </w:rPr>
       </w:r>
-      <w:r/>
+      <w:r>
+        <w:rPr>
+          <w:b/>
+          <w:bCs/>
+          <w:color w:val="7f7f7f" w:themeColor="text1" w:themeTint="80"/>
+          <w:highlight w:val="none"/>
+          <w14:ligatures w14:val="none"/>
+        </w:rPr>
+      </w:r>
     </w:p>
     <w:p>
       <w:pPr>
@@ -5140,6 +5156,12 @@
           <w:szCs w:val="18"/>
         </w:rPr>
       </w:r>
+      <w:r>
+        <w:rPr>
+          <w:sz w:val="20"/>
+          <w:szCs w:val="18"/>
+        </w:rPr>
+      </w:r>
     </w:p>
     <w:p>
       <w:pPr>
@@ -5159,7 +5181,6 @@
         <w:rPr>
           <w:sz w:val="22"/>
           <w:szCs w:val="22"/>
-          <w14:ligatures w14:val="none"/>
         </w:rPr>
       </w:r>
       <w:r>
@@ -5793,6 +5814,12 @@
           <w:szCs w:val="18"/>
         </w:rPr>
       </w:r>
+      <w:r>
+        <w:rPr>
+          <w:sz w:val="20"/>
+          <w:szCs w:val="18"/>
+        </w:rPr>
+      </w:r>
     </w:p>
     <w:p>
       <w:pPr>
@@ -6252,6 +6279,12 @@
           <w:szCs w:val="18"/>
         </w:rPr>
       </w:r>
+      <w:r>
+        <w:rPr>
+          <w:sz w:val="20"/>
+          <w:szCs w:val="18"/>
+        </w:rPr>
+      </w:r>
     </w:p>
     <w:p>
       <w:pPr>
@@ -6293,7 +6326,7 @@
       </w:r>
       <w:r>
         <w:rPr>
-          <w:highlight w:val="none"/>
+          <w14:ligatures w14:val="none"/>
         </w:rPr>
       </w:r>
     </w:p>
@@ -6317,6 +6350,7 @@
       </w:r>
       <w:r>
         <w:rPr>
+          <w:highlight w:val="none"/>
           <w14:ligatures w14:val="none"/>
         </w:rPr>
       </w:r>
@@ -6704,6 +6738,12 @@
           <w:szCs w:val="18"/>
         </w:rPr>
       </w:r>
+      <w:r>
+        <w:rPr>
+          <w:sz w:val="20"/>
+          <w:szCs w:val="18"/>
+        </w:rPr>
+      </w:r>
     </w:p>
     <w:p>
       <w:pPr>
@@ -6741,11 +6781,12 @@
       </w:r>
       <w:r>
         <w:rPr>
+          <w14:ligatures w14:val="none"/>
+        </w:rPr>
+      </w:r>
+      <w:r>
+        <w:rPr>
           <w:highlight w:val="none"/>
-        </w:rPr>
-      </w:r>
-      <w:r>
-        <w:rPr>
           <w14:ligatures w14:val="none"/>
         </w:rPr>
       </w:r>
@@ -7194,6 +7235,12 @@
           <w:szCs w:val="18"/>
         </w:rPr>
       </w:r>
+      <w:r>
+        <w:rPr>
+          <w:sz w:val="20"/>
+          <w:szCs w:val="18"/>
+        </w:rPr>
+      </w:r>
     </w:p>
     <w:p>
       <w:pPr>
@@ -7215,7 +7262,11 @@
           <w14:ligatures w14:val="none"/>
         </w:rPr>
       </w:r>
-      <w:r/>
+      <w:r>
+        <w:rPr>
+          <w14:ligatures w14:val="none"/>
+        </w:rPr>
+      </w:r>
     </w:p>
     <w:p>
       <w:pPr>

</xml_diff>

<commit_message>
Ejercicios 2 y 3 segundo apartado acceso datos
</commit_message>
<xml_diff>
--- a/Acceso a datos/Tema1/Actividades/Ejercicios/Ejercicios.docx
+++ b/Acceso a datos/Tema1/Actividades/Ejercicios/Ejercicios.docx
@@ -4600,7 +4600,7 @@
       </w:r>
       <w:r>
         <w:rPr>
-          <w:sz w:val="18"/>
+          <w:sz w:val="20"/>
           <w:szCs w:val="18"/>
         </w:rPr>
       </w:r>
@@ -5152,16 +5152,16 @@
       </w:r>
       <w:r>
         <w:rPr>
-          <w:sz w:val="18"/>
-          <w:szCs w:val="18"/>
-        </w:rPr>
-      </w:r>
-      <w:r>
-        <w:rPr>
           <w:sz w:val="20"/>
           <w:szCs w:val="18"/>
         </w:rPr>
       </w:r>
+      <w:r>
+        <w:rPr>
+          <w:sz w:val="20"/>
+          <w:szCs w:val="18"/>
+        </w:rPr>
+      </w:r>
     </w:p>
     <w:p>
       <w:pPr>
@@ -5204,189 +5204,6 @@
       </w:r>
       <w:r>
         <w:t xml:space="preserve">acceso aleatorio.</w:t>
-      </w:r>
-      <w:r>
-        <w:rPr>
-          <w14:ligatures w14:val="none"/>
-        </w:rPr>
-      </w:r>
-      <w:r>
-        <w:rPr>
-          <w14:ligatures w14:val="none"/>
-        </w:rPr>
-      </w:r>
-    </w:p>
-    <w:p>
-      <w:pPr>
-        <w:spacing/>
-        <w:ind/>
-        <w:rPr/>
-      </w:pPr>
-      <w:r>
-        <w:rPr>
-          <w14:ligatures w14:val="none"/>
-        </w:rPr>
-      </w:r>
-      <w:r>
-        <w:rPr>
-          <w14:ligatures w14:val="none"/>
-        </w:rPr>
-      </w:r>
-      <w:r/>
-    </w:p>
-    <w:p>
-      <w:pPr>
-        <w:pStyle w:val="855"/>
-        <w:spacing/>
-        <w:ind/>
-        <w:rPr>
-          <w14:ligatures w14:val="none"/>
-        </w:rPr>
-      </w:pPr>
-      <w:r>
-        <w:t xml:space="preserve">Modificar un registro en una posición concreta de un fichero sin reescribir el fichero </w:t>
-      </w:r>
-      <w:r>
-        <w:t xml:space="preserve">completo.</w:t>
-      </w:r>
-      <w:r>
-        <w:rPr>
-          <w14:ligatures w14:val="none"/>
-        </w:rPr>
-      </w:r>
-      <w:r>
-        <w:rPr>
-          <w14:ligatures w14:val="none"/>
-        </w:rPr>
-      </w:r>
-    </w:p>
-    <w:p>
-      <w:pPr>
-        <w:pStyle w:val="855"/>
-        <w:spacing/>
-        <w:ind/>
-        <w:rPr>
-          <w14:ligatures w14:val="none"/>
-        </w:rPr>
-      </w:pPr>
-      <w:r>
-        <w:t xml:space="preserve">Comparar el tiempo de lectura secuencial vs aleatoria en un fichero con 10.000 </w:t>
-      </w:r>
-      <w:r>
-        <w:t xml:space="preserve">registros de tamaño fijo.</w:t>
-      </w:r>
-      <w:r>
-        <w:rPr>
-          <w14:ligatures w14:val="none"/>
-        </w:rPr>
-      </w:r>
-      <w:r>
-        <w:rPr>
-          <w14:ligatures w14:val="none"/>
-        </w:rPr>
-      </w:r>
-    </w:p>
-    <w:p>
-      <w:pPr>
-        <w:pStyle w:val="855"/>
-        <w:spacing/>
-        <w:ind/>
-        <w:rPr>
-          <w14:ligatures w14:val="none"/>
-        </w:rPr>
-      </w:pPr>
-      <w:r>
-        <w:t xml:space="preserve">Crear un programa que permita insertar, modificar y eliminar registros en un fichero </w:t>
-      </w:r>
-      <w:r>
-        <w:t xml:space="preserve">binario con acceso aleatorio.</w:t>
-      </w:r>
-      <w:r>
-        <w:rPr>
-          <w14:ligatures w14:val="none"/>
-        </w:rPr>
-      </w:r>
-      <w:r>
-        <w:rPr>
-          <w14:ligatures w14:val="none"/>
-        </w:rPr>
-      </w:r>
-    </w:p>
-    <w:p>
-      <w:pPr>
-        <w:pStyle w:val="855"/>
-        <w:spacing/>
-        <w:ind/>
-        <w:rPr>
-          <w14:ligatures w14:val="none"/>
-        </w:rPr>
-      </w:pPr>
-      <w:r>
-        <w:t xml:space="preserve">Escribir un índice con las posiciones de los registros en un fichero para acceder a ellos </w:t>
-      </w:r>
-      <w:r>
-        <w:t xml:space="preserve">más rápidamente.</w:t>
-      </w:r>
-      <w:r>
-        <w:rPr>
-          <w:highlight w:val="none"/>
-        </w:rPr>
-        <w:br w:type="page" w:clear="all"/>
-      </w:r>
-      <w:r>
-        <w:rPr>
-          <w14:ligatures w14:val="none"/>
-        </w:rPr>
-      </w:r>
-      <w:r>
-        <w:rPr>
-          <w14:ligatures w14:val="none"/>
-        </w:rPr>
-      </w:r>
-    </w:p>
-    <w:p>
-      <w:pPr>
-        <w:pStyle w:val="851"/>
-        <w:spacing/>
-        <w:ind/>
-        <w:rPr>
-          <w:highlight w:val="none"/>
-          <w14:ligatures w14:val="none"/>
-        </w:rPr>
-      </w:pPr>
-      <w:r/>
-      <w:bookmarkStart w:id="3" w:name="_Toc3"/>
-      <w:r>
-        <w:t xml:space="preserve">Recuperar información almacenada en ficheros</w:t>
-      </w:r>
-      <w:bookmarkEnd w:id="3"/>
-      <w:r>
-        <w:rPr>
-          <w:highlight w:val="none"/>
-          <w14:ligatures w14:val="none"/>
-        </w:rPr>
-      </w:r>
-      <w:r>
-        <w:rPr>
-          <w:highlight w:val="none"/>
-          <w14:ligatures w14:val="none"/>
-        </w:rPr>
-      </w:r>
-    </w:p>
-    <w:p>
-      <w:pPr>
-        <w:pStyle w:val="855"/>
-        <w:spacing/>
-        <w:ind/>
-        <w:rPr>
-          <w14:ligatures w14:val="none"/>
-        </w:rPr>
-      </w:pPr>
-      <w:r>
-        <w:t xml:space="preserve">Leer un fichero de texto con datos de usuarios (nombre, edad, correo) y mostrarlos por </w:t>
-      </w:r>
-      <w:r>
-        <w:t xml:space="preserve">consola.</w:t>
       </w:r>
       <w:r>
         <w:rPr>
@@ -5416,7 +5233,7 @@
           <w:sz w:val="20"/>
           <w:szCs w:val="18"/>
         </w:rPr>
-        <w:t xml:space="preserve">public void </w:t>
+        <w:t xml:space="preserve">public static void </w:t>
       </w:r>
       <w:r>
         <w:rPr>
@@ -5425,7 +5242,7 @@
           <w:sz w:val="20"/>
           <w:szCs w:val="18"/>
         </w:rPr>
-        <w:t xml:space="preserve">ej1</w:t>
+        <w:t xml:space="preserve">ej2</w:t>
       </w:r>
       <w:r>
         <w:rPr>
@@ -5464,7 +5281,7 @@
           <w:sz w:val="20"/>
           <w:szCs w:val="18"/>
         </w:rPr>
-        <w:t xml:space="preserve">"---- COMIENZO EJERCICIO 1 ----"</w:t>
+        <w:t xml:space="preserve">"---- COMIENZO EJERCICIO 2 ----"</w:t>
       </w:r>
       <w:r>
         <w:rPr>
@@ -5496,25 +5313,7 @@
         </w:rPr>
         <w:t xml:space="preserve">(ruta);</w:t>
         <w:br/>
-        <w:t xml:space="preserve">    </w:t>
-      </w:r>
-      <w:r>
-        <w:rPr>
-          <w:rFonts w:ascii="Liberation Sans" w:hAnsi="Liberation Sans" w:eastAsia="Liberation Sans" w:cs="Liberation Sans"/>
-          <w:color w:val="cf8e6d"/>
-          <w:sz w:val="20"/>
-          <w:szCs w:val="18"/>
-        </w:rPr>
-        <w:t xml:space="preserve">try </w:t>
-      </w:r>
-      <w:r>
-        <w:rPr>
-          <w:rFonts w:ascii="Liberation Sans" w:hAnsi="Liberation Sans" w:eastAsia="Liberation Sans" w:cs="Liberation Sans"/>
-          <w:color w:val="bcbec4"/>
-          <w:sz w:val="20"/>
-          <w:szCs w:val="18"/>
-        </w:rPr>
-        <w:t xml:space="preserve">(BufferedReader br = Files.</w:t>
+        <w:t xml:space="preserve">    List&lt;Registro&gt; rList = List.</w:t>
       </w:r>
       <w:r>
         <w:rPr>
@@ -5524,6 +5323,886 @@
           <w:sz w:val="20"/>
           <w:szCs w:val="18"/>
         </w:rPr>
+        <w:t xml:space="preserve">of</w:t>
+      </w:r>
+      <w:r>
+        <w:rPr>
+          <w:rFonts w:ascii="Liberation Sans" w:hAnsi="Liberation Sans" w:eastAsia="Liberation Sans" w:cs="Liberation Sans"/>
+          <w:color w:val="bcbec4"/>
+          <w:sz w:val="20"/>
+          <w:szCs w:val="18"/>
+        </w:rPr>
+        <w:t xml:space="preserve">(</w:t>
+        <w:br/>
+        <w:t xml:space="preserve">            </w:t>
+      </w:r>
+      <w:r>
+        <w:rPr>
+          <w:rFonts w:ascii="Liberation Sans" w:hAnsi="Liberation Sans" w:eastAsia="Liberation Sans" w:cs="Liberation Sans"/>
+          <w:color w:val="cf8e6d"/>
+          <w:sz w:val="20"/>
+          <w:szCs w:val="18"/>
+        </w:rPr>
+        <w:t xml:space="preserve">new </w:t>
+      </w:r>
+      <w:r>
+        <w:rPr>
+          <w:rFonts w:ascii="Liberation Sans" w:hAnsi="Liberation Sans" w:eastAsia="Liberation Sans" w:cs="Liberation Sans"/>
+          <w:color w:val="bcbec4"/>
+          <w:sz w:val="20"/>
+          <w:szCs w:val="18"/>
+        </w:rPr>
+        <w:t xml:space="preserve">Registro(</w:t>
+      </w:r>
+      <w:r>
+        <w:rPr>
+          <w:rFonts w:ascii="Liberation Sans" w:hAnsi="Liberation Sans" w:eastAsia="Liberation Sans" w:cs="Liberation Sans"/>
+          <w:color w:val="2aacb8"/>
+          <w:sz w:val="20"/>
+          <w:szCs w:val="18"/>
+        </w:rPr>
+        <w:t xml:space="preserve">1</w:t>
+      </w:r>
+      <w:r>
+        <w:rPr>
+          <w:rFonts w:ascii="Liberation Sans" w:hAnsi="Liberation Sans" w:eastAsia="Liberation Sans" w:cs="Liberation Sans"/>
+          <w:color w:val="bcbec4"/>
+          <w:sz w:val="20"/>
+          <w:szCs w:val="18"/>
+        </w:rPr>
+        <w:t xml:space="preserve">,</w:t>
+      </w:r>
+      <w:r>
+        <w:rPr>
+          <w:rFonts w:ascii="Liberation Sans" w:hAnsi="Liberation Sans" w:eastAsia="Liberation Sans" w:cs="Liberation Sans"/>
+          <w:color w:val="2aacb8"/>
+          <w:sz w:val="20"/>
+          <w:szCs w:val="18"/>
+        </w:rPr>
+        <w:t xml:space="preserve">2</w:t>
+      </w:r>
+      <w:r>
+        <w:rPr>
+          <w:rFonts w:ascii="Liberation Sans" w:hAnsi="Liberation Sans" w:eastAsia="Liberation Sans" w:cs="Liberation Sans"/>
+          <w:color w:val="bcbec4"/>
+          <w:sz w:val="20"/>
+          <w:szCs w:val="18"/>
+        </w:rPr>
+        <w:t xml:space="preserve">),</w:t>
+        <w:br/>
+        <w:t xml:space="preserve">            </w:t>
+      </w:r>
+      <w:r>
+        <w:rPr>
+          <w:rFonts w:ascii="Liberation Sans" w:hAnsi="Liberation Sans" w:eastAsia="Liberation Sans" w:cs="Liberation Sans"/>
+          <w:color w:val="cf8e6d"/>
+          <w:sz w:val="20"/>
+          <w:szCs w:val="18"/>
+        </w:rPr>
+        <w:t xml:space="preserve">new </w:t>
+      </w:r>
+      <w:r>
+        <w:rPr>
+          <w:rFonts w:ascii="Liberation Sans" w:hAnsi="Liberation Sans" w:eastAsia="Liberation Sans" w:cs="Liberation Sans"/>
+          <w:color w:val="bcbec4"/>
+          <w:sz w:val="20"/>
+          <w:szCs w:val="18"/>
+        </w:rPr>
+        <w:t xml:space="preserve">Registro(</w:t>
+      </w:r>
+      <w:r>
+        <w:rPr>
+          <w:rFonts w:ascii="Liberation Sans" w:hAnsi="Liberation Sans" w:eastAsia="Liberation Sans" w:cs="Liberation Sans"/>
+          <w:color w:val="2aacb8"/>
+          <w:sz w:val="20"/>
+          <w:szCs w:val="18"/>
+        </w:rPr>
+        <w:t xml:space="preserve">2</w:t>
+      </w:r>
+      <w:r>
+        <w:rPr>
+          <w:rFonts w:ascii="Liberation Sans" w:hAnsi="Liberation Sans" w:eastAsia="Liberation Sans" w:cs="Liberation Sans"/>
+          <w:color w:val="bcbec4"/>
+          <w:sz w:val="20"/>
+          <w:szCs w:val="18"/>
+        </w:rPr>
+        <w:t xml:space="preserve">,</w:t>
+      </w:r>
+      <w:r>
+        <w:rPr>
+          <w:rFonts w:ascii="Liberation Sans" w:hAnsi="Liberation Sans" w:eastAsia="Liberation Sans" w:cs="Liberation Sans"/>
+          <w:color w:val="2aacb8"/>
+          <w:sz w:val="20"/>
+          <w:szCs w:val="18"/>
+        </w:rPr>
+        <w:t xml:space="preserve">3</w:t>
+      </w:r>
+      <w:r>
+        <w:rPr>
+          <w:rFonts w:ascii="Liberation Sans" w:hAnsi="Liberation Sans" w:eastAsia="Liberation Sans" w:cs="Liberation Sans"/>
+          <w:color w:val="bcbec4"/>
+          <w:sz w:val="20"/>
+          <w:szCs w:val="18"/>
+        </w:rPr>
+        <w:t xml:space="preserve">),</w:t>
+        <w:br/>
+        <w:t xml:space="preserve">            </w:t>
+      </w:r>
+      <w:r>
+        <w:rPr>
+          <w:rFonts w:ascii="Liberation Sans" w:hAnsi="Liberation Sans" w:eastAsia="Liberation Sans" w:cs="Liberation Sans"/>
+          <w:color w:val="cf8e6d"/>
+          <w:sz w:val="20"/>
+          <w:szCs w:val="18"/>
+        </w:rPr>
+        <w:t xml:space="preserve">new </w:t>
+      </w:r>
+      <w:r>
+        <w:rPr>
+          <w:rFonts w:ascii="Liberation Sans" w:hAnsi="Liberation Sans" w:eastAsia="Liberation Sans" w:cs="Liberation Sans"/>
+          <w:color w:val="bcbec4"/>
+          <w:sz w:val="20"/>
+          <w:szCs w:val="18"/>
+        </w:rPr>
+        <w:t xml:space="preserve">Registro(</w:t>
+      </w:r>
+      <w:r>
+        <w:rPr>
+          <w:rFonts w:ascii="Liberation Sans" w:hAnsi="Liberation Sans" w:eastAsia="Liberation Sans" w:cs="Liberation Sans"/>
+          <w:color w:val="2aacb8"/>
+          <w:sz w:val="20"/>
+          <w:szCs w:val="18"/>
+        </w:rPr>
+        <w:t xml:space="preserve">3</w:t>
+      </w:r>
+      <w:r>
+        <w:rPr>
+          <w:rFonts w:ascii="Liberation Sans" w:hAnsi="Liberation Sans" w:eastAsia="Liberation Sans" w:cs="Liberation Sans"/>
+          <w:color w:val="bcbec4"/>
+          <w:sz w:val="20"/>
+          <w:szCs w:val="18"/>
+        </w:rPr>
+        <w:t xml:space="preserve">,</w:t>
+      </w:r>
+      <w:r>
+        <w:rPr>
+          <w:rFonts w:ascii="Liberation Sans" w:hAnsi="Liberation Sans" w:eastAsia="Liberation Sans" w:cs="Liberation Sans"/>
+          <w:color w:val="2aacb8"/>
+          <w:sz w:val="20"/>
+          <w:szCs w:val="18"/>
+        </w:rPr>
+        <w:t xml:space="preserve">4</w:t>
+      </w:r>
+      <w:r>
+        <w:rPr>
+          <w:rFonts w:ascii="Liberation Sans" w:hAnsi="Liberation Sans" w:eastAsia="Liberation Sans" w:cs="Liberation Sans"/>
+          <w:color w:val="bcbec4"/>
+          <w:sz w:val="20"/>
+          <w:szCs w:val="18"/>
+        </w:rPr>
+        <w:t xml:space="preserve">),</w:t>
+        <w:br/>
+        <w:t xml:space="preserve">            </w:t>
+      </w:r>
+      <w:r>
+        <w:rPr>
+          <w:rFonts w:ascii="Liberation Sans" w:hAnsi="Liberation Sans" w:eastAsia="Liberation Sans" w:cs="Liberation Sans"/>
+          <w:color w:val="cf8e6d"/>
+          <w:sz w:val="20"/>
+          <w:szCs w:val="18"/>
+        </w:rPr>
+        <w:t xml:space="preserve">new </w:t>
+      </w:r>
+      <w:r>
+        <w:rPr>
+          <w:rFonts w:ascii="Liberation Sans" w:hAnsi="Liberation Sans" w:eastAsia="Liberation Sans" w:cs="Liberation Sans"/>
+          <w:color w:val="bcbec4"/>
+          <w:sz w:val="20"/>
+          <w:szCs w:val="18"/>
+        </w:rPr>
+        <w:t xml:space="preserve">Registro(</w:t>
+      </w:r>
+      <w:r>
+        <w:rPr>
+          <w:rFonts w:ascii="Liberation Sans" w:hAnsi="Liberation Sans" w:eastAsia="Liberation Sans" w:cs="Liberation Sans"/>
+          <w:color w:val="2aacb8"/>
+          <w:sz w:val="20"/>
+          <w:szCs w:val="18"/>
+        </w:rPr>
+        <w:t xml:space="preserve">4</w:t>
+      </w:r>
+      <w:r>
+        <w:rPr>
+          <w:rFonts w:ascii="Liberation Sans" w:hAnsi="Liberation Sans" w:eastAsia="Liberation Sans" w:cs="Liberation Sans"/>
+          <w:color w:val="bcbec4"/>
+          <w:sz w:val="20"/>
+          <w:szCs w:val="18"/>
+        </w:rPr>
+        <w:t xml:space="preserve">,</w:t>
+      </w:r>
+      <w:r>
+        <w:rPr>
+          <w:rFonts w:ascii="Liberation Sans" w:hAnsi="Liberation Sans" w:eastAsia="Liberation Sans" w:cs="Liberation Sans"/>
+          <w:color w:val="2aacb8"/>
+          <w:sz w:val="20"/>
+          <w:szCs w:val="18"/>
+        </w:rPr>
+        <w:t xml:space="preserve">5</w:t>
+      </w:r>
+      <w:r>
+        <w:rPr>
+          <w:rFonts w:ascii="Liberation Sans" w:hAnsi="Liberation Sans" w:eastAsia="Liberation Sans" w:cs="Liberation Sans"/>
+          <w:color w:val="bcbec4"/>
+          <w:sz w:val="20"/>
+          <w:szCs w:val="18"/>
+        </w:rPr>
+        <w:t xml:space="preserve">),</w:t>
+        <w:br/>
+        <w:t xml:space="preserve">            </w:t>
+      </w:r>
+      <w:r>
+        <w:rPr>
+          <w:rFonts w:ascii="Liberation Sans" w:hAnsi="Liberation Sans" w:eastAsia="Liberation Sans" w:cs="Liberation Sans"/>
+          <w:color w:val="cf8e6d"/>
+          <w:sz w:val="20"/>
+          <w:szCs w:val="18"/>
+        </w:rPr>
+        <w:t xml:space="preserve">new </w:t>
+      </w:r>
+      <w:r>
+        <w:rPr>
+          <w:rFonts w:ascii="Liberation Sans" w:hAnsi="Liberation Sans" w:eastAsia="Liberation Sans" w:cs="Liberation Sans"/>
+          <w:color w:val="bcbec4"/>
+          <w:sz w:val="20"/>
+          <w:szCs w:val="18"/>
+        </w:rPr>
+        <w:t xml:space="preserve">Registro(</w:t>
+      </w:r>
+      <w:r>
+        <w:rPr>
+          <w:rFonts w:ascii="Liberation Sans" w:hAnsi="Liberation Sans" w:eastAsia="Liberation Sans" w:cs="Liberation Sans"/>
+          <w:color w:val="2aacb8"/>
+          <w:sz w:val="20"/>
+          <w:szCs w:val="18"/>
+        </w:rPr>
+        <w:t xml:space="preserve">5</w:t>
+      </w:r>
+      <w:r>
+        <w:rPr>
+          <w:rFonts w:ascii="Liberation Sans" w:hAnsi="Liberation Sans" w:eastAsia="Liberation Sans" w:cs="Liberation Sans"/>
+          <w:color w:val="bcbec4"/>
+          <w:sz w:val="20"/>
+          <w:szCs w:val="18"/>
+        </w:rPr>
+        <w:t xml:space="preserve">,</w:t>
+      </w:r>
+      <w:r>
+        <w:rPr>
+          <w:rFonts w:ascii="Liberation Sans" w:hAnsi="Liberation Sans" w:eastAsia="Liberation Sans" w:cs="Liberation Sans"/>
+          <w:color w:val="2aacb8"/>
+          <w:sz w:val="20"/>
+          <w:szCs w:val="18"/>
+        </w:rPr>
+        <w:t xml:space="preserve">6</w:t>
+      </w:r>
+      <w:r>
+        <w:rPr>
+          <w:rFonts w:ascii="Liberation Sans" w:hAnsi="Liberation Sans" w:eastAsia="Liberation Sans" w:cs="Liberation Sans"/>
+          <w:color w:val="bcbec4"/>
+          <w:sz w:val="20"/>
+          <w:szCs w:val="18"/>
+        </w:rPr>
+        <w:t xml:space="preserve">)</w:t>
+        <w:br/>
+        <w:t xml:space="preserve">    );</w:t>
+        <w:br/>
+        <w:t xml:space="preserve">    </w:t>
+      </w:r>
+      <w:r>
+        <w:rPr>
+          <w:rFonts w:ascii="Liberation Sans" w:hAnsi="Liberation Sans" w:eastAsia="Liberation Sans" w:cs="Liberation Sans"/>
+          <w:i/>
+          <w:color w:val="bcbec4"/>
+          <w:sz w:val="20"/>
+          <w:szCs w:val="18"/>
+        </w:rPr>
+        <w:t xml:space="preserve">writeRecord</w:t>
+      </w:r>
+      <w:r>
+        <w:rPr>
+          <w:rFonts w:ascii="Liberation Sans" w:hAnsi="Liberation Sans" w:eastAsia="Liberation Sans" w:cs="Liberation Sans"/>
+          <w:color w:val="bcbec4"/>
+          <w:sz w:val="20"/>
+          <w:szCs w:val="18"/>
+        </w:rPr>
+        <w:t xml:space="preserve">(rList,dir);</w:t>
+        <w:br/>
+        <w:t xml:space="preserve">    System.</w:t>
+      </w:r>
+      <w:r>
+        <w:rPr>
+          <w:rFonts w:ascii="Liberation Sans" w:hAnsi="Liberation Sans" w:eastAsia="Liberation Sans" w:cs="Liberation Sans"/>
+          <w:i/>
+          <w:color w:val="c77dbb"/>
+          <w:sz w:val="20"/>
+          <w:szCs w:val="18"/>
+        </w:rPr>
+        <w:t xml:space="preserve">out</w:t>
+      </w:r>
+      <w:r>
+        <w:rPr>
+          <w:rFonts w:ascii="Liberation Sans" w:hAnsi="Liberation Sans" w:eastAsia="Liberation Sans" w:cs="Liberation Sans"/>
+          <w:color w:val="bcbec4"/>
+          <w:sz w:val="20"/>
+          <w:szCs w:val="18"/>
+        </w:rPr>
+        <w:t xml:space="preserve">.println(</w:t>
+      </w:r>
+      <w:r>
+        <w:rPr>
+          <w:rFonts w:ascii="Liberation Sans" w:hAnsi="Liberation Sans" w:eastAsia="Liberation Sans" w:cs="Liberation Sans"/>
+          <w:color w:val="6aab73"/>
+          <w:sz w:val="20"/>
+          <w:szCs w:val="18"/>
+        </w:rPr>
+        <w:t xml:space="preserve">"----- FIN DE EJERCICIO 2 -----</w:t>
+      </w:r>
+      <w:r>
+        <w:rPr>
+          <w:rFonts w:ascii="Liberation Sans" w:hAnsi="Liberation Sans" w:eastAsia="Liberation Sans" w:cs="Liberation Sans"/>
+          <w:color w:val="cf8e6d"/>
+          <w:sz w:val="20"/>
+          <w:szCs w:val="18"/>
+        </w:rPr>
+        <w:t xml:space="preserve">\n</w:t>
+      </w:r>
+      <w:r>
+        <w:rPr>
+          <w:rFonts w:ascii="Liberation Sans" w:hAnsi="Liberation Sans" w:eastAsia="Liberation Sans" w:cs="Liberation Sans"/>
+          <w:color w:val="6aab73"/>
+          <w:sz w:val="20"/>
+          <w:szCs w:val="18"/>
+        </w:rPr>
+        <w:t xml:space="preserve">"</w:t>
+      </w:r>
+      <w:r>
+        <w:rPr>
+          <w:rFonts w:ascii="Liberation Sans" w:hAnsi="Liberation Sans" w:eastAsia="Liberation Sans" w:cs="Liberation Sans"/>
+          <w:color w:val="bcbec4"/>
+          <w:sz w:val="20"/>
+          <w:szCs w:val="18"/>
+        </w:rPr>
+        <w:t xml:space="preserve">);</w:t>
+        <w:br/>
+        <w:t xml:space="preserve">}</w:t>
+        <w:br/>
+        <w:br/>
+      </w:r>
+      <w:r>
+        <w:rPr>
+          <w:rFonts w:ascii="Liberation Sans" w:hAnsi="Liberation Sans" w:eastAsia="Liberation Sans" w:cs="Liberation Sans"/>
+          <w:color w:val="cf8e6d"/>
+          <w:sz w:val="20"/>
+          <w:szCs w:val="18"/>
+        </w:rPr>
+        <w:t xml:space="preserve">private static void </w:t>
+      </w:r>
+      <w:r>
+        <w:rPr>
+          <w:rFonts w:ascii="Liberation Sans" w:hAnsi="Liberation Sans" w:eastAsia="Liberation Sans" w:cs="Liberation Sans"/>
+          <w:color w:val="56a8f5"/>
+          <w:sz w:val="20"/>
+          <w:szCs w:val="18"/>
+        </w:rPr>
+        <w:t xml:space="preserve">writeRecord</w:t>
+      </w:r>
+      <w:r>
+        <w:rPr>
+          <w:rFonts w:ascii="Liberation Sans" w:hAnsi="Liberation Sans" w:eastAsia="Liberation Sans" w:cs="Liberation Sans"/>
+          <w:color w:val="bcbec4"/>
+          <w:sz w:val="20"/>
+          <w:szCs w:val="18"/>
+        </w:rPr>
+        <w:t xml:space="preserve">(List&lt;Registro&gt; rList, Path dir){</w:t>
+        <w:br/>
+        <w:t xml:space="preserve">    </w:t>
+      </w:r>
+      <w:r>
+        <w:rPr>
+          <w:rFonts w:ascii="Liberation Sans" w:hAnsi="Liberation Sans" w:eastAsia="Liberation Sans" w:cs="Liberation Sans"/>
+          <w:color w:val="cf8e6d"/>
+          <w:sz w:val="20"/>
+          <w:szCs w:val="18"/>
+        </w:rPr>
+        <w:t xml:space="preserve">try </w:t>
+      </w:r>
+      <w:r>
+        <w:rPr>
+          <w:rFonts w:ascii="Liberation Sans" w:hAnsi="Liberation Sans" w:eastAsia="Liberation Sans" w:cs="Liberation Sans"/>
+          <w:color w:val="bcbec4"/>
+          <w:sz w:val="20"/>
+          <w:szCs w:val="18"/>
+        </w:rPr>
+        <w:t xml:space="preserve">(RandomAccessFile raf = </w:t>
+      </w:r>
+      <w:r>
+        <w:rPr>
+          <w:rFonts w:ascii="Liberation Sans" w:hAnsi="Liberation Sans" w:eastAsia="Liberation Sans" w:cs="Liberation Sans"/>
+          <w:color w:val="cf8e6d"/>
+          <w:sz w:val="20"/>
+          <w:szCs w:val="18"/>
+        </w:rPr>
+        <w:t xml:space="preserve">new </w:t>
+      </w:r>
+      <w:r>
+        <w:rPr>
+          <w:rFonts w:ascii="Liberation Sans" w:hAnsi="Liberation Sans" w:eastAsia="Liberation Sans" w:cs="Liberation Sans"/>
+          <w:color w:val="bcbec4"/>
+          <w:sz w:val="20"/>
+          <w:szCs w:val="18"/>
+        </w:rPr>
+        <w:t xml:space="preserve">RandomAccessFile(dir.toFile(),</w:t>
+      </w:r>
+      <w:r>
+        <w:rPr>
+          <w:rFonts w:ascii="Liberation Sans" w:hAnsi="Liberation Sans" w:eastAsia="Liberation Sans" w:cs="Liberation Sans"/>
+          <w:color w:val="6aab73"/>
+          <w:sz w:val="20"/>
+          <w:szCs w:val="18"/>
+        </w:rPr>
+        <w:t xml:space="preserve">"rw"</w:t>
+      </w:r>
+      <w:r>
+        <w:rPr>
+          <w:rFonts w:ascii="Liberation Sans" w:hAnsi="Liberation Sans" w:eastAsia="Liberation Sans" w:cs="Liberation Sans"/>
+          <w:color w:val="bcbec4"/>
+          <w:sz w:val="20"/>
+          <w:szCs w:val="18"/>
+        </w:rPr>
+        <w:t xml:space="preserve">)) {</w:t>
+        <w:br/>
+        <w:t xml:space="preserve">        </w:t>
+      </w:r>
+      <w:r>
+        <w:rPr>
+          <w:rFonts w:ascii="Liberation Sans" w:hAnsi="Liberation Sans" w:eastAsia="Liberation Sans" w:cs="Liberation Sans"/>
+          <w:color w:val="cf8e6d"/>
+          <w:sz w:val="20"/>
+          <w:szCs w:val="18"/>
+        </w:rPr>
+        <w:t xml:space="preserve">for </w:t>
+      </w:r>
+      <w:r>
+        <w:rPr>
+          <w:rFonts w:ascii="Liberation Sans" w:hAnsi="Liberation Sans" w:eastAsia="Liberation Sans" w:cs="Liberation Sans"/>
+          <w:color w:val="bcbec4"/>
+          <w:sz w:val="20"/>
+          <w:szCs w:val="18"/>
+        </w:rPr>
+        <w:t xml:space="preserve">(Registro r : rList) {</w:t>
+        <w:br/>
+        <w:t xml:space="preserve">            raf.writeInt(r.id());</w:t>
+        <w:br/>
+        <w:t xml:space="preserve">            raf.writeInt(r.numero());</w:t>
+        <w:br/>
+        <w:t xml:space="preserve">        }</w:t>
+        <w:br/>
+        <w:t xml:space="preserve">    } </w:t>
+      </w:r>
+      <w:r>
+        <w:rPr>
+          <w:rFonts w:ascii="Liberation Sans" w:hAnsi="Liberation Sans" w:eastAsia="Liberation Sans" w:cs="Liberation Sans"/>
+          <w:color w:val="cf8e6d"/>
+          <w:sz w:val="20"/>
+          <w:szCs w:val="18"/>
+        </w:rPr>
+        <w:t xml:space="preserve">catch </w:t>
+      </w:r>
+      <w:r>
+        <w:rPr>
+          <w:rFonts w:ascii="Liberation Sans" w:hAnsi="Liberation Sans" w:eastAsia="Liberation Sans" w:cs="Liberation Sans"/>
+          <w:color w:val="bcbec4"/>
+          <w:sz w:val="20"/>
+          <w:szCs w:val="18"/>
+        </w:rPr>
+        <w:t xml:space="preserve">(Exception e) {</w:t>
+        <w:br/>
+        <w:t xml:space="preserve">        </w:t>
+      </w:r>
+      <w:r>
+        <w:rPr>
+          <w:rFonts w:ascii="Liberation Sans" w:hAnsi="Liberation Sans" w:eastAsia="Liberation Sans" w:cs="Liberation Sans"/>
+          <w:color w:val="cf8e6d"/>
+          <w:sz w:val="20"/>
+          <w:szCs w:val="18"/>
+        </w:rPr>
+        <w:t xml:space="preserve">throw new </w:t>
+      </w:r>
+      <w:r>
+        <w:rPr>
+          <w:rFonts w:ascii="Liberation Sans" w:hAnsi="Liberation Sans" w:eastAsia="Liberation Sans" w:cs="Liberation Sans"/>
+          <w:color w:val="bcbec4"/>
+          <w:sz w:val="20"/>
+          <w:szCs w:val="18"/>
+        </w:rPr>
+        <w:t xml:space="preserve">RuntimeException(e);</w:t>
+        <w:br/>
+        <w:t xml:space="preserve">    }</w:t>
+        <w:br/>
+        <w:t xml:space="preserve">}</w:t>
+      </w:r>
+      <w:r>
+        <w:rPr>
+          <w:sz w:val="18"/>
+          <w:szCs w:val="18"/>
+        </w:rPr>
+      </w:r>
+      <w:r>
+        <w:rPr>
+          <w:rFonts w:ascii="Liberation Sans" w:hAnsi="Liberation Sans" w:eastAsia="Liberation Sans" w:cs="Liberation Sans"/>
+          <w:color w:val="cf8e6d"/>
+          <w:sz w:val="20"/>
+          <w:szCs w:val="18"/>
+        </w:rPr>
+      </w:r>
+      <w:r>
+        <w:rPr>
+          <w:sz w:val="18"/>
+          <w:szCs w:val="18"/>
+        </w:rPr>
+      </w:r>
+      <w:r>
+        <w:rPr>
+          <w:sz w:val="20"/>
+          <w:szCs w:val="18"/>
+        </w:rPr>
+      </w:r>
+      <w:r>
+        <w:rPr>
+          <w14:ligatures w14:val="none"/>
+        </w:rPr>
+      </w:r>
+      <w:r>
+        <w:rPr>
+          <w14:ligatures w14:val="none"/>
+        </w:rPr>
+      </w:r>
+      <w:r/>
+      <w:r>
+        <w:rPr>
+          <w:sz w:val="20"/>
+          <w:szCs w:val="18"/>
+        </w:rPr>
+      </w:r>
+    </w:p>
+    <w:p>
+      <w:pPr>
+        <w:pStyle w:val="855"/>
+        <w:spacing/>
+        <w:ind/>
+        <w:rPr>
+          <w14:ligatures w14:val="none"/>
+        </w:rPr>
+      </w:pPr>
+      <w:r>
+        <w:t xml:space="preserve">Modificar un registro en una posición concreta de un fichero sin reescribir el fichero </w:t>
+      </w:r>
+      <w:r>
+        <w:t xml:space="preserve">completo.</w:t>
+      </w:r>
+      <w:r>
+        <w:rPr>
+          <w14:ligatures w14:val="none"/>
+        </w:rPr>
+      </w:r>
+      <w:r>
+        <w:rPr>
+          <w14:ligatures w14:val="none"/>
+        </w:rPr>
+      </w:r>
+    </w:p>
+    <w:p>
+      <w:pPr>
+        <w:spacing/>
+        <w:ind/>
+        <w:rPr/>
+      </w:pPr>
+      <w:r>
+        <w:rPr>
+          <w14:ligatures w14:val="none"/>
+        </w:rPr>
+      </w:r>
+      <w:r>
+        <w:rPr>
+          <w14:ligatures w14:val="none"/>
+        </w:rPr>
+      </w:r>
+      <w:r/>
+    </w:p>
+    <w:p>
+      <w:pPr>
+        <w:pStyle w:val="855"/>
+        <w:spacing/>
+        <w:ind/>
+        <w:rPr>
+          <w14:ligatures w14:val="none"/>
+        </w:rPr>
+      </w:pPr>
+      <w:r>
+        <w:t xml:space="preserve">Comparar el tiempo de lectura secuencial vs aleatoria en un fichero con 10.000 </w:t>
+      </w:r>
+      <w:r>
+        <w:t xml:space="preserve">registros de tamaño fijo.</w:t>
+      </w:r>
+      <w:r>
+        <w:rPr>
+          <w14:ligatures w14:val="none"/>
+        </w:rPr>
+      </w:r>
+      <w:r>
+        <w:rPr>
+          <w14:ligatures w14:val="none"/>
+        </w:rPr>
+      </w:r>
+    </w:p>
+    <w:p>
+      <w:pPr>
+        <w:pStyle w:val="855"/>
+        <w:spacing/>
+        <w:ind/>
+        <w:rPr>
+          <w14:ligatures w14:val="none"/>
+        </w:rPr>
+      </w:pPr>
+      <w:r>
+        <w:t xml:space="preserve">Crear un programa que permita insertar, modificar y eliminar registros en un fichero </w:t>
+      </w:r>
+      <w:r>
+        <w:t xml:space="preserve">binario con acceso aleatorio.</w:t>
+      </w:r>
+      <w:r>
+        <w:rPr>
+          <w14:ligatures w14:val="none"/>
+        </w:rPr>
+      </w:r>
+      <w:r>
+        <w:rPr>
+          <w14:ligatures w14:val="none"/>
+        </w:rPr>
+      </w:r>
+    </w:p>
+    <w:p>
+      <w:pPr>
+        <w:pStyle w:val="855"/>
+        <w:spacing/>
+        <w:ind/>
+        <w:rPr>
+          <w14:ligatures w14:val="none"/>
+        </w:rPr>
+      </w:pPr>
+      <w:r>
+        <w:t xml:space="preserve">Escribir un índice con las posiciones de los registros en un fichero para acceder a ellos </w:t>
+      </w:r>
+      <w:r>
+        <w:t xml:space="preserve">más rápidamente.</w:t>
+      </w:r>
+      <w:r>
+        <w:rPr>
+          <w:highlight w:val="none"/>
+        </w:rPr>
+        <w:br w:type="page" w:clear="all"/>
+      </w:r>
+      <w:r>
+        <w:rPr>
+          <w14:ligatures w14:val="none"/>
+        </w:rPr>
+      </w:r>
+      <w:r>
+        <w:rPr>
+          <w14:ligatures w14:val="none"/>
+        </w:rPr>
+      </w:r>
+    </w:p>
+    <w:p>
+      <w:pPr>
+        <w:pStyle w:val="851"/>
+        <w:spacing/>
+        <w:ind/>
+        <w:rPr>
+          <w:highlight w:val="none"/>
+          <w14:ligatures w14:val="none"/>
+        </w:rPr>
+      </w:pPr>
+      <w:r/>
+      <w:bookmarkStart w:id="3" w:name="_Toc3"/>
+      <w:r>
+        <w:t xml:space="preserve">Recuperar información almacenada en ficheros</w:t>
+      </w:r>
+      <w:bookmarkEnd w:id="3"/>
+      <w:r>
+        <w:rPr>
+          <w:highlight w:val="none"/>
+          <w14:ligatures w14:val="none"/>
+        </w:rPr>
+      </w:r>
+      <w:r>
+        <w:rPr>
+          <w:highlight w:val="none"/>
+          <w14:ligatures w14:val="none"/>
+        </w:rPr>
+      </w:r>
+    </w:p>
+    <w:p>
+      <w:pPr>
+        <w:pStyle w:val="855"/>
+        <w:spacing/>
+        <w:ind/>
+        <w:rPr>
+          <w14:ligatures w14:val="none"/>
+        </w:rPr>
+      </w:pPr>
+      <w:r>
+        <w:t xml:space="preserve">Leer un fichero de texto con datos de usuarios (nombre, edad, correo) y mostrarlos por </w:t>
+      </w:r>
+      <w:r>
+        <w:t xml:space="preserve">consola.</w:t>
+      </w:r>
+      <w:r>
+        <w:rPr>
+          <w14:ligatures w14:val="none"/>
+        </w:rPr>
+      </w:r>
+      <w:r>
+        <w:rPr>
+          <w14:ligatures w14:val="none"/>
+        </w:rPr>
+      </w:r>
+    </w:p>
+    <w:p>
+      <w:pPr>
+        <w:shd w:val="clear" w:color="191a1c" w:fill="191a1c"/>
+        <w:spacing/>
+        <w:ind w:right="0" w:firstLine="0" w:left="0"/>
+        <w:rPr>
+          <w:sz w:val="20"/>
+          <w:szCs w:val="18"/>
+        </w:rPr>
+      </w:pPr>
+      <w:r>
+        <w:rPr>
+          <w:rFonts w:ascii="Liberation Sans" w:hAnsi="Liberation Sans" w:eastAsia="Liberation Sans" w:cs="Liberation Sans"/>
+          <w:color w:val="cf8e6d"/>
+          <w:sz w:val="20"/>
+          <w:szCs w:val="18"/>
+        </w:rPr>
+        <w:t xml:space="preserve">public void </w:t>
+      </w:r>
+      <w:r>
+        <w:rPr>
+          <w:rFonts w:ascii="Liberation Sans" w:hAnsi="Liberation Sans" w:eastAsia="Liberation Sans" w:cs="Liberation Sans"/>
+          <w:color w:val="56a8f5"/>
+          <w:sz w:val="20"/>
+          <w:szCs w:val="18"/>
+        </w:rPr>
+        <w:t xml:space="preserve">ej1</w:t>
+      </w:r>
+      <w:r>
+        <w:rPr>
+          <w:rFonts w:ascii="Liberation Sans" w:hAnsi="Liberation Sans" w:eastAsia="Liberation Sans" w:cs="Liberation Sans"/>
+          <w:color w:val="bcbec4"/>
+          <w:sz w:val="20"/>
+          <w:szCs w:val="18"/>
+        </w:rPr>
+        <w:t xml:space="preserve">(String ruta){</w:t>
+        <w:br/>
+        <w:t xml:space="preserve">    System.</w:t>
+      </w:r>
+      <w:r>
+        <w:rPr>
+          <w:rFonts w:ascii="Liberation Sans" w:hAnsi="Liberation Sans" w:eastAsia="Liberation Sans" w:cs="Liberation Sans"/>
+          <w:i/>
+          <w:color w:val="c77dbb"/>
+          <w:sz w:val="20"/>
+          <w:szCs w:val="18"/>
+        </w:rPr>
+        <w:t xml:space="preserve">out</w:t>
+      </w:r>
+      <w:r>
+        <w:rPr>
+          <w:rFonts w:ascii="Liberation Sans" w:hAnsi="Liberation Sans" w:eastAsia="Liberation Sans" w:cs="Liberation Sans"/>
+          <w:color w:val="bcbec4"/>
+          <w:sz w:val="20"/>
+          <w:szCs w:val="18"/>
+        </w:rPr>
+        <w:t xml:space="preserve">.println(</w:t>
+      </w:r>
+      <w:r>
+        <w:rPr>
+          <w:rFonts w:ascii="Liberation Sans" w:hAnsi="Liberation Sans" w:eastAsia="Liberation Sans" w:cs="Liberation Sans"/>
+          <w:color w:val="6aab73"/>
+          <w:sz w:val="20"/>
+          <w:szCs w:val="18"/>
+        </w:rPr>
+        <w:t xml:space="preserve">"---- COMIENZO EJERCICIO 1 ----"</w:t>
+      </w:r>
+      <w:r>
+        <w:rPr>
+          <w:rFonts w:ascii="Liberation Sans" w:hAnsi="Liberation Sans" w:eastAsia="Liberation Sans" w:cs="Liberation Sans"/>
+          <w:color w:val="bcbec4"/>
+          <w:sz w:val="20"/>
+          <w:szCs w:val="18"/>
+        </w:rPr>
+        <w:t xml:space="preserve">);</w:t>
+        <w:br/>
+        <w:t xml:space="preserve">    Path dir = Paths.</w:t>
+      </w:r>
+      <w:r>
+        <w:rPr>
+          <w:rFonts w:ascii="Liberation Sans" w:hAnsi="Liberation Sans" w:eastAsia="Liberation Sans" w:cs="Liberation Sans"/>
+          <w:i/>
+          <w:color w:val="bcbec4"/>
+          <w:sz w:val="20"/>
+          <w:szCs w:val="18"/>
+        </w:rPr>
+        <w:t xml:space="preserve">get</w:t>
+      </w:r>
+      <w:r>
+        <w:rPr>
+          <w:rFonts w:ascii="Liberation Sans" w:hAnsi="Liberation Sans" w:eastAsia="Liberation Sans" w:cs="Liberation Sans"/>
+          <w:color w:val="bcbec4"/>
+          <w:sz w:val="20"/>
+          <w:szCs w:val="18"/>
+        </w:rPr>
+        <w:t xml:space="preserve">(ruta);</w:t>
+        <w:br/>
+        <w:t xml:space="preserve">    </w:t>
+      </w:r>
+      <w:r>
+        <w:rPr>
+          <w:rFonts w:ascii="Liberation Sans" w:hAnsi="Liberation Sans" w:eastAsia="Liberation Sans" w:cs="Liberation Sans"/>
+          <w:color w:val="cf8e6d"/>
+          <w:sz w:val="20"/>
+          <w:szCs w:val="18"/>
+        </w:rPr>
+        <w:t xml:space="preserve">try </w:t>
+      </w:r>
+      <w:r>
+        <w:rPr>
+          <w:rFonts w:ascii="Liberation Sans" w:hAnsi="Liberation Sans" w:eastAsia="Liberation Sans" w:cs="Liberation Sans"/>
+          <w:color w:val="bcbec4"/>
+          <w:sz w:val="20"/>
+          <w:szCs w:val="18"/>
+        </w:rPr>
+        <w:t xml:space="preserve">(BufferedReader br = Files.</w:t>
+      </w:r>
+      <w:r>
+        <w:rPr>
+          <w:rFonts w:ascii="Liberation Sans" w:hAnsi="Liberation Sans" w:eastAsia="Liberation Sans" w:cs="Liberation Sans"/>
+          <w:i/>
+          <w:color w:val="bcbec4"/>
+          <w:sz w:val="20"/>
+          <w:szCs w:val="18"/>
+        </w:rPr>
         <w:t xml:space="preserve">newBufferedReader</w:t>
       </w:r>
       <w:r>
@@ -5810,7 +6489,7 @@
       </w:r>
       <w:r>
         <w:rPr>
-          <w:sz w:val="18"/>
+          <w:sz w:val="20"/>
           <w:szCs w:val="18"/>
         </w:rPr>
       </w:r>
@@ -6275,7 +6954,7 @@
       </w:r>
       <w:r>
         <w:rPr>
-          <w:sz w:val="18"/>
+          <w:sz w:val="20"/>
           <w:szCs w:val="18"/>
         </w:rPr>
       </w:r>
@@ -6321,7 +7000,7 @@
       </w:r>
       <w:r>
         <w:rPr>
-          <w:highlight w:val="none"/>
+          <w14:ligatures w14:val="none"/>
         </w:rPr>
       </w:r>
       <w:r>
@@ -6345,6 +7024,7 @@
       </w:r>
       <w:r>
         <w:rPr>
+          <w:highlight w:val="none"/>
           <w14:ligatures w14:val="none"/>
         </w:rPr>
       </w:r>
@@ -6734,7 +7414,7 @@
       </w:r>
       <w:r>
         <w:rPr>
-          <w:sz w:val="18"/>
+          <w:sz w:val="20"/>
           <w:szCs w:val="18"/>
         </w:rPr>
       </w:r>
@@ -6781,6 +7461,7 @@
       </w:r>
       <w:r>
         <w:rPr>
+          <w:highlight w:val="none"/>
           <w14:ligatures w14:val="none"/>
         </w:rPr>
       </w:r>
@@ -7231,7 +7912,7 @@
       </w:r>
       <w:r>
         <w:rPr>
-          <w:sz w:val="18"/>
+          <w:sz w:val="20"/>
           <w:szCs w:val="18"/>
         </w:rPr>
       </w:r>

</xml_diff>

<commit_message>
Apartado cuatro acceso datos
</commit_message>
<xml_diff>
--- a/Acceso a datos/Tema1/Actividades/Ejercicios/Ejercicios.docx
+++ b/Acceso a datos/Tema1/Actividades/Ejercicios/Ejercicios.docx
@@ -5923,6 +5923,343 @@
     </w:p>
     <w:p>
       <w:pPr>
+        <w:shd w:val="clear" w:color="191a1c" w:fill="191a1c"/>
+        <w:spacing/>
+        <w:ind w:right="0" w:firstLine="0" w:left="0"/>
+        <w:rPr>
+          <w:sz w:val="20"/>
+          <w:szCs w:val="18"/>
+        </w:rPr>
+      </w:pPr>
+      <w:r>
+        <w:rPr>
+          <w:rFonts w:ascii="Liberation Sans" w:hAnsi="Liberation Sans" w:eastAsia="Liberation Sans" w:cs="Liberation Sans"/>
+          <w:color w:val="cf8e6d"/>
+          <w:sz w:val="20"/>
+          <w:szCs w:val="18"/>
+        </w:rPr>
+        <w:t xml:space="preserve">public static void </w:t>
+      </w:r>
+      <w:r>
+        <w:rPr>
+          <w:rFonts w:ascii="Liberation Sans" w:hAnsi="Liberation Sans" w:eastAsia="Liberation Sans" w:cs="Liberation Sans"/>
+          <w:color w:val="56a8f5"/>
+          <w:sz w:val="20"/>
+          <w:szCs w:val="18"/>
+        </w:rPr>
+        <w:t xml:space="preserve">ej3</w:t>
+      </w:r>
+      <w:r>
+        <w:rPr>
+          <w:rFonts w:ascii="Liberation Sans" w:hAnsi="Liberation Sans" w:eastAsia="Liberation Sans" w:cs="Liberation Sans"/>
+          <w:color w:val="bcbec4"/>
+          <w:sz w:val="20"/>
+          <w:szCs w:val="18"/>
+        </w:rPr>
+        <w:t xml:space="preserve">(String ruta,</w:t>
+      </w:r>
+      <w:r>
+        <w:rPr>
+          <w:rFonts w:ascii="Liberation Sans" w:hAnsi="Liberation Sans" w:eastAsia="Liberation Sans" w:cs="Liberation Sans"/>
+          <w:color w:val="cf8e6d"/>
+          <w:sz w:val="20"/>
+          <w:szCs w:val="18"/>
+        </w:rPr>
+        <w:t xml:space="preserve">int </w:t>
+      </w:r>
+      <w:r>
+        <w:rPr>
+          <w:rFonts w:ascii="Liberation Sans" w:hAnsi="Liberation Sans" w:eastAsia="Liberation Sans" w:cs="Liberation Sans"/>
+          <w:color w:val="bcbec4"/>
+          <w:sz w:val="20"/>
+          <w:szCs w:val="18"/>
+        </w:rPr>
+        <w:t xml:space="preserve">id, </w:t>
+      </w:r>
+      <w:r>
+        <w:rPr>
+          <w:rFonts w:ascii="Liberation Sans" w:hAnsi="Liberation Sans" w:eastAsia="Liberation Sans" w:cs="Liberation Sans"/>
+          <w:color w:val="cf8e6d"/>
+          <w:sz w:val="20"/>
+          <w:szCs w:val="18"/>
+        </w:rPr>
+        <w:t xml:space="preserve">int </w:t>
+      </w:r>
+      <w:r>
+        <w:rPr>
+          <w:rFonts w:ascii="Liberation Sans" w:hAnsi="Liberation Sans" w:eastAsia="Liberation Sans" w:cs="Liberation Sans"/>
+          <w:color w:val="bcbec4"/>
+          <w:sz w:val="20"/>
+          <w:szCs w:val="18"/>
+        </w:rPr>
+        <w:t xml:space="preserve">num){</w:t>
+        <w:br/>
+        <w:t xml:space="preserve">    System.</w:t>
+      </w:r>
+      <w:r>
+        <w:rPr>
+          <w:rFonts w:ascii="Liberation Sans" w:hAnsi="Liberation Sans" w:eastAsia="Liberation Sans" w:cs="Liberation Sans"/>
+          <w:i/>
+          <w:color w:val="c77dbb"/>
+          <w:sz w:val="20"/>
+          <w:szCs w:val="18"/>
+        </w:rPr>
+        <w:t xml:space="preserve">out</w:t>
+      </w:r>
+      <w:r>
+        <w:rPr>
+          <w:rFonts w:ascii="Liberation Sans" w:hAnsi="Liberation Sans" w:eastAsia="Liberation Sans" w:cs="Liberation Sans"/>
+          <w:color w:val="bcbec4"/>
+          <w:sz w:val="20"/>
+          <w:szCs w:val="18"/>
+        </w:rPr>
+        <w:t xml:space="preserve">.println(</w:t>
+      </w:r>
+      <w:r>
+        <w:rPr>
+          <w:rFonts w:ascii="Liberation Sans" w:hAnsi="Liberation Sans" w:eastAsia="Liberation Sans" w:cs="Liberation Sans"/>
+          <w:color w:val="6aab73"/>
+          <w:sz w:val="20"/>
+          <w:szCs w:val="18"/>
+        </w:rPr>
+        <w:t xml:space="preserve">"---- COMIENZO EJERCICIO 3 ----"</w:t>
+      </w:r>
+      <w:r>
+        <w:rPr>
+          <w:rFonts w:ascii="Liberation Sans" w:hAnsi="Liberation Sans" w:eastAsia="Liberation Sans" w:cs="Liberation Sans"/>
+          <w:color w:val="bcbec4"/>
+          <w:sz w:val="20"/>
+          <w:szCs w:val="18"/>
+        </w:rPr>
+        <w:t xml:space="preserve">);</w:t>
+        <w:br/>
+        <w:t xml:space="preserve">    Path dir = Paths.</w:t>
+      </w:r>
+      <w:r>
+        <w:rPr>
+          <w:rFonts w:ascii="Liberation Sans" w:hAnsi="Liberation Sans" w:eastAsia="Liberation Sans" w:cs="Liberation Sans"/>
+          <w:i/>
+          <w:color w:val="bcbec4"/>
+          <w:sz w:val="20"/>
+          <w:szCs w:val="18"/>
+        </w:rPr>
+        <w:t xml:space="preserve">get</w:t>
+      </w:r>
+      <w:r>
+        <w:rPr>
+          <w:rFonts w:ascii="Liberation Sans" w:hAnsi="Liberation Sans" w:eastAsia="Liberation Sans" w:cs="Liberation Sans"/>
+          <w:color w:val="bcbec4"/>
+          <w:sz w:val="20"/>
+          <w:szCs w:val="18"/>
+        </w:rPr>
+        <w:t xml:space="preserve">(ruta);</w:t>
+        <w:br/>
+        <w:t xml:space="preserve">    </w:t>
+      </w:r>
+      <w:r>
+        <w:rPr>
+          <w:rFonts w:ascii="Liberation Sans" w:hAnsi="Liberation Sans" w:eastAsia="Liberation Sans" w:cs="Liberation Sans"/>
+          <w:color w:val="cf8e6d"/>
+          <w:sz w:val="20"/>
+          <w:szCs w:val="18"/>
+        </w:rPr>
+        <w:t xml:space="preserve">try </w:t>
+      </w:r>
+      <w:r>
+        <w:rPr>
+          <w:rFonts w:ascii="Liberation Sans" w:hAnsi="Liberation Sans" w:eastAsia="Liberation Sans" w:cs="Liberation Sans"/>
+          <w:color w:val="bcbec4"/>
+          <w:sz w:val="20"/>
+          <w:szCs w:val="18"/>
+        </w:rPr>
+        <w:t xml:space="preserve">(RandomAccessFile raf = </w:t>
+      </w:r>
+      <w:r>
+        <w:rPr>
+          <w:rFonts w:ascii="Liberation Sans" w:hAnsi="Liberation Sans" w:eastAsia="Liberation Sans" w:cs="Liberation Sans"/>
+          <w:color w:val="cf8e6d"/>
+          <w:sz w:val="20"/>
+          <w:szCs w:val="18"/>
+        </w:rPr>
+        <w:t xml:space="preserve">new </w:t>
+      </w:r>
+      <w:r>
+        <w:rPr>
+          <w:rFonts w:ascii="Liberation Sans" w:hAnsi="Liberation Sans" w:eastAsia="Liberation Sans" w:cs="Liberation Sans"/>
+          <w:color w:val="bcbec4"/>
+          <w:sz w:val="20"/>
+          <w:szCs w:val="18"/>
+        </w:rPr>
+        <w:t xml:space="preserve">RandomAccessFile(dir.toFile(),</w:t>
+      </w:r>
+      <w:r>
+        <w:rPr>
+          <w:rFonts w:ascii="Liberation Sans" w:hAnsi="Liberation Sans" w:eastAsia="Liberation Sans" w:cs="Liberation Sans"/>
+          <w:color w:val="6aab73"/>
+          <w:sz w:val="20"/>
+          <w:szCs w:val="18"/>
+        </w:rPr>
+        <w:t xml:space="preserve">"rw"</w:t>
+      </w:r>
+      <w:r>
+        <w:rPr>
+          <w:rFonts w:ascii="Liberation Sans" w:hAnsi="Liberation Sans" w:eastAsia="Liberation Sans" w:cs="Liberation Sans"/>
+          <w:color w:val="bcbec4"/>
+          <w:sz w:val="20"/>
+          <w:szCs w:val="18"/>
+        </w:rPr>
+        <w:t xml:space="preserve">)) {</w:t>
+        <w:br/>
+        <w:t xml:space="preserve">        raf.skipBytes((id*</w:t>
+      </w:r>
+      <w:r>
+        <w:rPr>
+          <w:rFonts w:ascii="Liberation Sans" w:hAnsi="Liberation Sans" w:eastAsia="Liberation Sans" w:cs="Liberation Sans"/>
+          <w:color w:val="2aacb8"/>
+          <w:sz w:val="20"/>
+          <w:szCs w:val="18"/>
+        </w:rPr>
+        <w:t xml:space="preserve">8</w:t>
+      </w:r>
+      <w:r>
+        <w:rPr>
+          <w:rFonts w:ascii="Liberation Sans" w:hAnsi="Liberation Sans" w:eastAsia="Liberation Sans" w:cs="Liberation Sans"/>
+          <w:color w:val="bcbec4"/>
+          <w:sz w:val="20"/>
+          <w:szCs w:val="18"/>
+        </w:rPr>
+        <w:t xml:space="preserve">)-</w:t>
+      </w:r>
+      <w:r>
+        <w:rPr>
+          <w:rFonts w:ascii="Liberation Sans" w:hAnsi="Liberation Sans" w:eastAsia="Liberation Sans" w:cs="Liberation Sans"/>
+          <w:color w:val="2aacb8"/>
+          <w:sz w:val="20"/>
+          <w:szCs w:val="18"/>
+        </w:rPr>
+        <w:t xml:space="preserve">4</w:t>
+      </w:r>
+      <w:r>
+        <w:rPr>
+          <w:rFonts w:ascii="Liberation Sans" w:hAnsi="Liberation Sans" w:eastAsia="Liberation Sans" w:cs="Liberation Sans"/>
+          <w:color w:val="bcbec4"/>
+          <w:sz w:val="20"/>
+          <w:szCs w:val="18"/>
+        </w:rPr>
+        <w:t xml:space="preserve">);</w:t>
+        <w:br/>
+        <w:t xml:space="preserve">        raf.writeInt(num);</w:t>
+        <w:br/>
+        <w:t xml:space="preserve">    } </w:t>
+      </w:r>
+      <w:r>
+        <w:rPr>
+          <w:rFonts w:ascii="Liberation Sans" w:hAnsi="Liberation Sans" w:eastAsia="Liberation Sans" w:cs="Liberation Sans"/>
+          <w:color w:val="cf8e6d"/>
+          <w:sz w:val="20"/>
+          <w:szCs w:val="18"/>
+        </w:rPr>
+        <w:t xml:space="preserve">catch </w:t>
+      </w:r>
+      <w:r>
+        <w:rPr>
+          <w:rFonts w:ascii="Liberation Sans" w:hAnsi="Liberation Sans" w:eastAsia="Liberation Sans" w:cs="Liberation Sans"/>
+          <w:color w:val="bcbec4"/>
+          <w:sz w:val="20"/>
+          <w:szCs w:val="18"/>
+        </w:rPr>
+        <w:t xml:space="preserve">(Exception e) {</w:t>
+        <w:br/>
+        <w:t xml:space="preserve">        </w:t>
+      </w:r>
+      <w:r>
+        <w:rPr>
+          <w:rFonts w:ascii="Liberation Sans" w:hAnsi="Liberation Sans" w:eastAsia="Liberation Sans" w:cs="Liberation Sans"/>
+          <w:color w:val="cf8e6d"/>
+          <w:sz w:val="20"/>
+          <w:szCs w:val="18"/>
+        </w:rPr>
+        <w:t xml:space="preserve">throw new </w:t>
+      </w:r>
+      <w:r>
+        <w:rPr>
+          <w:rFonts w:ascii="Liberation Sans" w:hAnsi="Liberation Sans" w:eastAsia="Liberation Sans" w:cs="Liberation Sans"/>
+          <w:color w:val="bcbec4"/>
+          <w:sz w:val="20"/>
+          <w:szCs w:val="18"/>
+        </w:rPr>
+        <w:t xml:space="preserve">RuntimeException(e);</w:t>
+        <w:br/>
+        <w:t xml:space="preserve">    }</w:t>
+        <w:br/>
+        <w:t xml:space="preserve">    System.</w:t>
+      </w:r>
+      <w:r>
+        <w:rPr>
+          <w:rFonts w:ascii="Liberation Sans" w:hAnsi="Liberation Sans" w:eastAsia="Liberation Sans" w:cs="Liberation Sans"/>
+          <w:i/>
+          <w:color w:val="c77dbb"/>
+          <w:sz w:val="20"/>
+          <w:szCs w:val="18"/>
+        </w:rPr>
+        <w:t xml:space="preserve">out</w:t>
+      </w:r>
+      <w:r>
+        <w:rPr>
+          <w:rFonts w:ascii="Liberation Sans" w:hAnsi="Liberation Sans" w:eastAsia="Liberation Sans" w:cs="Liberation Sans"/>
+          <w:color w:val="bcbec4"/>
+          <w:sz w:val="20"/>
+          <w:szCs w:val="18"/>
+        </w:rPr>
+        <w:t xml:space="preserve">.println(</w:t>
+      </w:r>
+      <w:r>
+        <w:rPr>
+          <w:rFonts w:ascii="Liberation Sans" w:hAnsi="Liberation Sans" w:eastAsia="Liberation Sans" w:cs="Liberation Sans"/>
+          <w:color w:val="6aab73"/>
+          <w:sz w:val="20"/>
+          <w:szCs w:val="18"/>
+        </w:rPr>
+        <w:t xml:space="preserve">"----- FIN DE EJERCICIO 3 -----</w:t>
+      </w:r>
+      <w:r>
+        <w:rPr>
+          <w:rFonts w:ascii="Liberation Sans" w:hAnsi="Liberation Sans" w:eastAsia="Liberation Sans" w:cs="Liberation Sans"/>
+          <w:color w:val="cf8e6d"/>
+          <w:sz w:val="20"/>
+          <w:szCs w:val="18"/>
+        </w:rPr>
+        <w:t xml:space="preserve">\n</w:t>
+      </w:r>
+      <w:r>
+        <w:rPr>
+          <w:rFonts w:ascii="Liberation Sans" w:hAnsi="Liberation Sans" w:eastAsia="Liberation Sans" w:cs="Liberation Sans"/>
+          <w:color w:val="6aab73"/>
+          <w:sz w:val="20"/>
+          <w:szCs w:val="18"/>
+        </w:rPr>
+        <w:t xml:space="preserve">"</w:t>
+      </w:r>
+      <w:r>
+        <w:rPr>
+          <w:rFonts w:ascii="Liberation Sans" w:hAnsi="Liberation Sans" w:eastAsia="Liberation Sans" w:cs="Liberation Sans"/>
+          <w:color w:val="bcbec4"/>
+          <w:sz w:val="20"/>
+          <w:szCs w:val="18"/>
+        </w:rPr>
+        <w:t xml:space="preserve">);</w:t>
+        <w:br/>
+        <w:t xml:space="preserve">}</w:t>
+      </w:r>
+      <w:r>
+        <w:rPr>
+          <w:sz w:val="18"/>
+          <w:szCs w:val="18"/>
+        </w:rPr>
+      </w:r>
+    </w:p>
+    <w:p>
+      <w:pPr>
         <w:spacing/>
         <w:ind/>
         <w:rPr/>
@@ -5964,6 +6301,24 @@
           <w14:ligatures w14:val="none"/>
         </w:rPr>
       </w:r>
+    </w:p>
+    <w:p>
+      <w:pPr>
+        <w:spacing/>
+        <w:ind/>
+        <w:rPr/>
+      </w:pPr>
+      <w:r>
+        <w:rPr>
+          <w14:ligatures w14:val="none"/>
+        </w:rPr>
+      </w:r>
+      <w:r>
+        <w:rPr>
+          <w14:ligatures w14:val="none"/>
+        </w:rPr>
+      </w:r>
+      <w:r/>
     </w:p>
     <w:p>
       <w:pPr>

</xml_diff>